<commit_message>
update docx to match current paper
</commit_message>
<xml_diff>
--- a/paper/nature_universal_laws.docx
+++ b/paper/nature_universal_laws.docx
@@ -137,13 +137,105 @@
         <w:t xml:space="preserve"> </w:t>
       </w:r>
       <w:r>
+        <w:t xml:space="preserve">composite</w:t>
+      </w:r>
+      <w:r>
+        <w:t xml:space="preserve"> </w:t>
+      </w:r>
+      <w:r>
+        <w:t xml:space="preserve">integrity</w:t>
+      </w:r>
+      <w:r>
+        <w:t xml:space="preserve"> </w:t>
+      </w:r>
+      <w:r>
+        <w:t xml:space="preserve">to</w:t>
+      </w:r>
+      <w:r>
+        <w:t xml:space="preserve"> </w:t>
+      </w:r>
+      <w:r>
+        <w:t xml:space="preserve">fidelity</w:t>
+      </w:r>
+      <w:r>
+        <w:t xml:space="preserve"> </w:t>
+      </w:r>
+      <w:r>
+        <w:t xml:space="preserve">(</w:t>
+      </w:r>
+      <m:oMath>
+        <m:r>
+          <m:rPr>
+            <m:sty m:val="p"/>
+          </m:rPr>
+          <m:t>I</m:t>
+        </m:r>
+        <m:r>
+          <m:rPr>
+            <m:sty m:val="p"/>
+          </m:rPr>
+          <m:t>C</m:t>
+        </m:r>
+        <m:r>
+          <m:rPr>
+            <m:sty m:val="p"/>
+          </m:rPr>
+          <m:t>/</m:t>
+        </m:r>
+        <m:r>
+          <m:t>F</m:t>
+        </m:r>
+      </m:oMath>
+      <w:r>
+        <w:t xml:space="preserve">)—the</w:t>
+      </w:r>
+      <w:r>
+        <w:t xml:space="preserve"> </w:t>
+      </w:r>
+      <w:r>
         <w:t xml:space="preserve">geometric</w:t>
       </w:r>
       <w:r>
         <w:t xml:space="preserve"> </w:t>
       </w:r>
       <w:r>
-        <w:t xml:space="preserve">to</w:t>
+        <w:t xml:space="preserve">mean</w:t>
+      </w:r>
+      <w:r>
+        <w:t xml:space="preserve"> </w:t>
+      </w:r>
+      <w:r>
+        <w:t xml:space="preserve">of</w:t>
+      </w:r>
+      <w:r>
+        <w:t xml:space="preserve"> </w:t>
+      </w:r>
+      <w:r>
+        <w:t xml:space="preserve">normalized</w:t>
+      </w:r>
+      <w:r>
+        <w:t xml:space="preserve"> </w:t>
+      </w:r>
+      <w:r>
+        <w:t xml:space="preserve">measurements</w:t>
+      </w:r>
+      <w:r>
+        <w:t xml:space="preserve"> </w:t>
+      </w:r>
+      <w:r>
+        <w:t xml:space="preserve">divided</w:t>
+      </w:r>
+      <w:r>
+        <w:t xml:space="preserve"> </w:t>
+      </w:r>
+      <w:r>
+        <w:t xml:space="preserve">by</w:t>
+      </w:r>
+      <w:r>
+        <w:t xml:space="preserve"> </w:t>
+      </w:r>
+      <w:r>
+        <w:t xml:space="preserve">their</w:t>
       </w:r>
       <w:r>
         <w:t xml:space="preserve"> </w:t>
@@ -155,45 +247,7 @@
         <w:t xml:space="preserve"> </w:t>
       </w:r>
       <w:r>
-        <w:t xml:space="preserve">coherence</w:t>
-      </w:r>
-      <w:r>
-        <w:t xml:space="preserve"> </w:t>
-      </w:r>
-      <w:r>
-        <w:t xml:space="preserve">(</w:t>
-      </w:r>
-      <m:oMath>
-        <m:r>
-          <m:rPr>
-            <m:sty m:val="p"/>
-          </m:rPr>
-          <m:t>I</m:t>
-        </m:r>
-        <m:r>
-          <m:rPr>
-            <m:sty m:val="p"/>
-          </m:rPr>
-          <m:t>C</m:t>
-        </m:r>
-        <m:r>
-          <m:rPr>
-            <m:sty m:val="p"/>
-          </m:rPr>
-          <m:t>/</m:t>
-        </m:r>
-        <m:r>
-          <m:t>F</m:t>
-        </m:r>
-      </m:oMath>
-      <w:r>
-        <w:t xml:space="preserve">),</w:t>
-      </w:r>
-      <w:r>
-        <w:t xml:space="preserve"> </w:t>
-      </w:r>
-      <w:r>
-        <w:t xml:space="preserve">computed</w:t>
+        <w:t xml:space="preserve">mean—computed</w:t>
       </w:r>
       <w:r>
         <w:t xml:space="preserve"> </w:t>
@@ -223,37 +277,7 @@
         <w:t xml:space="preserve"> </w:t>
       </w:r>
       <w:r>
-        <w:t xml:space="preserve">kernel</w:t>
-      </w:r>
-      <w:r>
-        <w:t xml:space="preserve"> </w:t>
-      </w:r>
-      <w:r>
-        <w:t xml:space="preserve">applied</w:t>
-      </w:r>
-      <w:r>
-        <w:t xml:space="preserve"> </w:t>
-      </w:r>
-      <w:r>
-        <w:t xml:space="preserve">to</w:t>
-      </w:r>
-      <w:r>
-        <w:t xml:space="preserve"> </w:t>
-      </w:r>
-      <w:r>
-        <w:t xml:space="preserve">normalised</w:t>
-      </w:r>
-      <w:r>
-        <w:t xml:space="preserve"> </w:t>
-      </w:r>
-      <w:r>
-        <w:t xml:space="preserve">physical</w:t>
-      </w:r>
-      <w:r>
-        <w:t xml:space="preserve"> </w:t>
-      </w:r>
-      <w:r>
-        <w:t xml:space="preserve">measurements,</w:t>
+        <w:t xml:space="preserve">kernel,</w:t>
       </w:r>
       <w:r>
         <w:t xml:space="preserve"> </w:t>
@@ -457,22 +481,32 @@
         <w:t xml:space="preserve"> </w:t>
       </w:r>
       <w:r>
-        <w:t xml:space="preserve">collapses</w:t>
-      </w:r>
-      <w:r>
-        <w:t xml:space="preserve"> </w:t>
-      </w:r>
-      <m:oMath>
-        <m:r>
-          <m:t>23</m:t>
-        </m:r>
-        <m:r>
-          <m:rPr>
-            <m:sty m:val="p"/>
-          </m:rPr>
-          <m:t>×</m:t>
-        </m:r>
-      </m:oMath>
+        <w:t xml:space="preserve">drops</w:t>
+      </w:r>
+      <w:r>
+        <w:t xml:space="preserve"> </w:t>
+      </w:r>
+      <w:r>
+        <w:t xml:space="preserve">by</w:t>
+      </w:r>
+      <w:r>
+        <w:t xml:space="preserve"> </w:t>
+      </w:r>
+      <w:r>
+        <w:t xml:space="preserve">a</w:t>
+      </w:r>
+      <w:r>
+        <w:t xml:space="preserve"> </w:t>
+      </w:r>
+      <w:r>
+        <w:t xml:space="preserve">factor</w:t>
+      </w:r>
+      <w:r>
+        <w:t xml:space="preserve"> </w:t>
+      </w:r>
+      <w:r>
+        <w:t xml:space="preserve">of 23</w:t>
+      </w:r>
       <w:r>
         <w:t xml:space="preserve"> </w:t>
       </w:r>
@@ -483,7 +517,7 @@
         <w:t xml:space="preserve"> </w:t>
       </w:r>
       <w:r>
-        <w:t xml:space="preserve">colour</w:t>
+        <w:t xml:space="preserve">color</w:t>
       </w:r>
       <w:r>
         <w:t xml:space="preserve"> </w:t>
@@ -566,17 +600,9 @@
       <w:r>
         <w:t xml:space="preserve"> </w:t>
       </w:r>
-      <m:oMath>
-        <m:r>
-          <m:t>35</m:t>
-        </m:r>
-        <m:r>
-          <m:rPr>
-            <m:sty m:val="p"/>
-          </m:rPr>
-          <m:t>×</m:t>
-        </m:r>
-      </m:oMath>
+      <w:r>
+        <w:t xml:space="preserve">35-fold</w:t>
+      </w:r>
       <w:r>
         <w:t xml:space="preserve"> </w:t>
       </w:r>
@@ -623,7 +649,7 @@
         <w:t xml:space="preserve"> </w:t>
       </w:r>
       <w:r>
-        <w:t xml:space="preserve">reproduces</w:t>
+        <w:t xml:space="preserve">drives</w:t>
       </w:r>
       <w:r>
         <w:t xml:space="preserve"> </w:t>
@@ -786,7 +812,13 @@
         <w:t xml:space="preserve"> </w:t>
       </w:r>
       <w:r>
-        <w:t xml:space="preserve">single-number</w:t>
+        <w:t xml:space="preserve">single-number,</w:t>
+      </w:r>
+      <w:r>
+        <w:t xml:space="preserve"> </w:t>
+      </w:r>
+      <w:r>
+        <w:t xml:space="preserve">dynamics-independent</w:t>
       </w:r>
       <w:r>
         <w:t xml:space="preserve"> </w:t>
@@ -810,37 +842,7 @@
         <w:t xml:space="preserve"> </w:t>
       </w:r>
       <w:r>
-        <w:t xml:space="preserve">fragility</w:t>
-      </w:r>
-      <w:r>
-        <w:t xml:space="preserve"> </w:t>
-      </w:r>
-      <w:r>
-        <w:t xml:space="preserve">independent</w:t>
-      </w:r>
-      <w:r>
-        <w:t xml:space="preserve"> </w:t>
-      </w:r>
-      <w:r>
-        <w:t xml:space="preserve">of</w:t>
-      </w:r>
-      <w:r>
-        <w:t xml:space="preserve"> </w:t>
-      </w:r>
-      <w:r>
-        <w:t xml:space="preserve">the</w:t>
-      </w:r>
-      <w:r>
-        <w:t xml:space="preserve"> </w:t>
-      </w:r>
-      <w:r>
-        <w:t xml:space="preserve">underlying</w:t>
-      </w:r>
-      <w:r>
-        <w:t xml:space="preserve"> </w:t>
-      </w:r>
-      <w:r>
-        <w:t xml:space="preserve">dynamics.</w:t>
+        <w:t xml:space="preserve">fragility.</w:t>
       </w:r>
     </w:p>
     <w:p>
@@ -1071,13 +1073,19 @@
         <w:t xml:space="preserve"> </w:t>
       </w:r>
       <w:r>
-        <w:t xml:space="preserve">axiom,</w:t>
-      </w:r>
-      <w:r>
-        <w:t xml:space="preserve"> </w:t>
-      </w:r>
-      <w:r>
-        <w:t xml:space="preserve">that</w:t>
+        <w:t xml:space="preserve">axiom.</w:t>
+      </w:r>
+      <w:r>
+        <w:t xml:space="preserve"> </w:t>
+      </w:r>
+      <w:r>
+        <w:t xml:space="preserve">The</w:t>
+      </w:r>
+      <w:r>
+        <w:t xml:space="preserve"> </w:t>
+      </w:r>
+      <w:r>
+        <w:t xml:space="preserve">kernel</w:t>
       </w:r>
       <w:r>
         <w:t xml:space="preserve"> </w:t>
@@ -1495,7 +1503,13 @@
         <w:t xml:space="preserve"> </w:t>
       </w:r>
       <w:r>
-        <w:t xml:space="preserve">instantiates</w:t>
+        <w:t xml:space="preserve">corresponds</w:t>
+      </w:r>
+      <w:r>
+        <w:t xml:space="preserve"> </w:t>
+      </w:r>
+      <w:r>
+        <w:t xml:space="preserve">to</w:t>
       </w:r>
       <w:r>
         <w:t xml:space="preserve"> </w:t>
@@ -1567,7 +1581,7 @@
         <w:t xml:space="preserve"> </w:t>
       </w:r>
       <w:r>
-        <w:t xml:space="preserve">is</w:t>
+        <w:t xml:space="preserve">lies</w:t>
       </w:r>
       <w:r>
         <w:t xml:space="preserve"> </w:t>
@@ -1579,6 +1593,12 @@
         <w:t xml:space="preserve"> </w:t>
       </w:r>
       <w:r>
+        <w:t xml:space="preserve">in</w:t>
+      </w:r>
+      <w:r>
+        <w:t xml:space="preserve"> </w:t>
+      </w:r>
+      <w:r>
         <w:t xml:space="preserve">the</w:t>
       </w:r>
       <w:r>
@@ -1603,6 +1623,12 @@
         <w:t xml:space="preserve"> </w:t>
       </w:r>
       <w:r>
+        <w:t xml:space="preserve">in</w:t>
+      </w:r>
+      <w:r>
+        <w:t xml:space="preserve"> </w:t>
+      </w:r>
+      <w:r>
         <w:t xml:space="preserve">its</w:t>
       </w:r>
       <w:r>
@@ -1681,13 +1707,13 @@
         <w:t xml:space="preserve"> </w:t>
       </w:r>
       <w:r>
-        <w:t xml:space="preserve">verification—11</w:t>
+        <w:t xml:space="preserve">verification—15</w:t>
       </w:r>
       <w:r>
         <w:t xml:space="preserve">,</w:t>
       </w:r>
       <w:r>
-        <w:t xml:space="preserve">342 automated</w:t>
+        <w:t xml:space="preserve">260 automated</w:t>
       </w:r>
       <w:r>
         <w:t xml:space="preserve"> </w:t>
@@ -1841,24 +1867,12 @@
         <w:t xml:space="preserve">physics </w:t>
       </w:r>
       <w:r>
-        <w:rPr>
-          <w:vertAlign w:val="superscript"/>
-        </w:rPr>
-        <w:t xml:space="preserve">1</w:t>
-      </w:r>
-      <w:r>
         <w:t xml:space="preserve"> </w:t>
       </w:r>
       <w:r>
         <w:t xml:space="preserve">and general relativity </w:t>
       </w:r>
       <w:r>
-        <w:rPr>
-          <w:vertAlign w:val="superscript"/>
-        </w:rPr>
-        <w:t xml:space="preserve">2</w:t>
-      </w:r>
-      <w:r>
         <w:t xml:space="preserve"> </w:t>
       </w:r>
       <w:r>
@@ -1877,28 +1891,10 @@
         <w:t xml:space="preserve">entropy </w:t>
       </w:r>
       <w:r>
-        <w:rPr>
-          <w:vertAlign w:val="superscript"/>
-        </w:rPr>
-        <w:t xml:space="preserve">3</w:t>
-      </w:r>
-      <w:r>
         <w:t xml:space="preserve">, Fisher information </w:t>
       </w:r>
       <w:r>
-        <w:rPr>
-          <w:vertAlign w:val="superscript"/>
-        </w:rPr>
-        <w:t xml:space="preserve">4,5</w:t>
-      </w:r>
-      <w:r>
         <w:t xml:space="preserve">, Rényi divergences </w:t>
-      </w:r>
-      <w:r>
-        <w:rPr>
-          <w:vertAlign w:val="superscript"/>
-        </w:rPr>
-        <w:t xml:space="preserve">6</w:t>
       </w:r>
       <w:r>
         <w:t xml:space="preserve">—provide</w:t>
@@ -1961,19 +1957,13 @@
         <w:t xml:space="preserve">flows </w:t>
       </w:r>
       <w:r>
-        <w:rPr>
-          <w:vertAlign w:val="superscript"/>
-        </w:rPr>
-        <w:t xml:space="preserve">7,8</w:t>
-      </w:r>
-      <w:r>
-        <w:t xml:space="preserve">, or statistical correlations, all</w:t>
-      </w:r>
-      <w:r>
-        <w:t xml:space="preserve"> </w:t>
-      </w:r>
-      <w:r>
-        <w:t xml:space="preserve">of which require dynamical input or scale-dependent running. What has</w:t>
+        <w:t xml:space="preserve">, or statistical correlations—all</w:t>
+      </w:r>
+      <w:r>
+        <w:t xml:space="preserve"> </w:t>
+      </w:r>
+      <w:r>
+        <w:t xml:space="preserve">requiring dynamical input or scale-dependent running. What has</w:t>
       </w:r>
       <w:r>
         <w:t xml:space="preserve"> </w:t>
@@ -1992,7 +1982,10 @@
         <w:t xml:space="preserve">per se</w:t>
       </w:r>
       <w:r>
-        <w:t xml:space="preserve">, but a single</w:t>
+        <w:t xml:space="preserve"> </w:t>
+      </w:r>
+      <w:r>
+        <w:t xml:space="preserve">but a single</w:t>
       </w:r>
       <w:r>
         <w:t xml:space="preserve"> </w:t>
@@ -2083,9 +2076,6 @@
             <m:sty m:val="p"/>
           </m:rPr>
           <m:t>&lt;</m:t>
-        </m:r>
-        <m:r>
-          <m:t>​</m:t>
         </m:r>
         <m:sSup>
           <m:e>
@@ -2206,98 +2196,58 @@
         <w:t xml:space="preserve"> </w:t>
       </w:r>
       <w:r>
-        <w:t xml:space="preserve">this produces the seam calculus (a composable verification</w:t>
-      </w:r>
-      <w:r>
-        <w:t xml:space="preserve"> </w:t>
-      </w:r>
-      <w:r>
-        <w:t xml:space="preserve">boundary between outbound collapse and demonstrated return), the</w:t>
-      </w:r>
-      <w:r>
-        <w:t xml:space="preserve"> </w:t>
-      </w:r>
-      <w:r>
-        <w:t xml:space="preserve">return time </w:t>
-      </w:r>
-      <m:oMath>
-        <m:sSub>
-          <m:e>
-            <m:r>
-              <m:t>τ</m:t>
-            </m:r>
-          </m:e>
-          <m:sub>
-            <m:r>
-              <m:t>​</m:t>
-            </m:r>
-            <m:r>
-              <m:t>R</m:t>
-            </m:r>
-          </m:sub>
-        </m:sSub>
-      </m:oMath>
-      <w:r>
-        <w:t xml:space="preserve"> </w:t>
-      </w:r>
-      <w:r>
-        <w:t xml:space="preserve">(a measured re-entry delay, not an assumed one),</w:t>
-      </w:r>
-      <w:r>
-        <w:t xml:space="preserve"> </w:t>
-      </w:r>
-      <w:r>
-        <w:t xml:space="preserve">and three-valued verdicts (Conformant / Nonconformant /</w:t>
-      </w:r>
-      <w:r>
-        <w:t xml:space="preserve"> </w:t>
-      </w:r>
-      <w:r>
-        <w:t xml:space="preserve">Non-Evaluable) that replace the Boolean pass/fail of conventional</w:t>
-      </w:r>
-      <w:r>
-        <w:t xml:space="preserve"> </w:t>
-      </w:r>
-      <w:r>
-        <w:t xml:space="preserve">testing. Without Axiom-0 one has a kernel function; with it, one</w:t>
-      </w:r>
-      <w:r>
-        <w:t xml:space="preserve"> </w:t>
-      </w:r>
-      <w:r>
-        <w:t xml:space="preserve">has a measurement protocol that distinguishes verified claims</w:t>
-      </w:r>
-      <w:r>
-        <w:t xml:space="preserve"> </w:t>
-      </w:r>
-      <w:r>
-        <w:t xml:space="preserve">(</w:t>
+        <w:t xml:space="preserve">this produces a composable verification boundary (the</w:t>
+      </w:r>
+      <w:r>
+        <w:t xml:space="preserve"> </w:t>
       </w:r>
       <w:r>
         <w:rPr>
           <w:iCs/>
           <w:i/>
         </w:rPr>
-        <w:t xml:space="preserve">welds</w:t>
-      </w:r>
-      <w:r>
-        <w:t xml:space="preserve">) from internally consistent but non-returning</w:t>
-      </w:r>
-      <w:r>
-        <w:t xml:space="preserve"> </w:t>
-      </w:r>
-      <w:r>
-        <w:t xml:space="preserve">assertions (</w:t>
-      </w:r>
-      <w:r>
-        <w:rPr>
-          <w:iCs/>
-          <w:i/>
-        </w:rPr>
-        <w:t xml:space="preserve">gestures</w:t>
-      </w:r>
-      <w:r>
-        <w:t xml:space="preserve">).</w:t>
+        <w:t xml:space="preserve">seam</w:t>
+      </w:r>
+      <w:r>
+        <w:t xml:space="preserve">),</w:t>
+      </w:r>
+      <w:r>
+        <w:t xml:space="preserve"> </w:t>
+      </w:r>
+      <w:r>
+        <w:t xml:space="preserve">a measured re-entry delay (</w:t>
+      </w:r>
+      <m:oMath>
+        <m:sSub>
+          <m:e>
+            <m:r>
+              <m:t>τ</m:t>
+            </m:r>
+          </m:e>
+          <m:sub>
+            <m:r>
+              <m:t>​</m:t>
+            </m:r>
+            <m:r>
+              <m:t>R</m:t>
+            </m:r>
+          </m:sub>
+        </m:sSub>
+      </m:oMath>
+      <w:r>
+        <w:t xml:space="preserve">), and three-valued verdicts</w:t>
+      </w:r>
+      <w:r>
+        <w:t xml:space="preserve"> </w:t>
+      </w:r>
+      <w:r>
+        <w:t xml:space="preserve">(Conformant / Nonconformant / Non-Evaluable) that replace</w:t>
+      </w:r>
+      <w:r>
+        <w:t xml:space="preserve"> </w:t>
+      </w:r>
+      <w:r>
+        <w:t xml:space="preserve">Boolean pass/fail testing.</w:t>
       </w:r>
     </w:p>
     <w:p>
@@ -2495,7 +2445,7 @@
         <w:t xml:space="preserve"> </w:t>
       </w:r>
       <w:r>
-        <w:t xml:space="preserve">learning, or phenomenological modelling. The identities are</w:t>
+        <w:t xml:space="preserve">learning, or phenomenological modeling. The identities are</w:t>
       </w:r>
       <w:r>
         <w:t xml:space="preserve"> </w:t>
@@ -2537,25 +2487,25 @@
         <w:t xml:space="preserve"> </w:t>
       </w:r>
       <w:r>
-        <w:t xml:space="preserve">measurement architecture. The kernel (Tier-1) is implemented by</w:t>
-      </w:r>
-      <w:r>
-        <w:t xml:space="preserve"> </w:t>
-      </w:r>
-      <w:r>
-        <w:t xml:space="preserve">an open protocol (Tier-0) and extended via modular domain</w:t>
-      </w:r>
-      <w:r>
-        <w:t xml:space="preserve"> </w:t>
-      </w:r>
-      <w:r>
-        <w:t xml:space="preserve">closures (Tier-2): each closure declares which real-world</w:t>
-      </w:r>
-      <w:r>
-        <w:t xml:space="preserve"> </w:t>
-      </w:r>
-      <w:r>
-        <w:t xml:space="preserve">quantities become the trace vector </w:t>
+        <w:t xml:space="preserve">measurement architecture. The kernel is implemented by an open</w:t>
+      </w:r>
+      <w:r>
+        <w:t xml:space="preserve"> </w:t>
+      </w:r>
+      <w:r>
+        <w:t xml:space="preserve">protocol and extended via modular domain closures: each closure</w:t>
+      </w:r>
+      <w:r>
+        <w:t xml:space="preserve"> </w:t>
+      </w:r>
+      <w:r>
+        <w:t xml:space="preserve">declares which real-world quantities become the trace</w:t>
+      </w:r>
+      <w:r>
+        <w:t xml:space="preserve"> </w:t>
+      </w:r>
+      <w:r>
+        <w:t xml:space="preserve">vector </w:t>
       </w:r>
       <m:oMath>
         <m:r>
@@ -2566,13 +2516,7 @@
         </m:r>
       </m:oMath>
       <w:r>
-        <w:t xml:space="preserve">, frozen in a versioned</w:t>
-      </w:r>
-      <w:r>
-        <w:t xml:space="preserve"> </w:t>
-      </w:r>
-      <w:r>
-        <w:t xml:space="preserve">contract</w:t>
+        <w:t xml:space="preserve">, frozen in a versioned contract</w:t>
       </w:r>
       <w:r>
         <w:t xml:space="preserve"> </w:t>
@@ -2588,37 +2532,19 @@
         <w:t xml:space="preserve"> </w:t>
       </w:r>
       <w:r>
-        <w:t xml:space="preserve">evaluation. The system currently comprises</w:t>
-      </w:r>
-      <w:r>
-        <w:t xml:space="preserve"> </w:t>
-      </w:r>
-      <w:r>
-        <w:t xml:space="preserve">201 closure modules, 46 proven lemmas, 44 structural identities,</w:t>
-      </w:r>
-      <w:r>
-        <w:t xml:space="preserve"> </w:t>
-      </w:r>
-      <w:r>
-        <w:t xml:space="preserve">21 versioned contracts, and 28 validated casepacks. Classical</w:t>
-      </w:r>
-      <w:r>
-        <w:t xml:space="preserve"> </w:t>
-      </w:r>
-      <w:r>
-        <w:t xml:space="preserve">results—including Shannon entropy, the arithmetic–geometric</w:t>
-      </w:r>
-      <w:r>
-        <w:t xml:space="preserve"> </w:t>
-      </w:r>
-      <w:r>
-        <w:t xml:space="preserve">mean inequality, and the fluctuation–dissipation</w:t>
-      </w:r>
-      <w:r>
-        <w:t xml:space="preserve"> </w:t>
-      </w:r>
-      <w:r>
-        <w:t xml:space="preserve">theorem—emerge as</w:t>
+        <w:t xml:space="preserve">evaluation. Classical results—including Shannon entropy, the</w:t>
+      </w:r>
+      <w:r>
+        <w:t xml:space="preserve"> </w:t>
+      </w:r>
+      <w:r>
+        <w:t xml:space="preserve">arithmetic–geometric mean inequality, and the</w:t>
+      </w:r>
+      <w:r>
+        <w:t xml:space="preserve"> </w:t>
+      </w:r>
+      <w:r>
+        <w:t xml:space="preserve">fluctuation–dissipation theorem—emerge as</w:t>
       </w:r>
       <w:r>
         <w:t xml:space="preserve"> </w:t>
@@ -2628,70 +2554,39 @@
           <w:iCs/>
           <w:i/>
         </w:rPr>
-        <w:t xml:space="preserve">degenerate limits</w:t>
-      </w:r>
-      <w:r>
-        <w:t xml:space="preserve"> </w:t>
-      </w:r>
-      <w:r>
-        <w:t xml:space="preserve">of the kernel when</w:t>
-      </w:r>
-      <w:r>
-        <w:t xml:space="preserve"> </w:t>
-      </w:r>
-      <w:r>
-        <w:t xml:space="preserve">structural degrees of freedom are removed (see Discussion),</w:t>
-      </w:r>
-      <w:r>
-        <w:t xml:space="preserve"> </w:t>
-      </w:r>
-      <w:r>
-        <w:t xml:space="preserve">ensuring full compatibility with established methods. A built-in</w:t>
-      </w:r>
-      <w:r>
-        <w:t xml:space="preserve"> </w:t>
-      </w:r>
-      <w:r>
-        <w:t xml:space="preserve">cross-domain translation protocol (the</w:t>
-      </w:r>
-      <w:r>
-        <w:t xml:space="preserve"> </w:t>
-      </w:r>
-      <w:r>
-        <w:t xml:space="preserve">“</w:t>
-      </w:r>
-      <w:r>
-        <w:t xml:space="preserve">Rosetta</w:t>
-      </w:r>
-      <w:r>
-        <w:t xml:space="preserve">”</w:t>
-      </w:r>
-      <w:r>
-        <w:t xml:space="preserve">) maps the</w:t>
-      </w:r>
-      <w:r>
-        <w:t xml:space="preserve"> </w:t>
-      </w:r>
-      <w:r>
-        <w:t xml:space="preserve">kernel’s five-word diagnostic vocabulary into nine disciplinary</w:t>
-      </w:r>
-      <w:r>
-        <w:t xml:space="preserve"> </w:t>
-      </w:r>
-      <w:r>
-        <w:t xml:space="preserve">lenses, enabling physicists, neuroscientists, and economists to</w:t>
-      </w:r>
-      <w:r>
-        <w:t xml:space="preserve"> </w:t>
-      </w:r>
-      <w:r>
-        <w:t xml:space="preserve">read the same invariants in their native dialect while the</w:t>
-      </w:r>
-      <w:r>
-        <w:t xml:space="preserve"> </w:t>
-      </w:r>
-      <w:r>
-        <w:t xml:space="preserve">underlying audit remains invariant.</w:t>
+        <w:t xml:space="preserve">degenerate</w:t>
+      </w:r>
+      <w:r>
+        <w:rPr>
+          <w:iCs/>
+          <w:i/>
+        </w:rPr>
+        <w:t xml:space="preserve"> </w:t>
+      </w:r>
+      <w:r>
+        <w:rPr>
+          <w:iCs/>
+          <w:i/>
+        </w:rPr>
+        <w:t xml:space="preserve">limits</w:t>
+      </w:r>
+      <w:r>
+        <w:t xml:space="preserve"> </w:t>
+      </w:r>
+      <w:r>
+        <w:t xml:space="preserve">of the kernel when structural degrees of freedom are</w:t>
+      </w:r>
+      <w:r>
+        <w:t xml:space="preserve"> </w:t>
+      </w:r>
+      <w:r>
+        <w:t xml:space="preserve">removed (see Discussion), ensuring full compatibility with</w:t>
+      </w:r>
+      <w:r>
+        <w:t xml:space="preserve"> </w:t>
+      </w:r>
+      <w:r>
+        <w:t xml:space="preserve">established methods.</w:t>
       </w:r>
     </w:p>
     <w:bookmarkEnd w:id="21"/>
@@ -3900,13 +3795,7 @@
         <w:t xml:space="preserve"> </w:t>
       </w:r>
       <w:r>
-        <w:t xml:space="preserve">coefficient), making it the correct aggregator for composition</w:t>
-      </w:r>
-      <w:r>
-        <w:t xml:space="preserve"> </w:t>
-      </w:r>
-      <w:r>
-        <w:t xml:space="preserve">across scales, and because it emerges as the solvability condition</w:t>
+        <w:t xml:space="preserve">coefficient) and because it arises as the solvability condition</w:t>
       </w:r>
       <w:r>
         <w:t xml:space="preserve"> </w:t>
@@ -3985,7 +3874,7 @@
         <w:t xml:space="preserve"> </w:t>
       </w:r>
       <w:r>
-        <w:t xml:space="preserve">channel heterogeneity normalised to the maximum standard deviation.</w:t>
+        <w:t xml:space="preserve">channel heterogeneity normalized to the maximum standard deviation.</w:t>
       </w:r>
     </w:p>
     <w:bookmarkEnd w:id="22"/>
@@ -4227,19 +4116,13 @@
         <w:t xml:space="preserve"> </w:t>
       </w:r>
       <w:r>
-        <w:t xml:space="preserve">That three identities grounded in classical mathematics can serve as</w:t>
-      </w:r>
-      <w:r>
-        <w:t xml:space="preserve"> </w:t>
-      </w:r>
-      <w:r>
-        <w:t xml:space="preserve">a cross-scale diagnostic is precisely the point: the mathematics is</w:t>
-      </w:r>
-      <w:r>
-        <w:t xml:space="preserve"> </w:t>
-      </w:r>
-      <w:r>
-        <w:t xml:space="preserve">not novel; the</w:t>
+        <w:t xml:space="preserve">The three identities rest on classical mathematics;</w:t>
+      </w:r>
+      <w:r>
+        <w:t xml:space="preserve"> </w:t>
+      </w:r>
+      <w:r>
+        <w:t xml:space="preserve">the contribution is the</w:t>
       </w:r>
       <w:r>
         <w:t xml:space="preserve"> </w:t>
@@ -4255,13 +4138,13 @@
         <w:t xml:space="preserve"> </w:t>
       </w:r>
       <w:r>
-        <w:t xml:space="preserve">is that applying these</w:t>
-      </w:r>
-      <w:r>
-        <w:t xml:space="preserve"> </w:t>
-      </w:r>
-      <w:r>
-        <w:t xml:space="preserve">identities as a unified measurement lens across 406 objects reveals</w:t>
+        <w:t xml:space="preserve">that applying them</w:t>
+      </w:r>
+      <w:r>
+        <w:t xml:space="preserve"> </w:t>
+      </w:r>
+      <w:r>
+        <w:t xml:space="preserve">as a unified measurement lens across 406 objects reveals</w:t>
       </w:r>
       <w:r>
         <w:t xml:space="preserve"> </w:t>
@@ -4467,28 +4350,22 @@
         <w:t xml:space="preserve"> </w:t>
       </w:r>
       <w:r>
-        <w:t xml:space="preserve">is the classical weighted inequality of arithmetic and</w:t>
-      </w:r>
-      <w:r>
-        <w:t xml:space="preserve"> </w:t>
-      </w:r>
-      <w:r>
-        <w:t xml:space="preserve">geometric means </w:t>
-      </w:r>
-      <w:r>
-        <w:rPr>
-          <w:vertAlign w:val="superscript"/>
-        </w:rPr>
-        <w:t xml:space="preserve">9</w:t>
-      </w:r>
-      <w:r>
-        <w:t xml:space="preserve">; the novelty lies</w:t>
-      </w:r>
-      <w:r>
-        <w:t xml:space="preserve"> </w:t>
-      </w:r>
-      <w:r>
-        <w:t xml:space="preserve">not in the bound itself but in its application as a</w:t>
+        <w:t xml:space="preserve">corresponds to the classical weighted inequality of</w:t>
+      </w:r>
+      <w:r>
+        <w:t xml:space="preserve"> </w:t>
+      </w:r>
+      <w:r>
+        <w:t xml:space="preserve">arithmetic and geometric means </w:t>
+      </w:r>
+      <w:r>
+        <w:t xml:space="preserve">;</w:t>
+      </w:r>
+      <w:r>
+        <w:t xml:space="preserve"> </w:t>
+      </w:r>
+      <w:r>
+        <w:t xml:space="preserve">the novelty lies not in the bound itself but in its application as a</w:t>
       </w:r>
       <w:r>
         <w:t xml:space="preserve"> </w:t>
@@ -4573,7 +4450,13 @@
         <w:t xml:space="preserve"> </w:t>
       </w:r>
       <w:r>
-        <w:t xml:space="preserve">recovering individual channel values requires solving</w:t>
+        <w:t xml:space="preserve">recovering individual channel values in the two-channel case</w:t>
+      </w:r>
+      <w:r>
+        <w:t xml:space="preserve"> </w:t>
+      </w:r>
+      <w:r>
+        <w:t xml:space="preserve">requires solving</w:t>
       </w:r>
       <w:r>
         <w:t xml:space="preserve"> </w:t>
@@ -4664,13 +4547,13 @@
         </m:rad>
       </m:oMath>
       <w:r>
-        <w:t xml:space="preserve">, which yields real solutions</w:t>
-      </w:r>
-      <w:r>
-        <w:t xml:space="preserve"> </w:t>
-      </w:r>
-      <w:r>
-        <w:t xml:space="preserve">only when</w:t>
+        <w:t xml:space="preserve">, which</w:t>
+      </w:r>
+      <w:r>
+        <w:t xml:space="preserve"> </w:t>
+      </w:r>
+      <w:r>
+        <w:t xml:space="preserve">yields real solutions only when</w:t>
       </w:r>
       <w:r>
         <w:t xml:space="preserve"> </w:t>
@@ -4773,13 +4656,13 @@
         <w:t xml:space="preserve"> </w:t>
       </w:r>
       <w:r>
-        <w:t xml:space="preserve">channels die, regardless of the physics producing the death</w:t>
-      </w:r>
-      <w:r>
-        <w:t xml:space="preserve"> </w:t>
-      </w:r>
-      <w:r>
-        <w:t xml:space="preserve">(colour confinement, chemical inertness, dark energy).</w:t>
+        <w:t xml:space="preserve">channels die, irrespective of the underlying physics</w:t>
+      </w:r>
+      <w:r>
+        <w:t xml:space="preserve"> </w:t>
+      </w:r>
+      <w:r>
+        <w:t xml:space="preserve">(color confinement, chemical inertness, dark energy).</w:t>
       </w:r>
       <w:r>
         <w:t xml:space="preserve"> </w:t>
@@ -5271,13 +5154,13 @@
         <w:t xml:space="preserve"> </w:t>
       </w:r>
       <w:r>
-        <w:t xml:space="preserve">theorem constrains the channel distribution’s shape, making entropy</w:t>
-      </w:r>
-      <w:r>
-        <w:t xml:space="preserve"> </w:t>
-      </w:r>
-      <w:r>
-        <w:t xml:space="preserve">asymptotically a function of mean (</w:t>
+        <w:t xml:space="preserve">theorem constrains the shape of the channel distribution, making</w:t>
+      </w:r>
+      <w:r>
+        <w:t xml:space="preserve"> </w:t>
+      </w:r>
+      <w:r>
+        <w:t xml:space="preserve">entropy asymptotically a function of mean (</w:t>
       </w:r>
       <m:oMath>
         <m:r>
@@ -5300,12 +5183,6 @@
       </w:r>
       <w:r>
         <w:t xml:space="preserve">Across 406 physical objects,</w:t>
-      </w:r>
-      <w:r>
-        <w:t xml:space="preserve"> </w:t>
-      </w:r>
-      <w:r>
-        <w:t xml:space="preserve">the Pearson correlation</w:t>
       </w:r>
       <w:r>
         <w:t xml:space="preserve"> </w:t>
@@ -5462,7 +5339,7 @@
         </m:sSup>
       </m:oMath>
       <w:r>
-        <w:t xml:space="preserve">), and approaches </w:t>
+        <w:t xml:space="preserve">), approaching </w:t>
       </w:r>
       <m:oMath>
         <m:r>
@@ -5627,13 +5504,13 @@
         <w:pStyle w:val="FirstParagraph"/>
       </w:pPr>
       <w:r>
-        <w:t xml:space="preserve">These identities have been subjected to exhaustive computational</w:t>
-      </w:r>
-      <w:r>
-        <w:t xml:space="preserve"> </w:t>
-      </w:r>
-      <w:r>
-        <w:t xml:space="preserve">verification across 20 scientific domains:</w:t>
+        <w:t xml:space="preserve">These identities were verified exhaustively across</w:t>
+      </w:r>
+      <w:r>
+        <w:t xml:space="preserve"> </w:t>
+      </w:r>
+      <w:r>
+        <w:t xml:space="preserve">20 scientific domains:</w:t>
       </w:r>
     </w:p>
     <w:p>
@@ -5827,7 +5704,7 @@
         <w:t xml:space="preserve"> </w:t>
       </w:r>
       <w:r>
-        <w:t xml:space="preserve">element, all 118), each passing to</w:t>
+        <w:t xml:space="preserve">element, all 118), all satisfied to</w:t>
       </w:r>
       <w:r>
         <w:t xml:space="preserve"> </w:t>
@@ -5886,42 +5763,13 @@
         <w:t xml:space="preserve"> </w:t>
       </w:r>
       <w:r>
-        <w:t xml:space="preserve">14 composite), duality verified to</w:t>
-      </w:r>
-      <w:r>
-        <w:t xml:space="preserve"> </w:t>
-      </w:r>
-      <m:oMath>
-        <m:r>
-          <m:t>0.0</m:t>
-        </m:r>
-        <m:r>
-          <m:rPr>
-            <m:sty m:val="p"/>
-          </m:rPr>
-          <m:t>×</m:t>
-        </m:r>
-        <m:sSup>
-          <m:e>
-            <m:r>
-              <m:t>10</m:t>
-            </m:r>
-          </m:e>
-          <m:sup>
-            <m:r>
-              <m:t>0</m:t>
-            </m:r>
-          </m:sup>
-        </m:sSup>
-      </m:oMath>
-      <w:r>
-        <w:t xml:space="preserve"> residual </w:t>
-      </w:r>
-      <w:r>
-        <w:rPr>
-          <w:vertAlign w:val="superscript"/>
-        </w:rPr>
-        <w:t xml:space="preserve">1</w:t>
+        <w:t xml:space="preserve">14 composite), duality verified to zero</w:t>
+      </w:r>
+      <w:r>
+        <w:t xml:space="preserve"> </w:t>
+      </w:r>
+      <w:r>
+        <w:t xml:space="preserve">residual </w:t>
       </w:r>
       <w:r>
         <w:t xml:space="preserve">.</w:t>
@@ -5945,38 +5793,19 @@
         <w:t xml:space="preserve"> </w:t>
       </w:r>
       <w:r>
-        <w:t xml:space="preserve">When two consecutive kernel</w:t>
-      </w:r>
-      <w:r>
-        <w:t xml:space="preserve"> </w:t>
-      </w:r>
-      <w:r>
-        <w:t xml:space="preserve">evaluations are chained—the output of evaluating system </w:t>
-      </w:r>
-      <m:oMath>
-        <m:r>
-          <m:t>A</m:t>
-        </m:r>
-      </m:oMath>
-      <w:r>
-        <w:t xml:space="preserve"> </w:t>
-      </w:r>
-      <w:r>
-        <w:t xml:space="preserve">feeds as context into evaluating system </w:t>
-      </w:r>
-      <m:oMath>
-        <m:r>
-          <m:t>B</m:t>
-        </m:r>
-      </m:oMath>
-      <w:r>
-        <w:t xml:space="preserve">—the composition</w:t>
-      </w:r>
-      <w:r>
-        <w:t xml:space="preserve"> </w:t>
-      </w:r>
-      <w:r>
-        <w:t xml:space="preserve">defines a binary operation on kernel states. This</w:t>
+        <w:t xml:space="preserve">Chaining consecutive kernel</w:t>
+      </w:r>
+      <w:r>
+        <w:t xml:space="preserve"> </w:t>
+      </w:r>
+      <w:r>
+        <w:t xml:space="preserve">evaluations defines a binary operation on kernel states.</w:t>
+      </w:r>
+      <w:r>
+        <w:t xml:space="preserve"> </w:t>
+      </w:r>
+      <w:r>
+        <w:t xml:space="preserve">This</w:t>
       </w:r>
       <w:r>
         <w:t xml:space="preserve"> </w:t>
@@ -5986,21 +5815,7 @@
           <w:iCs/>
           <w:i/>
         </w:rPr>
-        <w:t xml:space="preserve">seam</w:t>
-      </w:r>
-      <w:r>
-        <w:rPr>
-          <w:iCs/>
-          <w:i/>
-        </w:rPr>
-        <w:t xml:space="preserve"> </w:t>
-      </w:r>
-      <w:r>
-        <w:rPr>
-          <w:iCs/>
-          <w:i/>
-        </w:rPr>
-        <w:t xml:space="preserve">composition</w:t>
+        <w:t xml:space="preserve">seam composition</w:t>
       </w:r>
       <w:r>
         <w:t xml:space="preserve"> </w:t>
@@ -6044,53 +5859,19 @@
         <w:t xml:space="preserve"> </w:t>
       </w:r>
       <w:r>
-        <w:t xml:space="preserve">(machine precision; IEEE 754</w:t>
-      </w:r>
-      <w:r>
-        <w:t xml:space="preserve"> </w:t>
-      </w:r>
-      <w:r>
-        <w:t xml:space="preserve">floating-point arithmetic is</w:t>
-      </w:r>
-      <w:r>
-        <w:t xml:space="preserve"> </w:t>
-      </w:r>
-      <w:r>
-        <w:rPr>
-          <w:iCs/>
-          <w:i/>
-        </w:rPr>
-        <w:t xml:space="preserve">not</w:t>
-      </w:r>
-      <w:r>
-        <w:t xml:space="preserve"> </w:t>
-      </w:r>
-      <w:r>
-        <w:t xml:space="preserve">generally associative,</w:t>
-      </w:r>
-      <w:r>
-        <w:t xml:space="preserve"> </w:t>
-      </w:r>
-      <w:r>
-        <w:t xml:space="preserve">so this result confirms algebraic exactness beyond numerical</w:t>
-      </w:r>
-      <w:r>
-        <w:t xml:space="preserve"> </w:t>
-      </w:r>
-      <w:r>
-        <w:t xml:space="preserve">accident), with an identity</w:t>
-      </w:r>
-      <w:r>
-        <w:t xml:space="preserve"> </w:t>
-      </w:r>
-      <w:r>
-        <w:t xml:space="preserve">element (the homogeneous trace), proving the framework forms a</w:t>
-      </w:r>
-      <w:r>
-        <w:t xml:space="preserve"> </w:t>
-      </w:r>
-      <w:r>
-        <w:t xml:space="preserve">monoid under chaining. Associativity guarantees that nested</w:t>
+        <w:t xml:space="preserve">(machine precision), with an identity</w:t>
+      </w:r>
+      <w:r>
+        <w:t xml:space="preserve"> </w:t>
+      </w:r>
+      <w:r>
+        <w:t xml:space="preserve">element (the homogeneous trace), forming a</w:t>
+      </w:r>
+      <w:r>
+        <w:t xml:space="preserve"> </w:t>
+      </w:r>
+      <w:r>
+        <w:t xml:space="preserve">monoid under chaining. Associativity ensures that nested</w:t>
       </w:r>
       <w:r>
         <w:t xml:space="preserve"> </w:t>
@@ -6144,13 +5925,13 @@
         <w:pStyle w:val="FirstParagraph"/>
       </w:pPr>
       <w:r>
-        <w:t xml:space="preserve">In total, 11</w:t>
+        <w:t xml:space="preserve">In total, 15</w:t>
       </w:r>
       <w:r>
         <w:t xml:space="preserve">,</w:t>
       </w:r>
       <w:r>
-        <w:t xml:space="preserve">342 deterministic automated proofs span</w:t>
+        <w:t xml:space="preserve">260 deterministic automated proofs span</w:t>
       </w:r>
       <w:r>
         <w:t xml:space="preserve"> </w:t>
@@ -6173,7 +5954,7 @@
         <w:t xml:space="preserve"> </w:t>
       </w:r>
       <w:r>
-        <w:t xml:space="preserve">201 closure modules, 46 proven lemmas, and 44 structural</w:t>
+        <w:t xml:space="preserve">181 closure modules, 47 proven lemmas, and 44 structural</w:t>
       </w:r>
       <w:r>
         <w:t xml:space="preserve"> </w:t>
@@ -6185,7 +5966,7 @@
         <w:t xml:space="preserve"> </w:t>
       </w:r>
       <w:r>
-        <w:t xml:space="preserve">this constitutes the most extensive cross-domain verification</w:t>
+        <w:t xml:space="preserve">this represents the most extensive cross-domain verification</w:t>
       </w:r>
       <w:r>
         <w:t xml:space="preserve"> </w:t>
@@ -6928,13 +6709,13 @@
         <w:t xml:space="preserve"> </w:t>
       </w:r>
       <w:r>
-        <w:t xml:space="preserve">Each domain contributes Tier-2 closures (channel selections and</w:t>
-      </w:r>
-      <w:r>
-        <w:t xml:space="preserve"> </w:t>
-      </w:r>
-      <w:r>
-        <w:t xml:space="preserve">entity catalogues) validated against the universal Tier-1 kernel.</w:t>
+        <w:t xml:space="preserve">Each domain contributes closures (channel selections and</w:t>
+      </w:r>
+      <w:r>
+        <w:t xml:space="preserve"> </w:t>
+      </w:r>
+      <w:r>
+        <w:t xml:space="preserve">entity catalogs) validated against the universal kernel.</w:t>
       </w:r>
     </w:p>
     <w:tbl>
@@ -6942,7 +6723,7 @@
         <w:tblStyle w:val="Table"/>
         <w:tblW w:type="auto" w:w="0"/>
         <w:tblLook w:firstRow="1" w:lastRow="0" w:firstColumn="0" w:lastColumn="0" w:noHBand="0" w:noVBand="0" w:val="0020"/>
-        <w:tblCaption w:val="Domain coverage. The 20 scientific domains across which all three identities hold with zero violations. Each domain contributes Tier-2 closures (channel selections and entity catalogues) validated against the universal Tier-1 kernel."/>
+        <w:tblCaption w:val="Domain coverage. The 20 scientific domains across which all three identities hold with zero violations. Each domain contributes closures (channel selections and entity catalogs) validated against the universal kernel."/>
       </w:tblPr>
       <w:tblGrid>
         <w:gridCol w:w="1980"/>
@@ -7523,7 +7304,7 @@
     <w:bookmarkEnd w:id="28"/>
     <w:bookmarkEnd w:id="29"/>
     <w:bookmarkEnd w:id="30"/>
-    <w:bookmarkStart w:id="51" w:name="applications"/>
+    <w:bookmarkStart w:id="35" w:name="applications"/>
     <w:p>
       <w:pPr>
         <w:pStyle w:val="Heading1"/>
@@ -7559,27 +7340,7 @@
         <w:t xml:space="preserve">confinement cliff</w:t>
       </w:r>
       <w:r>
-        <w:t xml:space="preserve">: a</w:t>
-      </w:r>
-      <w:r>
-        <w:t xml:space="preserve"> </w:t>
-      </w:r>
-      <m:oMath>
-        <m:r>
-          <m:t>23</m:t>
-        </m:r>
-        <m:r>
-          <m:rPr>
-            <m:sty m:val="p"/>
-          </m:rPr>
-          <m:t>×</m:t>
-        </m:r>
-      </m:oMath>
-      <w:r>
-        <w:t xml:space="preserve"> </w:t>
-      </w:r>
-      <w:r>
-        <w:t xml:space="preserve">discontinuity in</w:t>
+        <w:t xml:space="preserve">: a 23-fold discontinuity in</w:t>
       </w:r>
       <w:r>
         <w:t xml:space="preserve"> </w:t>
@@ -7618,7 +7379,7 @@
           <w:rPr>
             <w:rStyle w:val="Hyperlink"/>
           </w:rPr>
-          <w:t xml:space="preserve">1</w:t>
+          <w:t xml:space="preserve">[fig:cliff]</w:t>
         </w:r>
       </w:hyperlink>
       <w:r>
@@ -7630,25 +7391,25 @@
         <w:pStyle w:val="BodyText"/>
       </w:pPr>
       <w:r>
-        <w:t xml:space="preserve">Free quarks carry finite values in all eight channels (mass, spin,</w:t>
-      </w:r>
-      <w:r>
-        <w:t xml:space="preserve"> </w:t>
-      </w:r>
-      <w:r>
-        <w:t xml:space="preserve">charge, colour, weak isospin, lepton number, baryon number,</w:t>
-      </w:r>
-      <w:r>
-        <w:t xml:space="preserve"> </w:t>
-      </w:r>
-      <w:r>
-        <w:t xml:space="preserve">generation). When they bind into colour-neutral hadrons </w:t>
-      </w:r>
-      <w:r>
-        <w:rPr>
-          <w:vertAlign w:val="superscript"/>
-        </w:rPr>
-        <w:t xml:space="preserve">10</w:t>
+        <w:t xml:space="preserve">Individual quarks, characterized by their quantum numbers, carry</w:t>
+      </w:r>
+      <w:r>
+        <w:t xml:space="preserve"> </w:t>
+      </w:r>
+      <w:r>
+        <w:t xml:space="preserve">finite values in all eight channels (mass, spin, charge, color,</w:t>
+      </w:r>
+      <w:r>
+        <w:t xml:space="preserve"> </w:t>
+      </w:r>
+      <w:r>
+        <w:t xml:space="preserve">weak isospin, lepton number, baryon number, generation). When</w:t>
+      </w:r>
+      <w:r>
+        <w:t xml:space="preserve"> </w:t>
+      </w:r>
+      <w:r>
+        <w:t xml:space="preserve">quarks bind into color-neutral hadrons </w:t>
       </w:r>
       <w:r>
         <w:t xml:space="preserve">,</w:t>
@@ -7657,7 +7418,7 @@
         <w:t xml:space="preserve"> </w:t>
       </w:r>
       <w:r>
-        <w:t xml:space="preserve">the colour-charge channel collapses to the guard band</w:t>
+        <w:t xml:space="preserve">the color-charge channel collapses to the guard band</w:t>
       </w:r>
       <w:r>
         <w:t xml:space="preserve"> </w:t>
@@ -8221,7 +7982,7 @@
           <w:rPr>
             <w:rStyle w:val="Hyperlink"/>
           </w:rPr>
-          <w:t xml:space="preserve">2</w:t>
+          <w:t xml:space="preserve">[fig:slaughter]</w:t>
         </w:r>
       </w:hyperlink>
       <w:r>
@@ -8361,7 +8122,7 @@
         <w:t xml:space="preserve"> </w:t>
       </w:r>
       <w:r>
-        <w:t xml:space="preserve">(colour</w:t>
+        <w:t xml:space="preserve">(color</w:t>
       </w:r>
       <w:r>
         <w:t xml:space="preserve"> </w:t>
@@ -8430,7 +8191,7 @@
         <w:t xml:space="preserve"> </w:t>
       </w:r>
       <w:r>
-        <w:t xml:space="preserve">(colour + charge</w:t>
+        <w:t xml:space="preserve">(color + charge</w:t>
       </w:r>
       <w:r>
         <w:t xml:space="preserve"> </w:t>
@@ -8536,16 +8297,10 @@
         <w:t xml:space="preserve">numbers </w:t>
       </w:r>
       <w:r>
-        <w:rPr>
-          <w:vertAlign w:val="superscript"/>
-        </w:rPr>
-        <w:t xml:space="preserve">1</w:t>
-      </w:r>
-      <w:r>
-        <w:t xml:space="preserve"> </w:t>
-      </w:r>
-      <w:r>
-        <w:t xml:space="preserve">(mass, spin, charge, colour, isospin,</w:t>
+        <w:t xml:space="preserve"> </w:t>
+      </w:r>
+      <w:r>
+        <w:t xml:space="preserve">(mass, spin, charge, color, isospin,</w:t>
       </w:r>
       <w:r>
         <w:t xml:space="preserve"> </w:t>
@@ -8558,12 +8313,6 @@
       </w:r>
       <w:r>
         <w:t xml:space="preserve">QCD coupling constants, lattice calculations </w:t>
-      </w:r>
-      <w:r>
-        <w:rPr>
-          <w:vertAlign w:val="superscript"/>
-        </w:rPr>
-        <w:t xml:space="preserve">11</w:t>
       </w:r>
       <w:r>
         <w:t xml:space="preserve">,</w:t>
@@ -8676,7 +8425,7 @@
           <w:rPr>
             <w:rStyle w:val="Hyperlink"/>
           </w:rPr>
-          <w:t xml:space="preserve">3</w:t>
+          <w:t xml:space="preserve">[fig:periodic]</w:t>
         </w:r>
       </w:hyperlink>
       <w:r>
@@ -8757,22 +8506,8 @@
         <w:pStyle w:val="FirstParagraph"/>
       </w:pPr>
       <w:r>
-        <w:t xml:space="preserve">Equally remarkable is the</w:t>
-      </w:r>
-      <w:r>
-        <w:t xml:space="preserve"> </w:t>
-      </w:r>
-      <m:oMath>
-        <m:r>
-          <m:t>35</m:t>
-        </m:r>
-        <m:r>
-          <m:rPr>
-            <m:sty m:val="p"/>
-          </m:rPr>
-          <m:t>×</m:t>
-        </m:r>
-      </m:oMath>
+        <w:t xml:space="preserve">Equally remarkable is the 35-fold</w:t>
+      </w:r>
       <w:r>
         <w:t xml:space="preserve"> </w:t>
       </w:r>
@@ -8855,7 +8590,7 @@
           <w:rPr>
             <w:rStyle w:val="Hyperlink"/>
           </w:rPr>
-          <w:t xml:space="preserve">1</w:t>
+          <w:t xml:space="preserve">[fig:cliff]</w:t>
         </w:r>
       </w:hyperlink>
       <w:r>
@@ -8871,7 +8606,7 @@
         <w:t xml:space="preserve"> </w:t>
       </w:r>
       <w:r>
-        <w:t xml:space="preserve">ionisation energy, atomic radius, melting point, boiling point,</w:t>
+        <w:t xml:space="preserve">ionization energy, atomic radius, melting point, boiling point,</w:t>
       </w:r>
       <w:r>
         <w:t xml:space="preserve"> </w:t>
@@ -8885,19 +8620,19 @@
         <w:pStyle w:val="BodyText"/>
       </w:pPr>
       <w:r>
-        <w:t xml:space="preserve">These emergent channels are well-populated for most elements (no dead</w:t>
-      </w:r>
-      <w:r>
-        <w:t xml:space="preserve"> </w:t>
-      </w:r>
-      <w:r>
-        <w:t xml:space="preserve">channels except noble gases), correlated through shared electron</w:t>
-      </w:r>
-      <w:r>
-        <w:t xml:space="preserve"> </w:t>
-      </w:r>
-      <w:r>
-        <w:t xml:space="preserve">physics, and measured across all 118 elements</w:t>
+        <w:t xml:space="preserve">These emergent channels are well-populated for most elements (no</w:t>
+      </w:r>
+      <w:r>
+        <w:t xml:space="preserve"> </w:t>
+      </w:r>
+      <w:r>
+        <w:t xml:space="preserve">dead channels except noble gases), correlated through shared</w:t>
+      </w:r>
+      <w:r>
+        <w:t xml:space="preserve"> </w:t>
+      </w:r>
+      <w:r>
+        <w:t xml:space="preserve">electronic structure, and measured across all 118 elements</w:t>
       </w:r>
       <w:r>
         <w:t xml:space="preserve"> </w:t>
@@ -8910,7 +8645,7 @@
           <w:rPr>
             <w:rStyle w:val="Hyperlink"/>
           </w:rPr>
-          <w:t xml:space="preserve">3</w:t>
+          <w:t xml:space="preserve">[fig:periodic]</w:t>
         </w:r>
       </w:hyperlink>
       <w:r>
@@ -8963,25 +8698,25 @@
         </m:r>
       </m:oMath>
       <w:r>
-        <w:t xml:space="preserve">) because hydrogen has too few</w:t>
-      </w:r>
-      <w:r>
-        <w:t xml:space="preserve"> </w:t>
-      </w:r>
-      <w:r>
-        <w:t xml:space="preserve">populated channels and helium has a near-dead reactivity channel</w:t>
-      </w:r>
-      <w:r>
-        <w:t xml:space="preserve"> </w:t>
-      </w:r>
-      <w:r>
-        <w:t xml:space="preserve">(the same geometric slaughter mechanism as confinement, now</w:t>
-      </w:r>
-      <w:r>
-        <w:t xml:space="preserve"> </w:t>
-      </w:r>
-      <w:r>
-        <w:t xml:space="preserve">producing chemical inertness). By Period 4–5, the 8-channel trace</w:t>
+        <w:t xml:space="preserve">) because hydrogen has</w:t>
+      </w:r>
+      <w:r>
+        <w:t xml:space="preserve"> </w:t>
+      </w:r>
+      <w:r>
+        <w:t xml:space="preserve">insufficiently populated channels and helium has a near-dead</w:t>
+      </w:r>
+      <w:r>
+        <w:t xml:space="preserve"> </w:t>
+      </w:r>
+      <w:r>
+        <w:t xml:space="preserve">reactivity channel (the same geometric slaughter mechanism as</w:t>
+      </w:r>
+      <w:r>
+        <w:t xml:space="preserve"> </w:t>
+      </w:r>
+      <w:r>
+        <w:t xml:space="preserve">confinement, here producing chemical inertness). By Period 4–5, the 8-channel trace</w:t>
       </w:r>
       <w:r>
         <w:t xml:space="preserve"> </w:t>
@@ -9089,7 +8824,7 @@
         <w:pStyle w:val="BodyText"/>
       </w:pPr>
       <w:r>
-        <w:t xml:space="preserve">This demonstrates a structural principle visible across scales:</w:t>
+        <w:t xml:space="preserve">This illustrates a structural principle visible across scales:</w:t>
       </w:r>
       <w:r>
         <w:t xml:space="preserve"> </w:t>
@@ -9137,7 +8872,7 @@
         <w:t xml:space="preserve"> </w:t>
       </w:r>
       <w:r>
-        <w:t xml:space="preserve">condition for atomic-scale channel formation: colour neutrality</w:t>
+        <w:t xml:space="preserve">condition for atomic-scale channel formation: color neutrality</w:t>
       </w:r>
       <w:r>
         <w:t xml:space="preserve"> </w:t>
@@ -9149,7 +8884,7 @@
         <w:t xml:space="preserve"> </w:t>
       </w:r>
       <w:r>
-        <w:t xml:space="preserve">(electronegativity, ionisation energy, etc.) that are well-populated,</w:t>
+        <w:t xml:space="preserve">(electronegativity, ionization energy, etc.) that are well-populated,</w:t>
       </w:r>
       <w:r>
         <w:t xml:space="preserve"> </w:t>
@@ -9226,13 +8961,13 @@
         <w:t xml:space="preserve"> </w:t>
       </w:r>
       <w:r>
-        <w:t xml:space="preserve">identical kernel (same equations, same frozen parameters, same</w:t>
-      </w:r>
-      <w:r>
-        <w:t xml:space="preserve"> </w:t>
-      </w:r>
-      <w:r>
-        <w:t xml:space="preserve">verification protocol) to a 10-channel cortical kernel</w:t>
+        <w:t xml:space="preserve">same kernel (same equations, same frozen parameters, same</w:t>
+      </w:r>
+      <w:r>
+        <w:t xml:space="preserve"> </w:t>
+      </w:r>
+      <w:r>
+        <w:t xml:space="preserve">verification protocol) to a 10-channel cortical trace</w:t>
       </w:r>
       <w:r>
         <w:t xml:space="preserve"> </w:t>
@@ -9528,7 +9263,7 @@
           <w:iCs/>
           <w:i/>
         </w:rPr>
-        <w:t xml:space="preserve">all ten channels are most evenly</w:t>
+        <w:t xml:space="preserve">all ten channels attain their most</w:t>
       </w:r>
       <w:r>
         <w:rPr>
@@ -9542,10 +9277,10 @@
           <w:iCs/>
           <w:i/>
         </w:rPr>
-        <w:t xml:space="preserve">distributed at age 15</w:t>
-      </w:r>
-      <w:r>
-        <w:t xml:space="preserve">, minimising the heterogeneity gap</w:t>
+        <w:t xml:space="preserve">uniform distribution at age 15</w:t>
+      </w:r>
+      <w:r>
+        <w:t xml:space="preserve">, minimizing the heterogeneity gap</w:t>
       </w:r>
       <w:r>
         <w:t xml:space="preserve"> </w:t>
@@ -9583,7 +9318,7 @@
         </m:r>
       </m:oMath>
       <w:r>
-        <w:t xml:space="preserve">. Adult specialisation trades uniform coherence</w:t>
+        <w:t xml:space="preserve">. Adult specialization trades uniform coherence</w:t>
       </w:r>
       <w:r>
         <w:t xml:space="preserve"> </w:t>
@@ -9721,17 +9456,11 @@
         <w:t xml:space="preserve"> </w:t>
       </w:r>
       <w:r>
-        <w:t xml:space="preserve">experience, flow, anaesthesia, coma). Seven theorems formalising</w:t>
-      </w:r>
-      <w:r>
-        <w:t xml:space="preserve"> </w:t>
-      </w:r>
-      <w:r>
-        <w:t xml:space="preserve">these patterns pass all automated tests.</w:t>
+        <w:t xml:space="preserve">experience, flow, anesthesia, coma).</w:t>
       </w:r>
     </w:p>
     <w:bookmarkEnd w:id="33"/>
-    <w:bookmarkStart w:id="50" w:name="sec:cosmo"/>
+    <w:bookmarkStart w:id="34" w:name="sec:cosmo"/>
     <w:p>
       <w:pPr>
         <w:pStyle w:val="Heading2"/>
@@ -9829,27 +9558,7 @@
         <w:t xml:space="preserve"> </w:t>
       </w:r>
       <w:r>
-        <w:t xml:space="preserve">drops</w:t>
-      </w:r>
-      <w:r>
-        <w:t xml:space="preserve"> </w:t>
-      </w:r>
-      <m:oMath>
-        <m:r>
-          <m:t>27</m:t>
-        </m:r>
-        <m:r>
-          <m:rPr>
-            <m:sty m:val="p"/>
-          </m:rPr>
-          <m:t>×</m:t>
-        </m:r>
-      </m:oMath>
-      <w:r>
-        <w:t xml:space="preserve"> </w:t>
-      </w:r>
-      <w:r>
-        <w:t xml:space="preserve">(from</w:t>
+        <w:t xml:space="preserve">drops by a factor of 27 (from</w:t>
       </w:r>
       <w:r>
         <w:t xml:space="preserve"> </w:t>
@@ -9876,7 +9585,13 @@
         <w:t xml:space="preserve"> </w:t>
       </w:r>
       <w:r>
-        <w:t xml:space="preserve">(0.583 to 0.649).</w:t>
+        <w:t xml:space="preserve">(from 0.583 to</w:t>
+      </w:r>
+      <w:r>
+        <w:t xml:space="preserve"> </w:t>
+      </w:r>
+      <w:r>
+        <w:t xml:space="preserve">0.649).</w:t>
       </w:r>
     </w:p>
     <w:p>
@@ -9884,36 +9599,39 @@
         <w:pStyle w:val="BodyText"/>
       </w:pPr>
       <w:r>
-        <w:t xml:space="preserve">The mechanism is identical to quark confinement: the cosmological</w:t>
-      </w:r>
-      <w:r>
-        <w:t xml:space="preserve"> </w:t>
-      </w:r>
-      <w:r>
-        <w:t xml:space="preserve">constant </w:t>
-      </w:r>
-      <m:oMath>
-        <m:r>
-          <m:t>Λ</m:t>
-        </m:r>
-      </m:oMath>
-      <w:r>
-        <w:t xml:space="preserve"> </w:t>
-      </w:r>
-      <w:r>
-        <w:t xml:space="preserve">acts as a near-dead channel in the</w:t>
-      </w:r>
-      <w:r>
-        <w:t xml:space="preserve"> </w:t>
-      </w:r>
-      <w:r>
-        <w:t xml:space="preserve">cosmological trace vector, suppressing the geometric mean while</w:t>
-      </w:r>
-      <w:r>
-        <w:t xml:space="preserve"> </w:t>
-      </w:r>
-      <w:r>
-        <w:t xml:space="preserve">preserving the arithmetic mean. The same mathematical</w:t>
+        <w:t xml:space="preserve">The mechanism is structurally identical to quark confinement:</w:t>
+      </w:r>
+      <w:r>
+        <w:t xml:space="preserve"> </w:t>
+      </w:r>
+      <w:r>
+        <w:t xml:space="preserve">when dark energy dominates, the matter-density and</w:t>
+      </w:r>
+      <w:r>
+        <w:t xml:space="preserve"> </w:t>
+      </w:r>
+      <w:r>
+        <w:t xml:space="preserve">radiation-density channels in the cosmological trace vector</w:t>
+      </w:r>
+      <w:r>
+        <w:t xml:space="preserve"> </w:t>
+      </w:r>
+      <w:r>
+        <w:t xml:space="preserve">approach </w:t>
+      </w:r>
+      <m:oMath>
+        <m:r>
+          <m:t>ε</m:t>
+        </m:r>
+      </m:oMath>
+      <w:r>
+        <w:t xml:space="preserve">, suppressing the geometric mean while preserving</w:t>
+      </w:r>
+      <w:r>
+        <w:t xml:space="preserve"> </w:t>
+      </w:r>
+      <w:r>
+        <w:t xml:space="preserve">the arithmetic mean. The same mathematical</w:t>
       </w:r>
       <w:r>
         <w:t xml:space="preserve"> </w:t>
@@ -10020,713 +9738,9 @@
         <w:t xml:space="preserve">identical frozen parameters throughout.</w:t>
       </w:r>
     </w:p>
-    <w:p>
-      <w:pPr>
-        <w:pStyle w:val="CaptionedFigure"/>
-      </w:pPr>
-      <w:bookmarkStart w:id="37" w:name="fig:cliff"/>
-      <w:r>
-        <w:drawing>
-          <wp:inline>
-            <wp:extent cx="4345693" cy="2094862"/>
-            <wp:effectExtent b="0" l="0" r="0" t="0"/>
-            <wp:docPr descr="The scale ladder of integrity. \mathrm{IC}/F (coherence efficiency) for 406 objects across six physical scales. The confinement cliff (fundamental \to composite: 23\times drop, red arrow) and atomic healing (composite \to atoms: 35\times recovery, green arrow) are the dominant cross-scale features. All scales obey the same kernel with identical frozen parameters." title="" id="35" name="Picture"/>
-            <a:graphic>
-              <a:graphicData uri="http://schemas.openxmlformats.org/drawingml/2006/picture">
-                <pic:pic>
-                  <pic:nvPicPr>
-                    <pic:cNvPr descr="figures/fig1_scale_ladder.png" id="36" name="Picture"/>
-                    <pic:cNvPicPr>
-                      <a:picLocks noChangeArrowheads="1" noChangeAspect="1"/>
-                    </pic:cNvPicPr>
-                  </pic:nvPicPr>
-                  <pic:blipFill>
-                    <a:blip r:embed="rId34"/>
-                    <a:stretch>
-                      <a:fillRect/>
-                    </a:stretch>
-                  </pic:blipFill>
-                  <pic:spPr bwMode="auto">
-                    <a:xfrm>
-                      <a:off x="0" y="0"/>
-                      <a:ext cx="4345693" cy="2094862"/>
-                    </a:xfrm>
-                    <a:prstGeom prst="rect">
-                      <a:avLst/>
-                    </a:prstGeom>
-                    <a:noFill/>
-                    <a:ln w="9525">
-                      <a:noFill/>
-                      <a:headEnd/>
-                      <a:tailEnd/>
-                    </a:ln>
-                  </pic:spPr>
-                </pic:pic>
-              </a:graphicData>
-            </a:graphic>
-          </wp:inline>
-        </w:drawing>
-      </w:r>
-      <w:bookmarkEnd w:id="37"/>
-    </w:p>
-    <w:p>
-      <w:pPr>
-        <w:pStyle w:val="ImageCaption"/>
-      </w:pPr>
-      <w:r>
-        <w:rPr>
-          <w:bCs/>
-          <w:b/>
-        </w:rPr>
-        <w:t xml:space="preserve">The scale ladder of integrity.</w:t>
-      </w:r>
-      <w:r>
-        <w:t xml:space="preserve"> </w:t>
-      </w:r>
-      <m:oMath>
-        <m:r>
-          <m:rPr>
-            <m:sty m:val="p"/>
-          </m:rPr>
-          <m:t>I</m:t>
-        </m:r>
-        <m:r>
-          <m:rPr>
-            <m:sty m:val="p"/>
-          </m:rPr>
-          <m:t>C</m:t>
-        </m:r>
-        <m:r>
-          <m:rPr>
-            <m:sty m:val="p"/>
-          </m:rPr>
-          <m:t>/</m:t>
-        </m:r>
-        <m:r>
-          <m:t>F</m:t>
-        </m:r>
-      </m:oMath>
-      <w:r>
-        <w:t xml:space="preserve"> </w:t>
-      </w:r>
-      <w:r>
-        <w:t xml:space="preserve">(coherence</w:t>
-      </w:r>
-      <w:r>
-        <w:t xml:space="preserve"> </w:t>
-      </w:r>
-      <w:r>
-        <w:t xml:space="preserve">efficiency) for 406 objects across six physical scales. The</w:t>
-      </w:r>
-      <w:r>
-        <w:t xml:space="preserve"> </w:t>
-      </w:r>
-      <w:r>
-        <w:t xml:space="preserve">confinement cliff (fundamental</w:t>
-      </w:r>
-      <w:r>
-        <w:t xml:space="preserve"> </w:t>
-      </w:r>
-      <m:oMath>
-        <m:r>
-          <m:rPr>
-            <m:sty m:val="p"/>
-          </m:rPr>
-          <m:t>→</m:t>
-        </m:r>
-      </m:oMath>
-      <w:r>
-        <w:t xml:space="preserve"> </w:t>
-      </w:r>
-      <w:r>
-        <w:t xml:space="preserve">composite:</w:t>
-      </w:r>
-      <w:r>
-        <w:t xml:space="preserve"> </w:t>
-      </w:r>
-      <m:oMath>
-        <m:r>
-          <m:t>23</m:t>
-        </m:r>
-        <m:r>
-          <m:rPr>
-            <m:sty m:val="p"/>
-          </m:rPr>
-          <m:t>×</m:t>
-        </m:r>
-      </m:oMath>
-      <w:r>
-        <w:t xml:space="preserve"> </w:t>
-      </w:r>
-      <w:r>
-        <w:t xml:space="preserve">drop,</w:t>
-      </w:r>
-      <w:r>
-        <w:t xml:space="preserve"> </w:t>
-      </w:r>
-      <w:r>
-        <w:t xml:space="preserve">red arrow) and atomic healing (composite</w:t>
-      </w:r>
-      <w:r>
-        <w:t xml:space="preserve"> </w:t>
-      </w:r>
-      <m:oMath>
-        <m:r>
-          <m:rPr>
-            <m:sty m:val="p"/>
-          </m:rPr>
-          <m:t>→</m:t>
-        </m:r>
-      </m:oMath>
-      <w:r>
-        <w:t xml:space="preserve"> </w:t>
-      </w:r>
-      <w:r>
-        <w:t xml:space="preserve">atoms:</w:t>
-      </w:r>
-      <w:r>
-        <w:t xml:space="preserve"> </w:t>
-      </w:r>
-      <m:oMath>
-        <m:r>
-          <m:t>35</m:t>
-        </m:r>
-        <m:r>
-          <m:rPr>
-            <m:sty m:val="p"/>
-          </m:rPr>
-          <m:t>×</m:t>
-        </m:r>
-      </m:oMath>
-      <w:r>
-        <w:t xml:space="preserve"> </w:t>
-      </w:r>
-      <w:r>
-        <w:t xml:space="preserve">recovery, green arrow) are the dominant cross-scale features. All</w:t>
-      </w:r>
-      <w:r>
-        <w:t xml:space="preserve"> </w:t>
-      </w:r>
-      <w:r>
-        <w:t xml:space="preserve">scales obey the same kernel with identical frozen parameters.</w:t>
-      </w:r>
-    </w:p>
-    <w:p>
-      <w:pPr>
-        <w:pStyle w:val="CaptionedFigure"/>
-      </w:pPr>
-      <w:bookmarkStart w:id="41" w:name="fig:slaughter"/>
-      <w:r>
-        <w:drawing>
-          <wp:inline>
-            <wp:extent cx="4464963" cy="1929720"/>
-            <wp:effectExtent b="0" l="0" r="0" t="0"/>
-            <wp:docPr descr="Geometric slaughter. As channels die (c_k \to \varepsilon= 10^{-8}), fidelity F (arithmetic mean, blue squares) degrades linearly while \mathrm{IC} (geometric mean, red circles) collapses super-exponentially. One dead channel in an 8-channel system reduces \mathrm{IC}/F from 1.0 to 0.114—an order of magnitude lost from a single channel death. This mechanism underlies confinement, helium inertness, and dark energy decoherence." title="" id="39" name="Picture"/>
-            <a:graphic>
-              <a:graphicData uri="http://schemas.openxmlformats.org/drawingml/2006/picture">
-                <pic:pic>
-                  <pic:nvPicPr>
-                    <pic:cNvPr descr="figures/fig2_geometric_slaughter.png" id="40" name="Picture"/>
-                    <pic:cNvPicPr>
-                      <a:picLocks noChangeArrowheads="1" noChangeAspect="1"/>
-                    </pic:cNvPicPr>
-                  </pic:nvPicPr>
-                  <pic:blipFill>
-                    <a:blip r:embed="rId38"/>
-                    <a:stretch>
-                      <a:fillRect/>
-                    </a:stretch>
-                  </pic:blipFill>
-                  <pic:spPr bwMode="auto">
-                    <a:xfrm>
-                      <a:off x="0" y="0"/>
-                      <a:ext cx="4464963" cy="1929720"/>
-                    </a:xfrm>
-                    <a:prstGeom prst="rect">
-                      <a:avLst/>
-                    </a:prstGeom>
-                    <a:noFill/>
-                    <a:ln w="9525">
-                      <a:noFill/>
-                      <a:headEnd/>
-                      <a:tailEnd/>
-                    </a:ln>
-                  </pic:spPr>
-                </pic:pic>
-              </a:graphicData>
-            </a:graphic>
-          </wp:inline>
-        </w:drawing>
-      </w:r>
-      <w:bookmarkEnd w:id="41"/>
-    </w:p>
-    <w:p>
-      <w:pPr>
-        <w:pStyle w:val="ImageCaption"/>
-      </w:pPr>
-      <w:r>
-        <w:rPr>
-          <w:bCs/>
-          <w:b/>
-        </w:rPr>
-        <w:t xml:space="preserve">Geometric slaughter.</w:t>
-      </w:r>
-      <w:r>
-        <w:t xml:space="preserve"> </w:t>
-      </w:r>
-      <w:r>
-        <w:t xml:space="preserve">As channels die</w:t>
-      </w:r>
-      <w:r>
-        <w:t xml:space="preserve"> </w:t>
-      </w:r>
-      <w:r>
-        <w:t xml:space="preserve">(</w:t>
-      </w:r>
-      <m:oMath>
-        <m:sSub>
-          <m:e>
-            <m:r>
-              <m:t>c</m:t>
-            </m:r>
-          </m:e>
-          <m:sub>
-            <m:r>
-              <m:t>k</m:t>
-            </m:r>
-          </m:sub>
-        </m:sSub>
-        <m:r>
-          <m:rPr>
-            <m:sty m:val="p"/>
-          </m:rPr>
-          <m:t>→</m:t>
-        </m:r>
-        <m:r>
-          <m:t>ε</m:t>
-        </m:r>
-        <m:r>
-          <m:rPr>
-            <m:sty m:val="p"/>
-          </m:rPr>
-          <m:t>=</m:t>
-        </m:r>
-        <m:sSup>
-          <m:e>
-            <m:r>
-              <m:t>10</m:t>
-            </m:r>
-          </m:e>
-          <m:sup>
-            <m:r>
-              <m:rPr>
-                <m:sty m:val="p"/>
-              </m:rPr>
-              <m:t>−</m:t>
-            </m:r>
-            <m:r>
-              <m:t>8</m:t>
-            </m:r>
-          </m:sup>
-        </m:sSup>
-      </m:oMath>
-      <w:r>
-        <w:t xml:space="preserve">), fidelity </w:t>
-      </w:r>
-      <m:oMath>
-        <m:r>
-          <m:t>F</m:t>
-        </m:r>
-      </m:oMath>
-      <w:r>
-        <w:t xml:space="preserve"> </w:t>
-      </w:r>
-      <w:r>
-        <w:t xml:space="preserve">(arithmetic mean,</w:t>
-      </w:r>
-      <w:r>
-        <w:t xml:space="preserve"> </w:t>
-      </w:r>
-      <w:r>
-        <w:t xml:space="preserve">blue squares) degrades linearly while</w:t>
-      </w:r>
-      <w:r>
-        <w:t xml:space="preserve"> </w:t>
-      </w:r>
-      <m:oMath>
-        <m:r>
-          <m:rPr>
-            <m:sty m:val="p"/>
-          </m:rPr>
-          <m:t>I</m:t>
-        </m:r>
-        <m:r>
-          <m:rPr>
-            <m:sty m:val="p"/>
-          </m:rPr>
-          <m:t>C</m:t>
-        </m:r>
-      </m:oMath>
-      <w:r>
-        <w:t xml:space="preserve"> </w:t>
-      </w:r>
-      <w:r>
-        <w:t xml:space="preserve">(geometric mean,</w:t>
-      </w:r>
-      <w:r>
-        <w:t xml:space="preserve"> </w:t>
-      </w:r>
-      <w:r>
-        <w:t xml:space="preserve">red circles) collapses super-exponentially. One dead channel in an</w:t>
-      </w:r>
-      <w:r>
-        <w:t xml:space="preserve"> </w:t>
-      </w:r>
-      <w:r>
-        <w:t xml:space="preserve">8-channel system reduces</w:t>
-      </w:r>
-      <w:r>
-        <w:t xml:space="preserve"> </w:t>
-      </w:r>
-      <m:oMath>
-        <m:r>
-          <m:rPr>
-            <m:sty m:val="p"/>
-          </m:rPr>
-          <m:t>I</m:t>
-        </m:r>
-        <m:r>
-          <m:rPr>
-            <m:sty m:val="p"/>
-          </m:rPr>
-          <m:t>C</m:t>
-        </m:r>
-        <m:r>
-          <m:rPr>
-            <m:sty m:val="p"/>
-          </m:rPr>
-          <m:t>/</m:t>
-        </m:r>
-        <m:r>
-          <m:t>F</m:t>
-        </m:r>
-      </m:oMath>
-      <w:r>
-        <w:t xml:space="preserve"> </w:t>
-      </w:r>
-      <w:r>
-        <w:t xml:space="preserve">from 1.0 to 0.114—an order of</w:t>
-      </w:r>
-      <w:r>
-        <w:t xml:space="preserve"> </w:t>
-      </w:r>
-      <w:r>
-        <w:t xml:space="preserve">magnitude lost from a single channel death. This mechanism underlies</w:t>
-      </w:r>
-      <w:r>
-        <w:t xml:space="preserve"> </w:t>
-      </w:r>
-      <w:r>
-        <w:t xml:space="preserve">confinement, helium inertness, and dark energy decoherence.</w:t>
-      </w:r>
-    </w:p>
-    <w:p>
-      <w:pPr>
-        <w:pStyle w:val="CaptionedFigure"/>
-      </w:pPr>
-      <w:bookmarkStart w:id="45" w:name="fig:periodic"/>
-      <w:r>
-        <w:drawing>
-          <wp:inline>
-            <wp:extent cx="4480254" cy="1896080"/>
-            <wp:effectExtent b="0" l="0" r="0" t="0"/>
-            <wp:docPr descr="Periodic kernel. \mathrm{IC}/F for all 118 elements. Noble gases (red labels) appear as coherence minima due to near-zero reactivity channels, reproducing the biological intuition of inertness as a structural property. The d-block peak (Ni at \mathrm{IC}/F = 0.957) reflects maximum channel balance. Period 1 (H, He) remains near-hadron coherence levels." title="" id="43" name="Picture"/>
-            <a:graphic>
-              <a:graphicData uri="http://schemas.openxmlformats.org/drawingml/2006/picture">
-                <pic:pic>
-                  <pic:nvPicPr>
-                    <pic:cNvPr descr="figures/fig3_periodic_kernel.png" id="44" name="Picture"/>
-                    <pic:cNvPicPr>
-                      <a:picLocks noChangeArrowheads="1" noChangeAspect="1"/>
-                    </pic:cNvPicPr>
-                  </pic:nvPicPr>
-                  <pic:blipFill>
-                    <a:blip r:embed="rId42"/>
-                    <a:stretch>
-                      <a:fillRect/>
-                    </a:stretch>
-                  </pic:blipFill>
-                  <pic:spPr bwMode="auto">
-                    <a:xfrm>
-                      <a:off x="0" y="0"/>
-                      <a:ext cx="4480254" cy="1896080"/>
-                    </a:xfrm>
-                    <a:prstGeom prst="rect">
-                      <a:avLst/>
-                    </a:prstGeom>
-                    <a:noFill/>
-                    <a:ln w="9525">
-                      <a:noFill/>
-                      <a:headEnd/>
-                      <a:tailEnd/>
-                    </a:ln>
-                  </pic:spPr>
-                </pic:pic>
-              </a:graphicData>
-            </a:graphic>
-          </wp:inline>
-        </w:drawing>
-      </w:r>
-      <w:bookmarkEnd w:id="45"/>
-    </w:p>
-    <w:p>
-      <w:pPr>
-        <w:pStyle w:val="ImageCaption"/>
-      </w:pPr>
-      <w:r>
-        <w:rPr>
-          <w:bCs/>
-          <w:b/>
-        </w:rPr>
-        <w:t xml:space="preserve">Periodic kernel.</w:t>
-      </w:r>
-      <w:r>
-        <w:t xml:space="preserve"> </w:t>
-      </w:r>
-      <m:oMath>
-        <m:r>
-          <m:rPr>
-            <m:sty m:val="p"/>
-          </m:rPr>
-          <m:t>I</m:t>
-        </m:r>
-        <m:r>
-          <m:rPr>
-            <m:sty m:val="p"/>
-          </m:rPr>
-          <m:t>C</m:t>
-        </m:r>
-        <m:r>
-          <m:rPr>
-            <m:sty m:val="p"/>
-          </m:rPr>
-          <m:t>/</m:t>
-        </m:r>
-        <m:r>
-          <m:t>F</m:t>
-        </m:r>
-      </m:oMath>
-      <w:r>
-        <w:t xml:space="preserve"> </w:t>
-      </w:r>
-      <w:r>
-        <w:t xml:space="preserve">for all 118 elements.</w:t>
-      </w:r>
-      <w:r>
-        <w:t xml:space="preserve"> </w:t>
-      </w:r>
-      <w:r>
-        <w:t xml:space="preserve">Noble gases (red labels) appear as coherence minima due to</w:t>
-      </w:r>
-      <w:r>
-        <w:t xml:space="preserve"> </w:t>
-      </w:r>
-      <w:r>
-        <w:t xml:space="preserve">near-zero reactivity channels, reproducing the biological intuition</w:t>
-      </w:r>
-      <w:r>
-        <w:t xml:space="preserve"> </w:t>
-      </w:r>
-      <w:r>
-        <w:t xml:space="preserve">of inertness as a</w:t>
-      </w:r>
-      <w:r>
-        <w:t xml:space="preserve"> </w:t>
-      </w:r>
-      <w:r>
-        <w:rPr>
-          <w:iCs/>
-          <w:i/>
-        </w:rPr>
-        <w:t xml:space="preserve">structural</w:t>
-      </w:r>
-      <w:r>
-        <w:t xml:space="preserve"> </w:t>
-      </w:r>
-      <w:r>
-        <w:t xml:space="preserve">property. The d-block peak</w:t>
-      </w:r>
-      <w:r>
-        <w:t xml:space="preserve"> </w:t>
-      </w:r>
-      <w:r>
-        <w:t xml:space="preserve">(Ni at</w:t>
-      </w:r>
-      <w:r>
-        <w:t xml:space="preserve"> </w:t>
-      </w:r>
-      <m:oMath>
-        <m:r>
-          <m:rPr>
-            <m:sty m:val="p"/>
-          </m:rPr>
-          <m:t>I</m:t>
-        </m:r>
-        <m:r>
-          <m:rPr>
-            <m:sty m:val="p"/>
-          </m:rPr>
-          <m:t>C</m:t>
-        </m:r>
-        <m:r>
-          <m:rPr>
-            <m:sty m:val="p"/>
-          </m:rPr>
-          <m:t>/</m:t>
-        </m:r>
-        <m:r>
-          <m:t>F</m:t>
-        </m:r>
-        <m:r>
-          <m:rPr>
-            <m:sty m:val="p"/>
-          </m:rPr>
-          <m:t>=</m:t>
-        </m:r>
-        <m:r>
-          <m:t>0.957</m:t>
-        </m:r>
-      </m:oMath>
-      <w:r>
-        <w:t xml:space="preserve">) reflects maximum channel balance.</w:t>
-      </w:r>
-      <w:r>
-        <w:t xml:space="preserve"> </w:t>
-      </w:r>
-      <w:r>
-        <w:t xml:space="preserve">Period 1 (H, He) remains near-hadron coherence levels.</w:t>
-      </w:r>
-    </w:p>
-    <w:p>
-      <w:pPr>
-        <w:pStyle w:val="CaptionedFigure"/>
-      </w:pPr>
-      <w:bookmarkStart w:id="49" w:name="fig:crossscale"/>
-      <w:r>
-        <w:drawing>
-          <wp:inline>
-            <wp:extent cx="4345693" cy="1902196"/>
-            <wp:effectExtent b="0" l="0" r="0" t="0"/>
-            <wp:docPr descr="Cross-scale integrity profile. \mathrm{IC}/F across 61 orders of magnitude. The non-monotonic structure—with a sharp minimum at the hadron scale and recovery at the atomic scale—is the central cross-scale phenomenon. The same kernel with identical frozen parameters produces all data points. Dashed line guides the eye." title="" id="47" name="Picture"/>
-            <a:graphic>
-              <a:graphicData uri="http://schemas.openxmlformats.org/drawingml/2006/picture">
-                <pic:pic>
-                  <pic:nvPicPr>
-                    <pic:cNvPr descr="figures/fig4_crossscale.png" id="48" name="Picture"/>
-                    <pic:cNvPicPr>
-                      <a:picLocks noChangeArrowheads="1" noChangeAspect="1"/>
-                    </pic:cNvPicPr>
-                  </pic:nvPicPr>
-                  <pic:blipFill>
-                    <a:blip r:embed="rId46"/>
-                    <a:stretch>
-                      <a:fillRect/>
-                    </a:stretch>
-                  </pic:blipFill>
-                  <pic:spPr bwMode="auto">
-                    <a:xfrm>
-                      <a:off x="0" y="0"/>
-                      <a:ext cx="4345693" cy="1902196"/>
-                    </a:xfrm>
-                    <a:prstGeom prst="rect">
-                      <a:avLst/>
-                    </a:prstGeom>
-                    <a:noFill/>
-                    <a:ln w="9525">
-                      <a:noFill/>
-                      <a:headEnd/>
-                      <a:tailEnd/>
-                    </a:ln>
-                  </pic:spPr>
-                </pic:pic>
-              </a:graphicData>
-            </a:graphic>
-          </wp:inline>
-        </w:drawing>
-      </w:r>
-      <w:bookmarkEnd w:id="49"/>
-    </w:p>
-    <w:p>
-      <w:pPr>
-        <w:pStyle w:val="ImageCaption"/>
-      </w:pPr>
-      <w:r>
-        <w:rPr>
-          <w:bCs/>
-          <w:b/>
-        </w:rPr>
-        <w:t xml:space="preserve">Cross-scale integrity profile.</w:t>
-      </w:r>
-      <w:r>
-        <w:t xml:space="preserve"> </w:t>
-      </w:r>
-      <m:oMath>
-        <m:r>
-          <m:rPr>
-            <m:sty m:val="p"/>
-          </m:rPr>
-          <m:t>I</m:t>
-        </m:r>
-        <m:r>
-          <m:rPr>
-            <m:sty m:val="p"/>
-          </m:rPr>
-          <m:t>C</m:t>
-        </m:r>
-        <m:r>
-          <m:rPr>
-            <m:sty m:val="p"/>
-          </m:rPr>
-          <m:t>/</m:t>
-        </m:r>
-        <m:r>
-          <m:t>F</m:t>
-        </m:r>
-      </m:oMath>
-      <w:r>
-        <w:t xml:space="preserve"> </w:t>
-      </w:r>
-      <w:r>
-        <w:t xml:space="preserve">across</w:t>
-      </w:r>
-      <w:r>
-        <w:t xml:space="preserve"> </w:t>
-      </w:r>
-      <w:r>
-        <w:t xml:space="preserve">61 orders of magnitude. The non-monotonic structure—with a sharp</w:t>
-      </w:r>
-      <w:r>
-        <w:t xml:space="preserve"> </w:t>
-      </w:r>
-      <w:r>
-        <w:t xml:space="preserve">minimum at the hadron scale and recovery at the atomic scale—is the</w:t>
-      </w:r>
-      <w:r>
-        <w:t xml:space="preserve"> </w:t>
-      </w:r>
-      <w:r>
-        <w:t xml:space="preserve">central cross-scale phenomenon. The same kernel with identical frozen</w:t>
-      </w:r>
-      <w:r>
-        <w:t xml:space="preserve"> </w:t>
-      </w:r>
-      <w:r>
-        <w:t xml:space="preserve">parameters produces all data points. Dashed line guides the eye.</w:t>
-      </w:r>
-    </w:p>
-    <w:bookmarkEnd w:id="50"/>
-    <w:bookmarkEnd w:id="51"/>
-    <w:bookmarkStart w:id="59" w:name="discussion"/>
+    <w:bookmarkEnd w:id="34"/>
+    <w:bookmarkEnd w:id="35"/>
+    <w:bookmarkStart w:id="43" w:name="discussion"/>
     <w:p>
       <w:pPr>
         <w:pStyle w:val="Heading1"/>
@@ -10735,7 +9749,7 @@
         <w:t xml:space="preserve">Discussion</w:t>
       </w:r>
     </w:p>
-    <w:bookmarkStart w:id="52" w:name="X33af143ec7173ae7d909346935ca46d3f00851d"/>
+    <w:bookmarkStart w:id="36" w:name="X33af143ec7173ae7d909346935ca46d3f00851d"/>
     <w:p>
       <w:pPr>
         <w:pStyle w:val="Heading2"/>
@@ -10860,7 +9874,7 @@
           <w:rPr>
             <w:rStyle w:val="Hyperlink"/>
           </w:rPr>
-          <w:t xml:space="preserve">2</w:t>
+          <w:t xml:space="preserve">[fig:slaughter]</w:t>
         </w:r>
       </w:hyperlink>
       <w:r>
@@ -11214,12 +10228,6 @@
         <w:t xml:space="preserve">distance </w:t>
       </w:r>
       <w:r>
-        <w:rPr>
-          <w:vertAlign w:val="superscript"/>
-        </w:rPr>
-        <w:t xml:space="preserve">12</w:t>
-      </w:r>
-      <w:r>
         <w:t xml:space="preserve">. This makes</w:t>
       </w:r>
       <w:r>
@@ -11243,8 +10251,8 @@
         <w:t xml:space="preserve">instrument for quantitative cross-scale comparison.</w:t>
       </w:r>
     </w:p>
-    <w:bookmarkEnd w:id="52"/>
-    <w:bookmarkStart w:id="53" w:name="structural-rarity-of-stability"/>
+    <w:bookmarkEnd w:id="36"/>
+    <w:bookmarkStart w:id="37" w:name="structural-rarity-of-stability"/>
     <w:p>
       <w:pPr>
         <w:pStyle w:val="Heading2"/>
@@ -11264,13 +10272,19 @@
         <w:t xml:space="preserve"> </w:t>
       </w:r>
       <w:r>
-        <w:t xml:space="preserve">gates—Stable: 12.5%, Watch: 24.4%, Collapse: 63.1% of the</w:t>
-      </w:r>
-      <w:r>
-        <w:t xml:space="preserve"> </w:t>
-      </w:r>
-      <w:r>
-        <w:t xml:space="preserve">Fisher parameter space (computed by uniform sampling of</w:t>
+        <w:t xml:space="preserve">gates partitions the Fisher parameter space into</w:t>
+      </w:r>
+      <w:r>
+        <w:t xml:space="preserve"> </w:t>
+      </w:r>
+      <w:r>
+        <w:t xml:space="preserve">Stable (12.5%), Watch (24.4%), and Collapse (63.1%),</w:t>
+      </w:r>
+      <w:r>
+        <w:t xml:space="preserve"> </w:t>
+      </w:r>
+      <w:r>
+        <w:t xml:space="preserve">computed by uniform sampling of</w:t>
       </w:r>
       <w:r>
         <w:t xml:space="preserve"> </w:t>
@@ -11362,19 +10376,13 @@
         <w:t xml:space="preserve"> </w:t>
       </w:r>
       <w:r>
-        <w:t xml:space="preserve">and classifying each</w:t>
-      </w:r>
-      <w:r>
-        <w:t xml:space="preserve"> </w:t>
-      </w:r>
-      <w:r>
-        <w:t xml:space="preserve">by the four-gate criterion)—carries an implication for fundamental</w:t>
-      </w:r>
-      <w:r>
-        <w:t xml:space="preserve"> </w:t>
-      </w:r>
-      <w:r>
-        <w:t xml:space="preserve">physics:</w:t>
+        <w:t xml:space="preserve">and classifying each by the</w:t>
+      </w:r>
+      <w:r>
+        <w:t xml:space="preserve"> </w:t>
+      </w:r>
+      <w:r>
+        <w:t xml:space="preserve">four-gate criterion. This carries an implication:</w:t>
       </w:r>
       <w:r>
         <w:t xml:space="preserve"> </w:t>
@@ -11384,16 +10392,39 @@
           <w:iCs/>
           <w:i/>
         </w:rPr>
-        <w:t xml:space="preserve">stability is structurally rare</w:t>
-      </w:r>
-      <w:r>
-        <w:t xml:space="preserve">. The Stable regime</w:t>
-      </w:r>
-      <w:r>
-        <w:t xml:space="preserve"> </w:t>
-      </w:r>
-      <w:r>
-        <w:t xml:space="preserve">requires the conjunction of four conditions (</w:t>
+        <w:t xml:space="preserve">stability</w:t>
+      </w:r>
+      <w:r>
+        <w:rPr>
+          <w:iCs/>
+          <w:i/>
+        </w:rPr>
+        <w:t xml:space="preserve"> </w:t>
+      </w:r>
+      <w:r>
+        <w:rPr>
+          <w:iCs/>
+          <w:i/>
+        </w:rPr>
+        <w:t xml:space="preserve">is structurally rare</w:t>
+      </w:r>
+      <w:r>
+        <w:t xml:space="preserve"> </w:t>
+      </w:r>
+      <w:r>
+        <w:t xml:space="preserve">in the admissible parameter space. The</w:t>
+      </w:r>
+      <w:r>
+        <w:t xml:space="preserve"> </w:t>
+      </w:r>
+      <w:r>
+        <w:t xml:space="preserve">Stable regime requires the conjunction of four conditions</w:t>
+      </w:r>
+      <w:r>
+        <w:t xml:space="preserve"> </w:t>
+      </w:r>
+      <w:r>
+        <w:t xml:space="preserve">(</w:t>
       </w:r>
       <m:oMath>
         <m:r>
@@ -11470,35 +10501,63 @@
         </m:r>
       </m:oMath>
       <w:r>
-        <w:t xml:space="preserve">), and only 12.5% of the</w:t>
-      </w:r>
-      <w:r>
-        <w:t xml:space="preserve"> </w:t>
-      </w:r>
-      <w:r>
-        <w:t xml:space="preserve">admissible parameter space satisfies all four simultaneously. This is</w:t>
-      </w:r>
-      <w:r>
-        <w:t xml:space="preserve"> </w:t>
-      </w:r>
-      <w:r>
-        <w:t xml:space="preserve">consonant with the observation that matter in the universe is</w:t>
-      </w:r>
-      <w:r>
-        <w:t xml:space="preserve"> </w:t>
-      </w:r>
-      <w:r>
-        <w:t xml:space="preserve">overwhelmingly in disordered or transitional states; localised</w:t>
-      </w:r>
-      <w:r>
-        <w:t xml:space="preserve"> </w:t>
-      </w:r>
-      <w:r>
-        <w:t xml:space="preserve">structure occupies a narrow band of the available phase space.</w:t>
+        <w:t xml:space="preserve">), and only</w:t>
+      </w:r>
+      <w:r>
+        <w:t xml:space="preserve"> </w:t>
+      </w:r>
+      <w:r>
+        <w:t xml:space="preserve">12.5% of the admissible parameter space satisfies all four</w:t>
+      </w:r>
+      <w:r>
+        <w:t xml:space="preserve"> </w:t>
+      </w:r>
+      <w:r>
+        <w:t xml:space="preserve">simultaneously. While the physical distribution of systems need not</w:t>
+      </w:r>
+      <w:r>
+        <w:t xml:space="preserve"> </w:t>
+      </w:r>
+      <w:r>
+        <w:t xml:space="preserve">be uniform in this space, the result indicates that stability</w:t>
+      </w:r>
+      <w:r>
+        <w:t xml:space="preserve"> </w:t>
+      </w:r>
+      <w:r>
+        <w:t xml:space="preserve">requires</w:t>
+      </w:r>
+      <w:r>
+        <w:t xml:space="preserve"> </w:t>
+      </w:r>
+      <w:r>
+        <w:rPr>
+          <w:iCs/>
+          <w:i/>
+        </w:rPr>
+        <w:t xml:space="preserve">simultaneous</w:t>
+      </w:r>
+      <w:r>
+        <w:t xml:space="preserve"> </w:t>
+      </w:r>
+      <w:r>
+        <w:t xml:space="preserve">satisfaction of multiple conditions, a</w:t>
+      </w:r>
+      <w:r>
+        <w:t xml:space="preserve"> </w:t>
+      </w:r>
+      <w:r>
+        <w:t xml:space="preserve">constraint consistent with the observation that ordered structure</w:t>
+      </w:r>
+      <w:r>
+        <w:t xml:space="preserve"> </w:t>
+      </w:r>
+      <w:r>
+        <w:t xml:space="preserve">occupies a narrow region of the available phase space.</w:t>
       </w:r>
     </w:p>
-    <w:bookmarkEnd w:id="53"/>
-    <w:bookmarkStart w:id="54" w:name="testable-predictions"/>
+    <w:bookmarkEnd w:id="37"/>
+    <w:bookmarkStart w:id="38" w:name="testable-predictions"/>
     <w:p>
       <w:pPr>
         <w:pStyle w:val="Heading2"/>
@@ -11539,7 +10598,7 @@
         <w:t xml:space="preserve"> </w:t>
       </w:r>
       <w:r>
-        <w:t xml:space="preserve">Lattice simulations that resolve per-flavour condensates</w:t>
+        <w:t xml:space="preserve">Lattice simulations that resolve per-flavor condensates</w:t>
       </w:r>
       <w:r>
         <w:t xml:space="preserve"> </w:t>
@@ -11589,27 +10648,7 @@
         <w:t xml:space="preserve"> </w:t>
       </w:r>
       <w:r>
-        <w:t xml:space="preserve">temperature, consistent with the</w:t>
-      </w:r>
-      <w:r>
-        <w:t xml:space="preserve"> </w:t>
-      </w:r>
-      <m:oMath>
-        <m:r>
-          <m:t>23</m:t>
-        </m:r>
-        <m:r>
-          <m:rPr>
-            <m:sty m:val="p"/>
-          </m:rPr>
-          <m:t>×</m:t>
-        </m:r>
-      </m:oMath>
-      <w:r>
-        <w:t xml:space="preserve"> </w:t>
-      </w:r>
-      <w:r>
-        <w:t xml:space="preserve">cliff predicted</w:t>
+        <w:t xml:space="preserve">temperature, consistent with the 23-fold cliff predicted</w:t>
       </w:r>
       <w:r>
         <w:t xml:space="preserve"> </w:t>
@@ -11687,7 +10726,7 @@
           <w:rPr>
             <w:rStyle w:val="Hyperlink"/>
           </w:rPr>
-          <w:t xml:space="preserve">3</w:t>
+          <w:t xml:space="preserve">[fig:periodic]</w:t>
         </w:r>
       </w:hyperlink>
       <w:r>
@@ -11739,8 +10778,8 @@
         <w:t xml:space="preserve">earlier than the arithmetic mean.</w:t>
       </w:r>
     </w:p>
-    <w:bookmarkEnd w:id="54"/>
-    <w:bookmarkStart w:id="55" w:name="relationship-to-established-frameworks"/>
+    <w:bookmarkEnd w:id="38"/>
+    <w:bookmarkStart w:id="39" w:name="relationship-to-established-frameworks"/>
     <w:p>
       <w:pPr>
         <w:pStyle w:val="Heading2"/>
@@ -11760,13 +10799,13 @@
         <w:t xml:space="preserve"> </w:t>
       </w:r>
       <w:r>
-        <w:t xml:space="preserve">formalism incompatible with standard methods. The opposite is the</w:t>
-      </w:r>
-      <w:r>
-        <w:t xml:space="preserve"> </w:t>
-      </w:r>
-      <w:r>
-        <w:t xml:space="preserve">case: classical results emerge as</w:t>
+        <w:t xml:space="preserve">formalism incompatible with standard methods. On the contrary,</w:t>
+      </w:r>
+      <w:r>
+        <w:t xml:space="preserve"> </w:t>
+      </w:r>
+      <w:r>
+        <w:t xml:space="preserve">classical results emerge as</w:t>
       </w:r>
       <w:r>
         <w:t xml:space="preserve"> </w:t>
@@ -11916,25 +10955,19 @@
         <w:t xml:space="preserve"> </w:t>
       </w:r>
       <w:r>
-        <w:t xml:space="preserve">arithmetic). Stripping all structure</w:t>
-      </w:r>
-      <w:r>
-        <w:t xml:space="preserve"> </w:t>
-      </w:r>
-      <w:r>
-        <w:t xml:space="preserve">recovers the classical inequality of</w:t>
+        <w:t xml:space="preserve">arithmetic). Removing these structural</w:t>
+      </w:r>
+      <w:r>
+        <w:t xml:space="preserve"> </w:t>
+      </w:r>
+      <w:r>
+        <w:t xml:space="preserve">elements yields the classical inequality of</w:t>
       </w:r>
       <w:r>
         <w:t xml:space="preserve"> </w:t>
       </w:r>
       <w:r>
         <w:t xml:space="preserve">means </w:t>
-      </w:r>
-      <w:r>
-        <w:rPr>
-          <w:vertAlign w:val="superscript"/>
-        </w:rPr>
-        <w:t xml:space="preserve">9</w:t>
       </w:r>
       <w:r>
         <w:t xml:space="preserve">.</w:t>
@@ -12269,12 +11302,6 @@
         <w:t xml:space="preserve">only) </w:t>
       </w:r>
       <w:r>
-        <w:rPr>
-          <w:vertAlign w:val="superscript"/>
-        </w:rPr>
-        <w:t xml:space="preserve">3</w:t>
-      </w:r>
-      <w:r>
         <w:t xml:space="preserve">.</w:t>
       </w:r>
     </w:p>
@@ -12351,7 +11378,7 @@
         <w:t xml:space="preserve"> </w:t>
       </w:r>
       <w:r>
-        <w:t xml:space="preserve">instantiates the general structure</w:t>
+        <w:t xml:space="preserve">exemplifies the general structure</w:t>
       </w:r>
       <w:r>
         <w:t xml:space="preserve"> </w:t>
@@ -12369,19 +11396,19 @@
         <w:t xml:space="preserve"> </w:t>
       </w:r>
       <w:r>
-        <w:t xml:space="preserve">This structure appears in</w:t>
-      </w:r>
-      <w:r>
-        <w:t xml:space="preserve"> </w:t>
-      </w:r>
-      <w:r>
-        <w:t xml:space="preserve">fluctuation–dissipation relations (signal + dissipation = input)</w:t>
-      </w:r>
-      <w:r>
-        <w:t xml:space="preserve"> </w:t>
-      </w:r>
-      <w:r>
-        <w:t xml:space="preserve">and unitarity (</w:t>
+        <w:t xml:space="preserve">The same algebraic structure</w:t>
+      </w:r>
+      <w:r>
+        <w:t xml:space="preserve"> </w:t>
+      </w:r>
+      <w:r>
+        <w:t xml:space="preserve">appears in fluctuation–dissipation relations (signal +</w:t>
+      </w:r>
+      <w:r>
+        <w:t xml:space="preserve"> </w:t>
+      </w:r>
+      <w:r>
+        <w:t xml:space="preserve">dissipation = input) and unitarity (</w:t>
       </w:r>
       <m:oMath>
         <m:sSup>
@@ -12448,25 +11475,19 @@
         <w:t xml:space="preserve"> </w:t>
       </w:r>
       <w:r>
-        <w:t xml:space="preserve">for quantum</w:t>
-      </w:r>
-      <w:r>
-        <w:t xml:space="preserve"> </w:t>
-      </w:r>
-      <w:r>
-        <w:t xml:space="preserve">amplitudes). GCD does not derive these physical theorems;</w:t>
-      </w:r>
-      <w:r>
-        <w:t xml:space="preserve"> </w:t>
-      </w:r>
-      <w:r>
-        <w:t xml:space="preserve">rather, the duality identity shares their algebraic skeleton,</w:t>
-      </w:r>
-      <w:r>
-        <w:t xml:space="preserve"> </w:t>
-      </w:r>
-      <w:r>
-        <w:t xml:space="preserve">suggesting a common structural origin.</w:t>
+        <w:t xml:space="preserve">for quantum amplitudes). GCD does not derive these physical</w:t>
+      </w:r>
+      <w:r>
+        <w:t xml:space="preserve"> </w:t>
+      </w:r>
+      <w:r>
+        <w:t xml:space="preserve">theorems; rather, the duality identity shares their algebraic</w:t>
+      </w:r>
+      <w:r>
+        <w:t xml:space="preserve"> </w:t>
+      </w:r>
+      <w:r>
+        <w:t xml:space="preserve">skeleton, suggesting a common structural origin.</w:t>
       </w:r>
     </w:p>
     <w:p>
@@ -12589,25 +11610,19 @@
         <w:t xml:space="preserve"> </w:t>
       </w:r>
       <w:r>
-        <w:t xml:space="preserve">diagram; restricting to the neighbourhood of the transition</w:t>
-      </w:r>
-      <w:r>
-        <w:t xml:space="preserve"> </w:t>
-      </w:r>
-      <w:r>
-        <w:t xml:space="preserve">point recovers critical exponents from renormalization group</w:t>
-      </w:r>
-      <w:r>
-        <w:t xml:space="preserve"> </w:t>
-      </w:r>
-      <w:r>
-        <w:t xml:space="preserve">theory </w:t>
-      </w:r>
-      <w:r>
-        <w:rPr>
-          <w:vertAlign w:val="superscript"/>
-        </w:rPr>
-        <w:t xml:space="preserve">7</w:t>
+        <w:t xml:space="preserve">diagram; restricting to the neighborhood of the transition</w:t>
+      </w:r>
+      <w:r>
+        <w:t xml:space="preserve"> </w:t>
+      </w:r>
+      <w:r>
+        <w:t xml:space="preserve">point yields behavior consistent with critical slowing</w:t>
+      </w:r>
+      <w:r>
+        <w:t xml:space="preserve"> </w:t>
+      </w:r>
+      <w:r>
+        <w:t xml:space="preserve">from renormalization group theory </w:t>
       </w:r>
       <w:r>
         <w:t xml:space="preserve">.</w:t>
@@ -12681,16 +11696,10 @@
         <w:t xml:space="preserve">geometry </w:t>
       </w:r>
       <w:r>
-        <w:rPr>
-          <w:vertAlign w:val="superscript"/>
-        </w:rPr>
-        <w:t xml:space="preserve">13</w:t>
-      </w:r>
-      <w:r>
-        <w:t xml:space="preserve"> </w:t>
-      </w:r>
-      <w:r>
-        <w:t xml:space="preserve">characterises the Riemannian</w:t>
+        <w:t xml:space="preserve"> </w:t>
+      </w:r>
+      <w:r>
+        <w:t xml:space="preserve">characterizes the Riemannian</w:t>
       </w:r>
       <w:r>
         <w:t xml:space="preserve"> </w:t>
@@ -12781,8 +11790,8 @@
         <w:t xml:space="preserve">cosmological scales.</w:t>
       </w:r>
     </w:p>
-    <w:bookmarkEnd w:id="55"/>
-    <w:bookmarkStart w:id="56" w:name="cross-domain-translation-protocol"/>
+    <w:bookmarkEnd w:id="39"/>
+    <w:bookmarkStart w:id="40" w:name="cross-domain-translation-protocol"/>
     <w:p>
       <w:pPr>
         <w:pStyle w:val="Heading2"/>
@@ -13114,13 +12123,13 @@
         <w:t xml:space="preserve">“</w:t>
       </w:r>
       <w:r>
-        <w:t xml:space="preserve">dead</w:t>
-      </w:r>
-      <w:r>
-        <w:t xml:space="preserve"> </w:t>
-      </w:r>
-      <w:r>
-        <w:t xml:space="preserve">indexical coupling killing sign-chain closure.</w:t>
+        <w:t xml:space="preserve">loss of</w:t>
+      </w:r>
+      <w:r>
+        <w:t xml:space="preserve"> </w:t>
+      </w:r>
+      <w:r>
+        <w:t xml:space="preserve">referential grounding breaking the chain of interpretation.</w:t>
       </w:r>
       <w:r>
         <w:t xml:space="preserve">”</w:t>
@@ -13129,19 +12138,13 @@
         <w:t xml:space="preserve"> </w:t>
       </w:r>
       <w:r>
-        <w:t xml:space="preserve">All three</w:t>
-      </w:r>
-      <w:r>
-        <w:t xml:space="preserve"> </w:t>
-      </w:r>
-      <w:r>
-        <w:t xml:space="preserve">descriptions refer to the same invariant, the same number, and</w:t>
-      </w:r>
-      <w:r>
-        <w:t xml:space="preserve"> </w:t>
-      </w:r>
-      <w:r>
-        <w:t xml:space="preserve">the same ledger entry—they differ only in vocabulary.</w:t>
+        <w:t xml:space="preserve">All three descriptions refer to the same invariant, the same</w:t>
+      </w:r>
+      <w:r>
+        <w:t xml:space="preserve"> </w:t>
+      </w:r>
+      <w:r>
+        <w:t xml:space="preserve">number, and the same ledger entry—they differ only in vocabulary.</w:t>
       </w:r>
     </w:p>
     <w:p>
@@ -13149,7 +12152,7 @@
         <w:pStyle w:val="BodyText"/>
       </w:pPr>
       <w:r>
-        <w:t xml:space="preserve">This translation layer is itself formalised as one of the</w:t>
+        <w:t xml:space="preserve">This translation layer is itself formalized as one of the</w:t>
       </w:r>
       <w:r>
         <w:t xml:space="preserve"> </w:t>
@@ -13281,13 +12284,13 @@
         <w:t xml:space="preserve"> </w:t>
       </w:r>
       <w:r>
-        <w:t xml:space="preserve">framework can therefore analyse its own communicability as a</w:t>
-      </w:r>
-      <w:r>
-        <w:t xml:space="preserve"> </w:t>
-      </w:r>
-      <w:r>
-        <w:t xml:space="preserve">Tier-2 closure, a self-referential consistency check unavailable</w:t>
+        <w:t xml:space="preserve">framework can therefore analyze its own communicability as a</w:t>
+      </w:r>
+      <w:r>
+        <w:t xml:space="preserve"> </w:t>
+      </w:r>
+      <w:r>
+        <w:t xml:space="preserve">domain closure, a self-referential consistency check unavailable</w:t>
       </w:r>
       <w:r>
         <w:t xml:space="preserve"> </w:t>
@@ -13296,8 +12299,8 @@
         <w:t xml:space="preserve">to standard measurement theories.</w:t>
       </w:r>
     </w:p>
-    <w:bookmarkEnd w:id="56"/>
-    <w:bookmarkStart w:id="57" w:name="implications-for-measurement-theory"/>
+    <w:bookmarkEnd w:id="40"/>
+    <w:bookmarkStart w:id="41" w:name="implications-for-measurement-theory"/>
     <w:p>
       <w:pPr>
         <w:pStyle w:val="Heading2"/>
@@ -13311,7 +12314,7 @@
         <w:pStyle w:val="FirstParagraph"/>
       </w:pPr>
       <w:r>
-        <w:t xml:space="preserve">The framework constitutes a</w:t>
+        <w:t xml:space="preserve">The framework constitutes what we term a</w:t>
       </w:r>
       <w:r>
         <w:t xml:space="preserve"> </w:t>
@@ -13321,40 +12324,60 @@
           <w:iCs/>
           <w:i/>
         </w:rPr>
-        <w:t xml:space="preserve">cognitive equalizer</w:t>
-      </w:r>
-      <w:r>
-        <w:t xml:space="preserve">: because all</w:t>
-      </w:r>
-      <w:r>
-        <w:t xml:space="preserve"> </w:t>
-      </w:r>
-      <w:r>
-        <w:t xml:space="preserve">thresholds are frozen (not chosen by the analyst), all vocabulary is</w:t>
-      </w:r>
-      <w:r>
-        <w:t xml:space="preserve"> </w:t>
-      </w:r>
-      <w:r>
-        <w:t xml:space="preserve">operationally defined, and all verdicts are three-valued</w:t>
-      </w:r>
-      <w:r>
-        <w:t xml:space="preserve"> </w:t>
-      </w:r>
-      <w:r>
-        <w:t xml:space="preserve">(Conformant / Nonconformant / Non-Evaluable), two independent</w:t>
-      </w:r>
-      <w:r>
-        <w:t xml:space="preserve"> </w:t>
-      </w:r>
-      <w:r>
-        <w:t xml:space="preserve">analysts processing the same data under the same contract must</w:t>
-      </w:r>
-      <w:r>
-        <w:t xml:space="preserve"> </w:t>
-      </w:r>
-      <w:r>
-        <w:t xml:space="preserve">arrive at the same verdict. This removes agent-dependent variance</w:t>
+        <w:t xml:space="preserve">cognitive</w:t>
+      </w:r>
+      <w:r>
+        <w:rPr>
+          <w:iCs/>
+          <w:i/>
+        </w:rPr>
+        <w:t xml:space="preserve"> </w:t>
+      </w:r>
+      <w:r>
+        <w:rPr>
+          <w:iCs/>
+          <w:i/>
+        </w:rPr>
+        <w:t xml:space="preserve">equalizer</w:t>
+      </w:r>
+      <w:r>
+        <w:t xml:space="preserve">—a measurement system that eliminates</w:t>
+      </w:r>
+      <w:r>
+        <w:t xml:space="preserve"> </w:t>
+      </w:r>
+      <w:r>
+        <w:t xml:space="preserve">analyst-dependent variance: because all thresholds are frozen</w:t>
+      </w:r>
+      <w:r>
+        <w:t xml:space="preserve"> </w:t>
+      </w:r>
+      <w:r>
+        <w:t xml:space="preserve">(not chosen by the analyst), all vocabulary is operationally</w:t>
+      </w:r>
+      <w:r>
+        <w:t xml:space="preserve"> </w:t>
+      </w:r>
+      <w:r>
+        <w:t xml:space="preserve">defined, and all verdicts are three-valued (Conformant /</w:t>
+      </w:r>
+      <w:r>
+        <w:t xml:space="preserve"> </w:t>
+      </w:r>
+      <w:r>
+        <w:t xml:space="preserve">Nonconformant / Non-Evaluable), two independent analysts</w:t>
+      </w:r>
+      <w:r>
+        <w:t xml:space="preserve"> </w:t>
+      </w:r>
+      <w:r>
+        <w:t xml:space="preserve">processing the same data under the same contract must arrive</w:t>
+      </w:r>
+      <w:r>
+        <w:t xml:space="preserve"> </w:t>
+      </w:r>
+      <w:r>
+        <w:t xml:space="preserve">at the same verdict. This removes agent-dependent variance</w:t>
       </w:r>
       <w:r>
         <w:t xml:space="preserve"> </w:t>
@@ -13366,13 +12389,7 @@
         <w:t xml:space="preserve"> </w:t>
       </w:r>
       <w:r>
-        <w:t xml:space="preserve">information-geometric programme of Amari </w:t>
-      </w:r>
-      <w:r>
-        <w:rPr>
-          <w:vertAlign w:val="superscript"/>
-        </w:rPr>
-        <w:t xml:space="preserve">13</w:t>
+        <w:t xml:space="preserve">information-geometric program of Amari </w:t>
       </w:r>
       <w:r>
         <w:t xml:space="preserve"> </w:t>
@@ -13649,12 +12666,6 @@
         <w:t xml:space="preserve">is a Cardano root </w:t>
       </w:r>
       <w:r>
-        <w:rPr>
-          <w:vertAlign w:val="superscript"/>
-        </w:rPr>
-        <w:t xml:space="preserve">14</w:t>
-      </w:r>
-      <w:r>
         <w:t xml:space="preserve"> </w:t>
       </w:r>
       <w:r>
@@ -13708,8 +12719,8 @@
         <w:t xml:space="preserve">—a result with no adjustable parameters.</w:t>
       </w:r>
     </w:p>
-    <w:bookmarkEnd w:id="57"/>
-    <w:bookmarkStart w:id="58" w:name="X4c14539bcfdc5042915ac9327723019183d0048"/>
+    <w:bookmarkEnd w:id="41"/>
+    <w:bookmarkStart w:id="42" w:name="X4c14539bcfdc5042915ac9327723019183d0048"/>
     <w:p>
       <w:pPr>
         <w:pStyle w:val="Heading2"/>
@@ -13729,13 +12740,13 @@
         <w:t xml:space="preserve"> </w:t>
       </w:r>
       <w:r>
-        <w:t xml:space="preserve">limitation but the core of its reliability. Any measurement framework</w:t>
-      </w:r>
-      <w:r>
-        <w:t xml:space="preserve"> </w:t>
-      </w:r>
-      <w:r>
-        <w:t xml:space="preserve">that produces</w:t>
+        <w:t xml:space="preserve">limitation but the basis of its reliability. Any measurement</w:t>
+      </w:r>
+      <w:r>
+        <w:t xml:space="preserve"> </w:t>
+      </w:r>
+      <w:r>
+        <w:t xml:space="preserve">framework that produces</w:t>
       </w:r>
       <w:r>
         <w:t xml:space="preserve"> </w:t>
@@ -13753,25 +12764,25 @@
         <w:t xml:space="preserve"> </w:t>
       </w:r>
       <w:r>
-        <w:t xml:space="preserve">outputs regardless of input quality is not</w:t>
-      </w:r>
-      <w:r>
-        <w:t xml:space="preserve"> </w:t>
-      </w:r>
-      <w:r>
-        <w:t xml:space="preserve">measuring anything—it is fitting. The kernel’s strict</w:t>
-      </w:r>
-      <w:r>
-        <w:t xml:space="preserve"> </w:t>
-      </w:r>
-      <w:r>
-        <w:t xml:space="preserve">input–output contract enforces the opposite: accurate data in</w:t>
-      </w:r>
-      <w:r>
-        <w:t xml:space="preserve"> </w:t>
-      </w:r>
-      <w:r>
-        <w:t xml:space="preserve">produces accurate invariants out; inaccurate data produces</w:t>
+        <w:t xml:space="preserve">outputs regardless of input</w:t>
+      </w:r>
+      <w:r>
+        <w:t xml:space="preserve"> </w:t>
+      </w:r>
+      <w:r>
+        <w:t xml:space="preserve">quality is not measuring anything—it is fitting. The kernel’s</w:t>
+      </w:r>
+      <w:r>
+        <w:t xml:space="preserve"> </w:t>
+      </w:r>
+      <w:r>
+        <w:t xml:space="preserve">strict input–output contract enforces the opposite: accurate</w:t>
+      </w:r>
+      <w:r>
+        <w:t xml:space="preserve"> </w:t>
+      </w:r>
+      <w:r>
+        <w:t xml:space="preserve">inputs yield accurate invariants; inaccurate inputs yield</w:t>
       </w:r>
       <w:r>
         <w:t xml:space="preserve"> </w:t>
@@ -13963,43 +12974,7 @@
         <w:t xml:space="preserve"> </w:t>
       </w:r>
       <w:r>
-        <w:t xml:space="preserve">comparisons) is only as good as the channel selection. That the</w:t>
-      </w:r>
-      <w:r>
-        <w:t xml:space="preserve"> </w:t>
-      </w:r>
-      <w:r>
-        <w:t xml:space="preserve">kernel faithfully propagates input quality, rather than absorbing</w:t>
-      </w:r>
-      <w:r>
-        <w:t xml:space="preserve"> </w:t>
-      </w:r>
-      <w:r>
-        <w:t xml:space="preserve">noise into flexible parameters, is precisely what makes it a</w:t>
-      </w:r>
-      <w:r>
-        <w:t xml:space="preserve"> </w:t>
-      </w:r>
-      <w:r>
-        <w:t xml:space="preserve">measurement instrument rather than a fitting procedure. The Tier-2</w:t>
-      </w:r>
-      <w:r>
-        <w:t xml:space="preserve"> </w:t>
-      </w:r>
-      <w:r>
-        <w:t xml:space="preserve">channel selections (which real-world quantities become the trace</w:t>
-      </w:r>
-      <w:r>
-        <w:t xml:space="preserve"> </w:t>
-      </w:r>
-      <w:r>
-        <w:t xml:space="preserve">vector) are therefore the empirical content of each application,</w:t>
-      </w:r>
-      <w:r>
-        <w:t xml:space="preserve"> </w:t>
-      </w:r>
-      <w:r>
-        <w:t xml:space="preserve">declared in versioned contracts and frozen before evaluation.</w:t>
+        <w:t xml:space="preserve">comparisons) is only as good as the channel selection.</w:t>
       </w:r>
     </w:p>
     <w:p>
@@ -14007,7 +12982,45 @@
         <w:pStyle w:val="BodyText"/>
       </w:pPr>
       <w:r>
-        <w:t xml:space="preserve">Two further scope boundaries should be noted. First, the</w:t>
+        <w:t xml:space="preserve">That the kernel faithfully propagates input quality, rather than</w:t>
+      </w:r>
+      <w:r>
+        <w:t xml:space="preserve"> </w:t>
+      </w:r>
+      <w:r>
+        <w:t xml:space="preserve">absorbing noise into flexible parameters, is what distinguishes it</w:t>
+      </w:r>
+      <w:r>
+        <w:t xml:space="preserve"> </w:t>
+      </w:r>
+      <w:r>
+        <w:t xml:space="preserve">as a measurement instrument rather than a fitting procedure. The</w:t>
+      </w:r>
+      <w:r>
+        <w:t xml:space="preserve"> </w:t>
+      </w:r>
+      <w:r>
+        <w:t xml:space="preserve">channel selections (which real-world quantities become the trace</w:t>
+      </w:r>
+      <w:r>
+        <w:t xml:space="preserve"> </w:t>
+      </w:r>
+      <w:r>
+        <w:t xml:space="preserve">vector) are therefore the empirical content of each application,</w:t>
+      </w:r>
+      <w:r>
+        <w:t xml:space="preserve"> </w:t>
+      </w:r>
+      <w:r>
+        <w:t xml:space="preserve">declared in versioned contracts and frozen before evaluation.</w:t>
+      </w:r>
+    </w:p>
+    <w:p>
+      <w:pPr>
+        <w:pStyle w:val="BodyText"/>
+      </w:pPr>
+      <w:r>
+        <w:t xml:space="preserve">Two scope limitations deserve explicit statement. First, the</w:t>
       </w:r>
       <w:r>
         <w:t xml:space="preserve"> </w:t>
@@ -14031,51 +13044,45 @@
         <w:t xml:space="preserve"> </w:t>
       </w:r>
       <w:r>
-        <w:t xml:space="preserve">primary neuroimaging—an area where the kernel’s input sensitivity</w:t>
-      </w:r>
-      <w:r>
-        <w:t xml:space="preserve"> </w:t>
-      </w:r>
-      <w:r>
-        <w:t xml:space="preserve">makes independent replication with raw data particularly</w:t>
-      </w:r>
-      <w:r>
-        <w:t xml:space="preserve"> </w:t>
-      </w:r>
-      <w:r>
-        <w:t xml:space="preserve">valuable. Second, the kernel is static: it maps a trace vector to</w:t>
-      </w:r>
-      <w:r>
-        <w:t xml:space="preserve"> </w:t>
-      </w:r>
-      <w:r>
-        <w:t xml:space="preserve">invariants at a single evaluation, without dynamical evolution</w:t>
-      </w:r>
-      <w:r>
-        <w:t xml:space="preserve"> </w:t>
-      </w:r>
-      <w:r>
-        <w:t xml:space="preserve">equations. Extending the framework to time-dependent processes is a</w:t>
-      </w:r>
-      <w:r>
-        <w:t xml:space="preserve"> </w:t>
-      </w:r>
-      <w:r>
-        <w:t xml:space="preserve">direction for future work </w:t>
-      </w:r>
-      <w:r>
-        <w:rPr>
-          <w:vertAlign w:val="superscript"/>
-        </w:rPr>
-        <w:t xml:space="preserve">15</w:t>
+        <w:t xml:space="preserve">primary neuroimaging—an area where independent replication with</w:t>
+      </w:r>
+      <w:r>
+        <w:t xml:space="preserve"> </w:t>
+      </w:r>
+      <w:r>
+        <w:t xml:space="preserve">raw data would be particularly valuable. Second, the kernel is</w:t>
+      </w:r>
+      <w:r>
+        <w:t xml:space="preserve"> </w:t>
+      </w:r>
+      <w:r>
+        <w:t xml:space="preserve">static: it maps a trace vector to invariants at a single</w:t>
+      </w:r>
+      <w:r>
+        <w:t xml:space="preserve"> </w:t>
+      </w:r>
+      <w:r>
+        <w:t xml:space="preserve">evaluation, without dynamical evolution equations. Extending the</w:t>
+      </w:r>
+      <w:r>
+        <w:t xml:space="preserve"> </w:t>
+      </w:r>
+      <w:r>
+        <w:t xml:space="preserve">framework to time-dependent processes is a direction for future</w:t>
+      </w:r>
+      <w:r>
+        <w:t xml:space="preserve"> </w:t>
+      </w:r>
+      <w:r>
+        <w:t xml:space="preserve">work </w:t>
       </w:r>
       <w:r>
         <w:t xml:space="preserve">.</w:t>
       </w:r>
     </w:p>
-    <w:bookmarkEnd w:id="58"/>
-    <w:bookmarkEnd w:id="59"/>
-    <w:bookmarkStart w:id="66" w:name="methods"/>
+    <w:bookmarkEnd w:id="42"/>
+    <w:bookmarkEnd w:id="43"/>
+    <w:bookmarkStart w:id="50" w:name="methods"/>
     <w:p>
       <w:pPr>
         <w:pStyle w:val="Heading1"/>
@@ -14084,7 +13091,7 @@
         <w:t xml:space="preserve">Methods</w:t>
       </w:r>
     </w:p>
-    <w:bookmarkStart w:id="60" w:name="trace-vector-construction"/>
+    <w:bookmarkStart w:id="44" w:name="trace-vector-construction"/>
     <w:p>
       <w:pPr>
         <w:pStyle w:val="Heading2"/>
@@ -14189,7 +13196,7 @@
         <w:t xml:space="preserve"> </w:t>
       </w:r>
       <w:r>
-        <w:t xml:space="preserve">normalisation functions. Importantly, the choice of which</w:t>
+        <w:t xml:space="preserve">normalization functions. Importantly, the choice of which</w:t>
       </w:r>
       <w:r>
         <w:t xml:space="preserve"> </w:t>
@@ -14292,7 +13299,7 @@
         <w:t xml:space="preserve"> </w:t>
       </w:r>
       <w:r>
-        <w:t xml:space="preserve">researcher’s modelling choices. Standard Model particles use</w:t>
+        <w:t xml:space="preserve">researcher’s modeling choices. Standard Model particles use</w:t>
       </w:r>
       <w:r>
         <w:t xml:space="preserve"> </w:t>
@@ -14338,7 +13345,7 @@
         </m:sSub>
       </m:oMath>
       <w:r>
-        <w:t xml:space="preserve">, spin normalised to</w:t>
+        <w:t xml:space="preserve">, spin normalized to</w:t>
       </w:r>
       <w:r>
         <w:t xml:space="preserve"> </w:t>
@@ -14414,7 +13421,7 @@
         </m:d>
       </m:oMath>
       <w:r>
-        <w:t xml:space="preserve">, colour (1 if non-singlet,</w:t>
+        <w:t xml:space="preserve">, color (1 if non-singlet,</w:t>
       </w:r>
       <w:r>
         <w:t xml:space="preserve"> </w:t>
@@ -14570,12 +13577,6 @@
         <w:t xml:space="preserve">Group </w:t>
       </w:r>
       <w:r>
-        <w:rPr>
-          <w:vertAlign w:val="superscript"/>
-        </w:rPr>
-        <w:t xml:space="preserve">1</w:t>
-      </w:r>
-      <w:r>
         <w:t xml:space="preserve">. Atomic elements use</w:t>
       </w:r>
       <w:r>
@@ -14602,7 +13603,7 @@
         <w:t xml:space="preserve"> </w:t>
       </w:r>
       <w:r>
-        <w:t xml:space="preserve">(ionisation energy, electronegativity, atomic radius, density,</w:t>
+        <w:t xml:space="preserve">(ionization energy, electronegativity, atomic radius, density,</w:t>
       </w:r>
       <w:r>
         <w:t xml:space="preserve"> </w:t>
@@ -14694,7 +13695,7 @@
         <w:t xml:space="preserve"> </w:t>
       </w:r>
       <w:r>
-        <w:t xml:space="preserve">normalised to</w:t>
+        <w:t xml:space="preserve">normalized to</w:t>
       </w:r>
       <w:r>
         <w:t xml:space="preserve"> </w:t>
@@ -14733,7 +13734,7 @@
         <w:t xml:space="preserve"> </w:t>
       </w:r>
       <w:r>
-        <w:t xml:space="preserve">Every normalisation function is</w:t>
+        <w:t xml:space="preserve">Every normalization function is</w:t>
       </w:r>
       <w:r>
         <w:t xml:space="preserve"> </w:t>
@@ -14748,8 +13749,8 @@
         <w:t xml:space="preserve">adjustment is permitted.</w:t>
       </w:r>
     </w:p>
-    <w:bookmarkEnd w:id="60"/>
-    <w:bookmarkStart w:id="61" w:name="guard-band-and-frozen-parameters"/>
+    <w:bookmarkEnd w:id="44"/>
+    <w:bookmarkStart w:id="45" w:name="guard-band-and-frozen-parameters"/>
     <w:p>
       <w:pPr>
         <w:pStyle w:val="Heading2"/>
@@ -15178,8 +14179,8 @@
         <w:t xml:space="preserve">evaluations or domains.</w:t>
       </w:r>
     </w:p>
-    <w:bookmarkEnd w:id="61"/>
-    <w:bookmarkStart w:id="62" w:name="sensitivity-analysis"/>
+    <w:bookmarkEnd w:id="45"/>
+    <w:bookmarkStart w:id="46" w:name="sensitivity-analysis"/>
     <w:p>
       <w:pPr>
         <w:pStyle w:val="Heading2"/>
@@ -15501,8 +14502,8 @@
         <w:t xml:space="preserve">closures simultaneously.</w:t>
       </w:r>
     </w:p>
-    <w:bookmarkEnd w:id="62"/>
-    <w:bookmarkStart w:id="63" w:name="computational-verification-protocol"/>
+    <w:bookmarkEnd w:id="46"/>
+    <w:bookmarkStart w:id="47" w:name="computational-verification-protocol"/>
     <w:p>
       <w:pPr>
         <w:pStyle w:val="Heading2"/>
@@ -15516,13 +14517,13 @@
         <w:pStyle w:val="FirstParagraph"/>
       </w:pPr>
       <w:r>
-        <w:t xml:space="preserve">All 11</w:t>
+        <w:t xml:space="preserve">All 15</w:t>
       </w:r>
       <w:r>
         <w:t xml:space="preserve">,</w:t>
       </w:r>
       <w:r>
-        <w:t xml:space="preserve">342 tests run under Python 3.12 with NumPy 1.26 using</w:t>
+        <w:t xml:space="preserve">260 tests run under Python 3.12 with NumPy 1.26 using</w:t>
       </w:r>
       <w:r>
         <w:t xml:space="preserve"> </w:t>
@@ -15643,8 +14644,8 @@
         <w:t xml:space="preserve">seeds and version-pinned dependencies.</w:t>
       </w:r>
     </w:p>
-    <w:bookmarkEnd w:id="63"/>
-    <w:bookmarkStart w:id="64" w:name="regime-classification"/>
+    <w:bookmarkEnd w:id="47"/>
+    <w:bookmarkStart w:id="48" w:name="regime-classification"/>
     <w:p>
       <w:pPr>
         <w:pStyle w:val="Heading2"/>
@@ -15832,8 +14833,8 @@
         <w:t xml:space="preserve">but their intersection is narrow.</w:t>
       </w:r>
     </w:p>
-    <w:bookmarkEnd w:id="64"/>
-    <w:bookmarkStart w:id="65" w:name="data-and-code-availability"/>
+    <w:bookmarkEnd w:id="48"/>
+    <w:bookmarkStart w:id="49" w:name="data-and-code-availability"/>
     <w:p>
       <w:pPr>
         <w:pStyle w:val="Heading2"/>
@@ -15862,16 +14863,10 @@
         <w:t xml:space="preserve">repository </w:t>
       </w:r>
       <w:r>
-        <w:rPr>
-          <w:vertAlign w:val="superscript"/>
-        </w:rPr>
-        <w:t xml:space="preserve">16</w:t>
-      </w:r>
-      <w:r>
-        <w:t xml:space="preserve"> </w:t>
-      </w:r>
-      <w:r>
-        <w:t xml:space="preserve">under the MIT licence. The</w:t>
+        <w:t xml:space="preserve"> </w:t>
+      </w:r>
+      <w:r>
+        <w:t xml:space="preserve">under the MIT license. The</w:t>
       </w:r>
       <w:r>
         <w:t xml:space="preserve"> </w:t>
@@ -15895,7 +14890,7 @@
         <w:t xml:space="preserve"> </w:t>
       </w:r>
       <w:r>
-        <w:t xml:space="preserve">for 211 tracked files are maintained in</w:t>
+        <w:t xml:space="preserve">for 228 tracked files are maintained in</w:t>
       </w:r>
       <w:r>
         <w:t xml:space="preserve"> </w:t>
@@ -15919,18 +14914,12 @@
         <w:t xml:space="preserve">archival </w:t>
       </w:r>
       <w:r>
-        <w:rPr>
-          <w:vertAlign w:val="superscript"/>
-        </w:rPr>
-        <w:t xml:space="preserve">17–19</w:t>
-      </w:r>
-      <w:r>
         <w:t xml:space="preserve">.</w:t>
       </w:r>
     </w:p>
-    <w:bookmarkEnd w:id="65"/>
-    <w:bookmarkEnd w:id="66"/>
-    <w:bookmarkStart w:id="100" w:name="acknowledgements"/>
+    <w:bookmarkEnd w:id="49"/>
+    <w:bookmarkEnd w:id="50"/>
+    <w:bookmarkStart w:id="51" w:name="acknowledgements"/>
     <w:p>
       <w:pPr>
         <w:pStyle w:val="Heading1"/>
@@ -15965,901 +14954,7 @@
         <w:t xml:space="preserve">research possible.</w:t>
       </w:r>
     </w:p>
-    <w:bookmarkStart w:id="99" w:name="refs"/>
-    <w:bookmarkStart w:id="68" w:name="ref-pdg2024"/>
-    <w:p>
-      <w:pPr>
-        <w:pStyle w:val="Bibliography"/>
-      </w:pPr>
-      <w:r>
-        <w:t xml:space="preserve">1.</w:t>
-      </w:r>
-      <w:r>
-        <w:t xml:space="preserve"> </w:t>
-      </w:r>
-      <w:r>
-        <w:t xml:space="preserve">	</w:t>
-      </w:r>
-      <w:r>
-        <w:t xml:space="preserve">Particle Data Group, Navas, S.,</w:t>
-      </w:r>
-      <w:r>
-        <w:t xml:space="preserve"> </w:t>
-      </w:r>
-      <w:r>
-        <w:rPr>
-          <w:iCs/>
-          <w:i/>
-        </w:rPr>
-        <w:t xml:space="preserve">et al.</w:t>
-      </w:r>
-      <w:r>
-        <w:t xml:space="preserve"> </w:t>
-      </w:r>
-      <w:hyperlink r:id="rId67">
-        <w:r>
-          <w:rPr>
-            <w:rStyle w:val="Hyperlink"/>
-          </w:rPr>
-          <w:t xml:space="preserve">Review of particle physics</w:t>
-        </w:r>
-      </w:hyperlink>
-      <w:r>
-        <w:t xml:space="preserve">.</w:t>
-      </w:r>
-      <w:r>
-        <w:t xml:space="preserve"> </w:t>
-      </w:r>
-      <w:r>
-        <w:rPr>
-          <w:iCs/>
-          <w:i/>
-        </w:rPr>
-        <w:t xml:space="preserve">Physical Review D</w:t>
-      </w:r>
-      <w:r>
-        <w:t xml:space="preserve"> </w:t>
-      </w:r>
-      <w:r>
-        <w:rPr>
-          <w:bCs/>
-          <w:b/>
-        </w:rPr>
-        <w:t xml:space="preserve">110</w:t>
-      </w:r>
-      <w:r>
-        <w:t xml:space="preserve">, 030001 (2024).</w:t>
-      </w:r>
-    </w:p>
-    <w:bookmarkEnd w:id="68"/>
-    <w:bookmarkStart w:id="69" w:name="ref-einstein1916gr"/>
-    <w:p>
-      <w:pPr>
-        <w:pStyle w:val="Bibliography"/>
-      </w:pPr>
-      <w:r>
-        <w:t xml:space="preserve">2.</w:t>
-      </w:r>
-      <w:r>
-        <w:t xml:space="preserve"> </w:t>
-      </w:r>
-      <w:r>
-        <w:t xml:space="preserve">	</w:t>
-      </w:r>
-      <w:r>
-        <w:t xml:space="preserve">Einstein, A. Die grundlage der allgemeinen relativit</w:t>
-      </w:r>
-      <w:r>
-        <w:t xml:space="preserve">ä</w:t>
-      </w:r>
-      <w:r>
-        <w:t xml:space="preserve">tstheorie.</w:t>
-      </w:r>
-      <w:r>
-        <w:t xml:space="preserve"> </w:t>
-      </w:r>
-      <w:r>
-        <w:rPr>
-          <w:iCs/>
-          <w:i/>
-        </w:rPr>
-        <w:t xml:space="preserve">Annalen der Physik</w:t>
-      </w:r>
-      <w:r>
-        <w:t xml:space="preserve"> </w:t>
-      </w:r>
-      <w:r>
-        <w:rPr>
-          <w:bCs/>
-          <w:b/>
-        </w:rPr>
-        <w:t xml:space="preserve">354</w:t>
-      </w:r>
-      <w:r>
-        <w:t xml:space="preserve">, 769–822 (1916).</w:t>
-      </w:r>
-    </w:p>
-    <w:bookmarkEnd w:id="69"/>
-    <w:bookmarkStart w:id="71" w:name="ref-shannon1948"/>
-    <w:p>
-      <w:pPr>
-        <w:pStyle w:val="Bibliography"/>
-      </w:pPr>
-      <w:r>
-        <w:t xml:space="preserve">3.</w:t>
-      </w:r>
-      <w:r>
-        <w:t xml:space="preserve"> </w:t>
-      </w:r>
-      <w:r>
-        <w:t xml:space="preserve">	</w:t>
-      </w:r>
-      <w:r>
-        <w:t xml:space="preserve">Shannon, C. E.</w:t>
-      </w:r>
-      <w:r>
-        <w:t xml:space="preserve"> </w:t>
-      </w:r>
-      <w:hyperlink r:id="rId70">
-        <w:r>
-          <w:rPr>
-            <w:rStyle w:val="Hyperlink"/>
-          </w:rPr>
-          <w:t xml:space="preserve">A mathematical theory of communication</w:t>
-        </w:r>
-      </w:hyperlink>
-      <w:r>
-        <w:t xml:space="preserve">.</w:t>
-      </w:r>
-      <w:r>
-        <w:t xml:space="preserve"> </w:t>
-      </w:r>
-      <w:r>
-        <w:rPr>
-          <w:iCs/>
-          <w:i/>
-        </w:rPr>
-        <w:t xml:space="preserve">The Bell System Technical Journal</w:t>
-      </w:r>
-      <w:r>
-        <w:t xml:space="preserve"> </w:t>
-      </w:r>
-      <w:r>
-        <w:rPr>
-          <w:bCs/>
-          <w:b/>
-        </w:rPr>
-        <w:t xml:space="preserve">27</w:t>
-      </w:r>
-      <w:r>
-        <w:t xml:space="preserve">, 379–423, 623–656 (1948).</w:t>
-      </w:r>
-    </w:p>
-    <w:bookmarkEnd w:id="71"/>
-    <w:bookmarkStart w:id="73" w:name="ref-fisher1925"/>
-    <w:p>
-      <w:pPr>
-        <w:pStyle w:val="Bibliography"/>
-      </w:pPr>
-      <w:r>
-        <w:t xml:space="preserve">4.</w:t>
-      </w:r>
-      <w:r>
-        <w:t xml:space="preserve"> </w:t>
-      </w:r>
-      <w:r>
-        <w:t xml:space="preserve">	</w:t>
-      </w:r>
-      <w:r>
-        <w:t xml:space="preserve">Fisher, R. A.</w:t>
-      </w:r>
-      <w:r>
-        <w:t xml:space="preserve"> </w:t>
-      </w:r>
-      <w:hyperlink r:id="rId72">
-        <w:r>
-          <w:rPr>
-            <w:rStyle w:val="Hyperlink"/>
-          </w:rPr>
-          <w:t xml:space="preserve">Theory of statistical estimation</w:t>
-        </w:r>
-      </w:hyperlink>
-      <w:r>
-        <w:t xml:space="preserve">.</w:t>
-      </w:r>
-      <w:r>
-        <w:t xml:space="preserve"> </w:t>
-      </w:r>
-      <w:r>
-        <w:rPr>
-          <w:iCs/>
-          <w:i/>
-        </w:rPr>
-        <w:t xml:space="preserve">Mathematical Proceedings of the Cambridge Philosophical Society</w:t>
-      </w:r>
-      <w:r>
-        <w:t xml:space="preserve"> </w:t>
-      </w:r>
-      <w:r>
-        <w:rPr>
-          <w:bCs/>
-          <w:b/>
-        </w:rPr>
-        <w:t xml:space="preserve">22</w:t>
-      </w:r>
-      <w:r>
-        <w:t xml:space="preserve">, 700–725 (1925).</w:t>
-      </w:r>
-    </w:p>
-    <w:bookmarkEnd w:id="73"/>
-    <w:bookmarkStart w:id="74" w:name="ref-rao1945information"/>
-    <w:p>
-      <w:pPr>
-        <w:pStyle w:val="Bibliography"/>
-      </w:pPr>
-      <w:r>
-        <w:t xml:space="preserve">5.</w:t>
-      </w:r>
-      <w:r>
-        <w:t xml:space="preserve"> </w:t>
-      </w:r>
-      <w:r>
-        <w:t xml:space="preserve">	</w:t>
-      </w:r>
-      <w:r>
-        <w:t xml:space="preserve">Rao, C. R. Information and the accuracy attainable in the estimation of statistical parameters.</w:t>
-      </w:r>
-      <w:r>
-        <w:t xml:space="preserve"> </w:t>
-      </w:r>
-      <w:r>
-        <w:rPr>
-          <w:iCs/>
-          <w:i/>
-        </w:rPr>
-        <w:t xml:space="preserve">Bulletin of the Calcutta Mathematical Society</w:t>
-      </w:r>
-      <w:r>
-        <w:t xml:space="preserve"> </w:t>
-      </w:r>
-      <w:r>
-        <w:rPr>
-          <w:bCs/>
-          <w:b/>
-        </w:rPr>
-        <w:t xml:space="preserve">37</w:t>
-      </w:r>
-      <w:r>
-        <w:t xml:space="preserve">, 81–91 (1945).</w:t>
-      </w:r>
-    </w:p>
-    <w:bookmarkEnd w:id="74"/>
-    <w:bookmarkStart w:id="75" w:name="ref-renyi1961measures"/>
-    <w:p>
-      <w:pPr>
-        <w:pStyle w:val="Bibliography"/>
-      </w:pPr>
-      <w:r>
-        <w:t xml:space="preserve">6.</w:t>
-      </w:r>
-      <w:r>
-        <w:t xml:space="preserve"> </w:t>
-      </w:r>
-      <w:r>
-        <w:t xml:space="preserve">	</w:t>
-      </w:r>
-      <w:r>
-        <w:t xml:space="preserve">Rényi, A. On measures of entropy and information.</w:t>
-      </w:r>
-      <w:r>
-        <w:t xml:space="preserve"> </w:t>
-      </w:r>
-      <w:r>
-        <w:rPr>
-          <w:iCs/>
-          <w:i/>
-        </w:rPr>
-        <w:t xml:space="preserve">Proceedings of the Fourth Berkeley Symposium on Mathematical Statistics and Probability</w:t>
-      </w:r>
-      <w:r>
-        <w:t xml:space="preserve"> </w:t>
-      </w:r>
-      <w:r>
-        <w:rPr>
-          <w:bCs/>
-          <w:b/>
-        </w:rPr>
-        <w:t xml:space="preserve">1</w:t>
-      </w:r>
-      <w:r>
-        <w:t xml:space="preserve">, 547–561 (1961).</w:t>
-      </w:r>
-    </w:p>
-    <w:bookmarkEnd w:id="75"/>
-    <w:bookmarkStart w:id="77" w:name="ref-gross1973"/>
-    <w:p>
-      <w:pPr>
-        <w:pStyle w:val="Bibliography"/>
-      </w:pPr>
-      <w:r>
-        <w:t xml:space="preserve">7.</w:t>
-      </w:r>
-      <w:r>
-        <w:t xml:space="preserve"> </w:t>
-      </w:r>
-      <w:r>
-        <w:t xml:space="preserve">	</w:t>
-      </w:r>
-      <w:r>
-        <w:t xml:space="preserve">Gross, D. J. &amp; Wilczek, F.</w:t>
-      </w:r>
-      <w:r>
-        <w:t xml:space="preserve"> </w:t>
-      </w:r>
-      <w:hyperlink r:id="rId76">
-        <w:r>
-          <w:rPr>
-            <w:rStyle w:val="Hyperlink"/>
-          </w:rPr>
-          <w:t xml:space="preserve">Ultraviolet behavior of non-</w:t>
-        </w:r>
-        <w:r>
-          <w:rPr>
-            <w:rStyle w:val="Hyperlink"/>
-          </w:rPr>
-          <w:t xml:space="preserve">Abelian</w:t>
-        </w:r>
-        <w:r>
-          <w:rPr>
-            <w:rStyle w:val="Hyperlink"/>
-          </w:rPr>
-          <w:t xml:space="preserve"> </w:t>
-        </w:r>
-        <w:r>
-          <w:rPr>
-            <w:rStyle w:val="Hyperlink"/>
-          </w:rPr>
-          <w:t xml:space="preserve">gauge theories</w:t>
-        </w:r>
-      </w:hyperlink>
-      <w:r>
-        <w:t xml:space="preserve">.</w:t>
-      </w:r>
-      <w:r>
-        <w:t xml:space="preserve"> </w:t>
-      </w:r>
-      <w:r>
-        <w:rPr>
-          <w:iCs/>
-          <w:i/>
-        </w:rPr>
-        <w:t xml:space="preserve">Physical Review Letters</w:t>
-      </w:r>
-      <w:r>
-        <w:t xml:space="preserve"> </w:t>
-      </w:r>
-      <w:r>
-        <w:rPr>
-          <w:bCs/>
-          <w:b/>
-        </w:rPr>
-        <w:t xml:space="preserve">30</w:t>
-      </w:r>
-      <w:r>
-        <w:t xml:space="preserve">, 1343–1346 (1973).</w:t>
-      </w:r>
-    </w:p>
-    <w:bookmarkEnd w:id="77"/>
-    <w:bookmarkStart w:id="79" w:name="ref-politzer1973"/>
-    <w:p>
-      <w:pPr>
-        <w:pStyle w:val="Bibliography"/>
-      </w:pPr>
-      <w:r>
-        <w:t xml:space="preserve">8.</w:t>
-      </w:r>
-      <w:r>
-        <w:t xml:space="preserve"> </w:t>
-      </w:r>
-      <w:r>
-        <w:t xml:space="preserve">	</w:t>
-      </w:r>
-      <w:r>
-        <w:t xml:space="preserve">Politzer, H. D.</w:t>
-      </w:r>
-      <w:r>
-        <w:t xml:space="preserve"> </w:t>
-      </w:r>
-      <w:hyperlink r:id="rId78">
-        <w:r>
-          <w:rPr>
-            <w:rStyle w:val="Hyperlink"/>
-          </w:rPr>
-          <w:t xml:space="preserve">Reliable perturbative results for strong interactions?</w:t>
-        </w:r>
-      </w:hyperlink>
-      <w:r>
-        <w:t xml:space="preserve"> </w:t>
-      </w:r>
-      <w:r>
-        <w:rPr>
-          <w:iCs/>
-          <w:i/>
-        </w:rPr>
-        <w:t xml:space="preserve">Physical Review Letters</w:t>
-      </w:r>
-      <w:r>
-        <w:t xml:space="preserve"> </w:t>
-      </w:r>
-      <w:r>
-        <w:rPr>
-          <w:bCs/>
-          <w:b/>
-        </w:rPr>
-        <w:t xml:space="preserve">30</w:t>
-      </w:r>
-      <w:r>
-        <w:t xml:space="preserve">, 1346–1349 (1973).</w:t>
-      </w:r>
-    </w:p>
-    <w:bookmarkEnd w:id="79"/>
-    <w:bookmarkStart w:id="80" w:name="ref-hardylittlewoodpolya1952"/>
-    <w:p>
-      <w:pPr>
-        <w:pStyle w:val="Bibliography"/>
-      </w:pPr>
-      <w:r>
-        <w:t xml:space="preserve">9.</w:t>
-      </w:r>
-      <w:r>
-        <w:t xml:space="preserve"> </w:t>
-      </w:r>
-      <w:r>
-        <w:t xml:space="preserve">	</w:t>
-      </w:r>
-      <w:r>
-        <w:t xml:space="preserve">Hardy, G. H., Littlewood, J. E. &amp; Pólya, G.</w:t>
-      </w:r>
-      <w:r>
-        <w:t xml:space="preserve"> </w:t>
-      </w:r>
-      <w:r>
-        <w:rPr>
-          <w:iCs/>
-          <w:i/>
-        </w:rPr>
-        <w:t xml:space="preserve">Inequalities</w:t>
-      </w:r>
-      <w:r>
-        <w:t xml:space="preserve">. (Cambridge University Press, 1952).</w:t>
-      </w:r>
-    </w:p>
-    <w:bookmarkEnd w:id="80"/>
-    <w:bookmarkStart w:id="82" w:name="ref-wilson1974confinement"/>
-    <w:p>
-      <w:pPr>
-        <w:pStyle w:val="Bibliography"/>
-      </w:pPr>
-      <w:r>
-        <w:t xml:space="preserve">10.</w:t>
-      </w:r>
-      <w:r>
-        <w:t xml:space="preserve"> </w:t>
-      </w:r>
-      <w:r>
-        <w:t xml:space="preserve">	</w:t>
-      </w:r>
-      <w:r>
-        <w:t xml:space="preserve">Wilson, K. G.</w:t>
-      </w:r>
-      <w:r>
-        <w:t xml:space="preserve"> </w:t>
-      </w:r>
-      <w:hyperlink r:id="rId81">
-        <w:r>
-          <w:rPr>
-            <w:rStyle w:val="Hyperlink"/>
-          </w:rPr>
-          <w:t xml:space="preserve">Confinement of quarks</w:t>
-        </w:r>
-      </w:hyperlink>
-      <w:r>
-        <w:t xml:space="preserve">.</w:t>
-      </w:r>
-      <w:r>
-        <w:t xml:space="preserve"> </w:t>
-      </w:r>
-      <w:r>
-        <w:rPr>
-          <w:iCs/>
-          <w:i/>
-        </w:rPr>
-        <w:t xml:space="preserve">Physical Review D</w:t>
-      </w:r>
-      <w:r>
-        <w:t xml:space="preserve"> </w:t>
-      </w:r>
-      <w:r>
-        <w:rPr>
-          <w:bCs/>
-          <w:b/>
-        </w:rPr>
-        <w:t xml:space="preserve">10</w:t>
-      </w:r>
-      <w:r>
-        <w:t xml:space="preserve">, 2445–2459 (1974).</w:t>
-      </w:r>
-    </w:p>
-    <w:bookmarkEnd w:id="82"/>
-    <w:bookmarkStart w:id="84" w:name="ref-aoki2006lattice"/>
-    <w:p>
-      <w:pPr>
-        <w:pStyle w:val="Bibliography"/>
-      </w:pPr>
-      <w:r>
-        <w:t xml:space="preserve">11.</w:t>
-      </w:r>
-      <w:r>
-        <w:t xml:space="preserve"> </w:t>
-      </w:r>
-      <w:r>
-        <w:t xml:space="preserve">	</w:t>
-      </w:r>
-      <w:r>
-        <w:t xml:space="preserve">Aoki, Y., Endrődi, G., Fodor, Z., Katz, S. D. &amp; Szabó, K. K.</w:t>
-      </w:r>
-      <w:r>
-        <w:t xml:space="preserve"> </w:t>
-      </w:r>
-      <w:hyperlink r:id="rId83">
-        <w:r>
-          <w:rPr>
-            <w:rStyle w:val="Hyperlink"/>
-          </w:rPr>
-          <w:t xml:space="preserve">The order of the quantum chromodynamics transition predicted by the standard model of particle physics</w:t>
-        </w:r>
-      </w:hyperlink>
-      <w:r>
-        <w:t xml:space="preserve">.</w:t>
-      </w:r>
-      <w:r>
-        <w:t xml:space="preserve"> </w:t>
-      </w:r>
-      <w:r>
-        <w:rPr>
-          <w:iCs/>
-          <w:i/>
-        </w:rPr>
-        <w:t xml:space="preserve">Nature</w:t>
-      </w:r>
-      <w:r>
-        <w:t xml:space="preserve"> </w:t>
-      </w:r>
-      <w:r>
-        <w:rPr>
-          <w:bCs/>
-          <w:b/>
-        </w:rPr>
-        <w:t xml:space="preserve">443</w:t>
-      </w:r>
-      <w:r>
-        <w:t xml:space="preserve">, 675–678 (2006).</w:t>
-      </w:r>
-    </w:p>
-    <w:bookmarkEnd w:id="84"/>
-    <w:bookmarkStart w:id="86" w:name="ref-hellinger1909"/>
-    <w:p>
-      <w:pPr>
-        <w:pStyle w:val="Bibliography"/>
-      </w:pPr>
-      <w:r>
-        <w:t xml:space="preserve">12.</w:t>
-      </w:r>
-      <w:r>
-        <w:t xml:space="preserve"> </w:t>
-      </w:r>
-      <w:r>
-        <w:t xml:space="preserve">	</w:t>
-      </w:r>
-      <w:r>
-        <w:t xml:space="preserve">Hellinger, E.</w:t>
-      </w:r>
-      <w:r>
-        <w:t xml:space="preserve"> </w:t>
-      </w:r>
-      <w:hyperlink r:id="rId85">
-        <w:r>
-          <w:rPr>
-            <w:rStyle w:val="Hyperlink"/>
-          </w:rPr>
-          <w:t xml:space="preserve">Neue begr</w:t>
-        </w:r>
-        <w:r>
-          <w:rPr>
-            <w:rStyle w:val="Hyperlink"/>
-          </w:rPr>
-          <w:t xml:space="preserve">ü</w:t>
-        </w:r>
-        <w:r>
-          <w:rPr>
-            <w:rStyle w:val="Hyperlink"/>
-          </w:rPr>
-          <w:t xml:space="preserve">ndung der theorie quadratischer formen von unendlichvielen ver</w:t>
-        </w:r>
-        <w:r>
-          <w:rPr>
-            <w:rStyle w:val="Hyperlink"/>
-          </w:rPr>
-          <w:t xml:space="preserve">ä</w:t>
-        </w:r>
-        <w:r>
-          <w:rPr>
-            <w:rStyle w:val="Hyperlink"/>
-          </w:rPr>
-          <w:t xml:space="preserve">nderlichen</w:t>
-        </w:r>
-      </w:hyperlink>
-      <w:r>
-        <w:t xml:space="preserve">.</w:t>
-      </w:r>
-      <w:r>
-        <w:t xml:space="preserve"> </w:t>
-      </w:r>
-      <w:r>
-        <w:rPr>
-          <w:iCs/>
-          <w:i/>
-        </w:rPr>
-        <w:t xml:space="preserve">Journal f</w:t>
-      </w:r>
-      <w:r>
-        <w:rPr>
-          <w:iCs/>
-          <w:i/>
-        </w:rPr>
-        <w:t xml:space="preserve">ü</w:t>
-      </w:r>
-      <w:r>
-        <w:rPr>
-          <w:iCs/>
-          <w:i/>
-        </w:rPr>
-        <w:t xml:space="preserve">r die reine und angewandte Mathematik</w:t>
-      </w:r>
-      <w:r>
-        <w:t xml:space="preserve"> </w:t>
-      </w:r>
-      <w:r>
-        <w:rPr>
-          <w:bCs/>
-          <w:b/>
-        </w:rPr>
-        <w:t xml:space="preserve">136</w:t>
-      </w:r>
-      <w:r>
-        <w:t xml:space="preserve">, 210–271 (1909).</w:t>
-      </w:r>
-    </w:p>
-    <w:bookmarkEnd w:id="86"/>
-    <w:bookmarkStart w:id="88" w:name="ref-amari2016information"/>
-    <w:p>
-      <w:pPr>
-        <w:pStyle w:val="Bibliography"/>
-      </w:pPr>
-      <w:r>
-        <w:t xml:space="preserve">13.</w:t>
-      </w:r>
-      <w:r>
-        <w:t xml:space="preserve"> </w:t>
-      </w:r>
-      <w:r>
-        <w:t xml:space="preserve">	</w:t>
-      </w:r>
-      <w:r>
-        <w:t xml:space="preserve">Amari, S.</w:t>
-      </w:r>
-      <w:r>
-        <w:t xml:space="preserve"> </w:t>
-      </w:r>
-      <w:r>
-        <w:rPr>
-          <w:iCs/>
-          <w:i/>
-        </w:rPr>
-        <w:t xml:space="preserve">Information Geometry and Its Applications</w:t>
-      </w:r>
-      <w:r>
-        <w:t xml:space="preserve">. (Springer, 2016). doi:</w:t>
-      </w:r>
-      <w:hyperlink r:id="rId87">
-        <w:r>
-          <w:rPr>
-            <w:rStyle w:val="Hyperlink"/>
-          </w:rPr>
-          <w:t xml:space="preserve">10.1007/978-4-431-55978-8</w:t>
-        </w:r>
-      </w:hyperlink>
-      <w:r>
-        <w:t xml:space="preserve">.</w:t>
-      </w:r>
-    </w:p>
-    <w:bookmarkEnd w:id="88"/>
-    <w:bookmarkStart w:id="89" w:name="ref-cardano1545"/>
-    <w:p>
-      <w:pPr>
-        <w:pStyle w:val="Bibliography"/>
-      </w:pPr>
-      <w:r>
-        <w:t xml:space="preserve">14.</w:t>
-      </w:r>
-      <w:r>
-        <w:t xml:space="preserve"> </w:t>
-      </w:r>
-      <w:r>
-        <w:t xml:space="preserve">	</w:t>
-      </w:r>
-      <w:r>
-        <w:t xml:space="preserve">Cardano, G.</w:t>
-      </w:r>
-      <w:r>
-        <w:t xml:space="preserve"> </w:t>
-      </w:r>
-      <w:r>
-        <w:rPr>
-          <w:iCs/>
-          <w:i/>
-        </w:rPr>
-        <w:t xml:space="preserve">Ars Magna</w:t>
-      </w:r>
-      <w:r>
-        <w:t xml:space="preserve">. (Johann Petreius, Nuremberg, 1545).</w:t>
-      </w:r>
-    </w:p>
-    <w:bookmarkEnd w:id="89"/>
-    <w:bookmarkStart w:id="90" w:name="ref-paulus2025umcp"/>
-    <w:p>
-      <w:pPr>
-        <w:pStyle w:val="Bibliography"/>
-      </w:pPr>
-      <w:r>
-        <w:t xml:space="preserve">15.</w:t>
-      </w:r>
-      <w:r>
-        <w:t xml:space="preserve"> </w:t>
-      </w:r>
-      <w:r>
-        <w:t xml:space="preserve">	</w:t>
-      </w:r>
-      <w:r>
-        <w:t xml:space="preserve">Paulus, C. Universal measurement contract protocol. (2025).</w:t>
-      </w:r>
-    </w:p>
-    <w:bookmarkEnd w:id="90"/>
-    <w:bookmarkStart w:id="92" w:name="ref-umcpmetadatarepo"/>
-    <w:p>
-      <w:pPr>
-        <w:pStyle w:val="Bibliography"/>
-      </w:pPr>
-      <w:r>
-        <w:t xml:space="preserve">16.</w:t>
-      </w:r>
-      <w:r>
-        <w:t xml:space="preserve"> </w:t>
-      </w:r>
-      <w:r>
-        <w:t xml:space="preserve">	</w:t>
-      </w:r>
-      <w:r>
-        <w:t xml:space="preserve">Paulus, C.</w:t>
-      </w:r>
-      <w:r>
-        <w:t xml:space="preserve"> </w:t>
-      </w:r>
-      <w:hyperlink r:id="rId91">
-        <w:r>
-          <w:rPr>
-            <w:rStyle w:val="Hyperlink"/>
-          </w:rPr>
-          <w:t xml:space="preserve">GENERATIVE-COLLAPSE-DYNAMICS</w:t>
-        </w:r>
-      </w:hyperlink>
-      <w:r>
-        <w:t xml:space="preserve">. (2026).</w:t>
-      </w:r>
-    </w:p>
-    <w:bookmarkEnd w:id="92"/>
-    <w:bookmarkStart w:id="94" w:name="ref-paulus2025episteme"/>
-    <w:p>
-      <w:pPr>
-        <w:pStyle w:val="Bibliography"/>
-      </w:pPr>
-      <w:r>
-        <w:t xml:space="preserve">17.</w:t>
-      </w:r>
-      <w:r>
-        <w:t xml:space="preserve"> </w:t>
-      </w:r>
-      <w:r>
-        <w:t xml:space="preserve">	</w:t>
-      </w:r>
-      <w:r>
-        <w:t xml:space="preserve">Paulus, C. The episteme of return. (2025) doi:</w:t>
-      </w:r>
-      <w:hyperlink r:id="rId93">
-        <w:r>
-          <w:rPr>
-            <w:rStyle w:val="Hyperlink"/>
-          </w:rPr>
-          <w:t xml:space="preserve">10.5281/zenodo.17756705</w:t>
-        </w:r>
-      </w:hyperlink>
-      <w:r>
-        <w:t xml:space="preserve">.</w:t>
-      </w:r>
-    </w:p>
-    <w:bookmarkEnd w:id="94"/>
-    <w:bookmarkStart w:id="96" w:name="ref-paulus2025physicscoherence"/>
-    <w:p>
-      <w:pPr>
-        <w:pStyle w:val="Bibliography"/>
-      </w:pPr>
-      <w:r>
-        <w:t xml:space="preserve">18.</w:t>
-      </w:r>
-      <w:r>
-        <w:t xml:space="preserve"> </w:t>
-      </w:r>
-      <w:r>
-        <w:t xml:space="preserve">	</w:t>
-      </w:r>
-      <w:r>
-        <w:t xml:space="preserve">Paulus, C. The physics of coherence: Recursive collapse &amp; continuity laws. (2025) doi:</w:t>
-      </w:r>
-      <w:hyperlink r:id="rId95">
-        <w:r>
-          <w:rPr>
-            <w:rStyle w:val="Hyperlink"/>
-          </w:rPr>
-          <w:t xml:space="preserve">10.5281/zenodo.18072852</w:t>
-        </w:r>
-      </w:hyperlink>
-      <w:r>
-        <w:t xml:space="preserve">.</w:t>
-      </w:r>
-    </w:p>
-    <w:bookmarkEnd w:id="96"/>
-    <w:bookmarkStart w:id="98" w:name="ref-paulus2026umcpcasepack"/>
-    <w:p>
-      <w:pPr>
-        <w:pStyle w:val="Bibliography"/>
-      </w:pPr>
-      <w:r>
-        <w:t xml:space="preserve">19.</w:t>
-      </w:r>
-      <w:r>
-        <w:t xml:space="preserve"> </w:t>
-      </w:r>
-      <w:r>
-        <w:t xml:space="preserve">	</w:t>
-      </w:r>
-      <w:r>
-        <w:t xml:space="preserve">Paulus, C. UMCP CasePack publication. (2026) doi:</w:t>
-      </w:r>
-      <w:hyperlink r:id="rId97">
-        <w:r>
-          <w:rPr>
-            <w:rStyle w:val="Hyperlink"/>
-          </w:rPr>
-          <w:t xml:space="preserve">10.5281/zenodo.18226878</w:t>
-        </w:r>
-      </w:hyperlink>
-      <w:r>
-        <w:t xml:space="preserve">.</w:t>
-      </w:r>
-    </w:p>
-    <w:bookmarkEnd w:id="98"/>
-    <w:bookmarkEnd w:id="99"/>
-    <w:bookmarkEnd w:id="100"/>
+    <w:bookmarkEnd w:id="51"/>
     <w:sectPr/>
   </w:body>
 </w:document>

</xml_diff>

<commit_message>
docx: rebuild with all 4 tikz figures rendered and embedded
</commit_message>
<xml_diff>
--- a/paper/nature_universal_laws.docx
+++ b/paper/nature_universal_laws.docx
@@ -7304,7 +7304,7 @@
     <w:bookmarkEnd w:id="28"/>
     <w:bookmarkEnd w:id="29"/>
     <w:bookmarkEnd w:id="30"/>
-    <w:bookmarkStart w:id="35" w:name="applications"/>
+    <w:bookmarkStart w:id="51" w:name="applications"/>
     <w:p>
       <w:pPr>
         <w:pStyle w:val="Heading1"/>
@@ -7379,7 +7379,7 @@
           <w:rPr>
             <w:rStyle w:val="Hyperlink"/>
           </w:rPr>
-          <w:t xml:space="preserve">[fig:cliff]</w:t>
+          <w:t xml:space="preserve">1</w:t>
         </w:r>
       </w:hyperlink>
       <w:r>
@@ -7982,7 +7982,7 @@
           <w:rPr>
             <w:rStyle w:val="Hyperlink"/>
           </w:rPr>
-          <w:t xml:space="preserve">[fig:slaughter]</w:t>
+          <w:t xml:space="preserve">2</w:t>
         </w:r>
       </w:hyperlink>
       <w:r>
@@ -8425,7 +8425,7 @@
           <w:rPr>
             <w:rStyle w:val="Hyperlink"/>
           </w:rPr>
-          <w:t xml:space="preserve">[fig:periodic]</w:t>
+          <w:t xml:space="preserve">3</w:t>
         </w:r>
       </w:hyperlink>
       <w:r>
@@ -8590,7 +8590,7 @@
           <w:rPr>
             <w:rStyle w:val="Hyperlink"/>
           </w:rPr>
-          <w:t xml:space="preserve">[fig:cliff]</w:t>
+          <w:t xml:space="preserve">1</w:t>
         </w:r>
       </w:hyperlink>
       <w:r>
@@ -8645,7 +8645,7 @@
           <w:rPr>
             <w:rStyle w:val="Hyperlink"/>
           </w:rPr>
-          <w:t xml:space="preserve">[fig:periodic]</w:t>
+          <w:t xml:space="preserve">3</w:t>
         </w:r>
       </w:hyperlink>
       <w:r>
@@ -9460,7 +9460,7 @@
       </w:r>
     </w:p>
     <w:bookmarkEnd w:id="33"/>
-    <w:bookmarkStart w:id="34" w:name="sec:cosmo"/>
+    <w:bookmarkStart w:id="50" w:name="sec:cosmo"/>
     <w:p>
       <w:pPr>
         <w:pStyle w:val="Heading2"/>
@@ -9738,9 +9738,691 @@
         <w:t xml:space="preserve">identical frozen parameters throughout.</w:t>
       </w:r>
     </w:p>
-    <w:bookmarkEnd w:id="34"/>
-    <w:bookmarkEnd w:id="35"/>
-    <w:bookmarkStart w:id="43" w:name="discussion"/>
+    <w:p>
+      <w:pPr>
+        <w:pStyle w:val="CaptionedFigure"/>
+      </w:pPr>
+      <w:bookmarkStart w:id="37" w:name="fig:cliff"/>
+      <w:r>
+        <w:drawing>
+          <wp:inline>
+            <wp:extent cx="5334000" cy="453467"/>
+            <wp:effectExtent b="0" l="0" r="0" t="0"/>
+            <wp:docPr descr="The scale ladder of integrity. \mathrm{IC}/F (coherence efficiency) for 406 objects across six physical scales. The confinement cliff (fundamental \to composite: 23-fold drop, red arrow) and atomic healing (composite \to atoms: 35-fold recovery, green arrow) are the dominant cross-scale features. All scales obey the same kernel with identical frozen parameters." title="" id="35" name="Picture"/>
+            <a:graphic>
+              <a:graphicData uri="http://schemas.openxmlformats.org/drawingml/2006/picture">
+                <pic:pic>
+                  <pic:nvPicPr>
+                    <pic:cNvPr descr="figures/fig1_scale_ladder.png" id="36" name="Picture"/>
+                    <pic:cNvPicPr>
+                      <a:picLocks noChangeArrowheads="1" noChangeAspect="1"/>
+                    </pic:cNvPicPr>
+                  </pic:nvPicPr>
+                  <pic:blipFill>
+                    <a:blip r:embed="rId34"/>
+                    <a:stretch>
+                      <a:fillRect/>
+                    </a:stretch>
+                  </pic:blipFill>
+                  <pic:spPr bwMode="auto">
+                    <a:xfrm>
+                      <a:off x="0" y="0"/>
+                      <a:ext cx="5334000" cy="453467"/>
+                    </a:xfrm>
+                    <a:prstGeom prst="rect">
+                      <a:avLst/>
+                    </a:prstGeom>
+                    <a:noFill/>
+                    <a:ln w="9525">
+                      <a:noFill/>
+                      <a:headEnd/>
+                      <a:tailEnd/>
+                    </a:ln>
+                  </pic:spPr>
+                </pic:pic>
+              </a:graphicData>
+            </a:graphic>
+          </wp:inline>
+        </w:drawing>
+      </w:r>
+      <w:bookmarkEnd w:id="37"/>
+    </w:p>
+    <w:p>
+      <w:pPr>
+        <w:pStyle w:val="ImageCaption"/>
+      </w:pPr>
+      <w:r>
+        <w:rPr>
+          <w:bCs/>
+          <w:b/>
+        </w:rPr>
+        <w:t xml:space="preserve">The scale ladder of integrity.</w:t>
+      </w:r>
+      <w:r>
+        <w:t xml:space="preserve"> </w:t>
+      </w:r>
+      <m:oMath>
+        <m:r>
+          <m:rPr>
+            <m:sty m:val="p"/>
+          </m:rPr>
+          <m:t>I</m:t>
+        </m:r>
+        <m:r>
+          <m:rPr>
+            <m:sty m:val="p"/>
+          </m:rPr>
+          <m:t>C</m:t>
+        </m:r>
+        <m:r>
+          <m:rPr>
+            <m:sty m:val="p"/>
+          </m:rPr>
+          <m:t>/</m:t>
+        </m:r>
+        <m:r>
+          <m:t>F</m:t>
+        </m:r>
+      </m:oMath>
+      <w:r>
+        <w:t xml:space="preserve"> </w:t>
+      </w:r>
+      <w:r>
+        <w:t xml:space="preserve">(coherence</w:t>
+      </w:r>
+      <w:r>
+        <w:t xml:space="preserve"> </w:t>
+      </w:r>
+      <w:r>
+        <w:t xml:space="preserve">efficiency) for 406 objects across six physical scales. The</w:t>
+      </w:r>
+      <w:r>
+        <w:t xml:space="preserve"> </w:t>
+      </w:r>
+      <w:r>
+        <w:t xml:space="preserve">confinement cliff (fundamental</w:t>
+      </w:r>
+      <w:r>
+        <w:t xml:space="preserve"> </w:t>
+      </w:r>
+      <m:oMath>
+        <m:r>
+          <m:rPr>
+            <m:sty m:val="p"/>
+          </m:rPr>
+          <m:t>→</m:t>
+        </m:r>
+      </m:oMath>
+      <w:r>
+        <w:t xml:space="preserve"> </w:t>
+      </w:r>
+      <w:r>
+        <w:t xml:space="preserve">composite: 23-fold drop,</w:t>
+      </w:r>
+      <w:r>
+        <w:t xml:space="preserve"> </w:t>
+      </w:r>
+      <w:r>
+        <w:t xml:space="preserve">red arrow) and atomic healing (composite</w:t>
+      </w:r>
+      <w:r>
+        <w:t xml:space="preserve"> </w:t>
+      </w:r>
+      <m:oMath>
+        <m:r>
+          <m:rPr>
+            <m:sty m:val="p"/>
+          </m:rPr>
+          <m:t>→</m:t>
+        </m:r>
+      </m:oMath>
+      <w:r>
+        <w:t xml:space="preserve"> </w:t>
+      </w:r>
+      <w:r>
+        <w:t xml:space="preserve">atoms: 35-fold</w:t>
+      </w:r>
+      <w:r>
+        <w:t xml:space="preserve"> </w:t>
+      </w:r>
+      <w:r>
+        <w:t xml:space="preserve">recovery, green arrow) are the dominant cross-scale features. All</w:t>
+      </w:r>
+      <w:r>
+        <w:t xml:space="preserve"> </w:t>
+      </w:r>
+      <w:r>
+        <w:t xml:space="preserve">scales obey the same kernel with identical frozen parameters.</w:t>
+      </w:r>
+    </w:p>
+    <w:p>
+      <w:pPr>
+        <w:pStyle w:val="CaptionedFigure"/>
+      </w:pPr>
+      <w:bookmarkStart w:id="41" w:name="fig:slaughter"/>
+      <w:r>
+        <w:drawing>
+          <wp:inline>
+            <wp:extent cx="5334000" cy="370366"/>
+            <wp:effectExtent b="0" l="0" r="0" t="0"/>
+            <wp:docPr descr="Geometric slaughter. As channels die (c_k \to \varepsilon= 10^{-8}), fidelity F (arithmetic mean, blue squares) degrades linearly while \mathrm{IC} (geometric mean, red circles) collapses super-exponentially. A single dead channel in an 8-channel system reduces \mathrm{IC}/F from 1.0 to 0.114—an order-of-magnitude loss from one channel death. This mechanism underlies confinement, helium inertness, and dark-energy decoherence." title="" id="39" name="Picture"/>
+            <a:graphic>
+              <a:graphicData uri="http://schemas.openxmlformats.org/drawingml/2006/picture">
+                <pic:pic>
+                  <pic:nvPicPr>
+                    <pic:cNvPr descr="figures/fig2_geometric_slaughter.png" id="40" name="Picture"/>
+                    <pic:cNvPicPr>
+                      <a:picLocks noChangeArrowheads="1" noChangeAspect="1"/>
+                    </pic:cNvPicPr>
+                  </pic:nvPicPr>
+                  <pic:blipFill>
+                    <a:blip r:embed="rId38"/>
+                    <a:stretch>
+                      <a:fillRect/>
+                    </a:stretch>
+                  </pic:blipFill>
+                  <pic:spPr bwMode="auto">
+                    <a:xfrm>
+                      <a:off x="0" y="0"/>
+                      <a:ext cx="5334000" cy="370366"/>
+                    </a:xfrm>
+                    <a:prstGeom prst="rect">
+                      <a:avLst/>
+                    </a:prstGeom>
+                    <a:noFill/>
+                    <a:ln w="9525">
+                      <a:noFill/>
+                      <a:headEnd/>
+                      <a:tailEnd/>
+                    </a:ln>
+                  </pic:spPr>
+                </pic:pic>
+              </a:graphicData>
+            </a:graphic>
+          </wp:inline>
+        </w:drawing>
+      </w:r>
+      <w:bookmarkEnd w:id="41"/>
+    </w:p>
+    <w:p>
+      <w:pPr>
+        <w:pStyle w:val="ImageCaption"/>
+      </w:pPr>
+      <w:r>
+        <w:rPr>
+          <w:bCs/>
+          <w:b/>
+        </w:rPr>
+        <w:t xml:space="preserve">Geometric slaughter.</w:t>
+      </w:r>
+      <w:r>
+        <w:t xml:space="preserve"> </w:t>
+      </w:r>
+      <w:r>
+        <w:t xml:space="preserve">As channels die</w:t>
+      </w:r>
+      <w:r>
+        <w:t xml:space="preserve"> </w:t>
+      </w:r>
+      <w:r>
+        <w:t xml:space="preserve">(</w:t>
+      </w:r>
+      <m:oMath>
+        <m:sSub>
+          <m:e>
+            <m:r>
+              <m:t>c</m:t>
+            </m:r>
+          </m:e>
+          <m:sub>
+            <m:r>
+              <m:t>k</m:t>
+            </m:r>
+          </m:sub>
+        </m:sSub>
+        <m:r>
+          <m:rPr>
+            <m:sty m:val="p"/>
+          </m:rPr>
+          <m:t>→</m:t>
+        </m:r>
+        <m:r>
+          <m:t>ε</m:t>
+        </m:r>
+        <m:r>
+          <m:rPr>
+            <m:sty m:val="p"/>
+          </m:rPr>
+          <m:t>=</m:t>
+        </m:r>
+        <m:sSup>
+          <m:e>
+            <m:r>
+              <m:t>10</m:t>
+            </m:r>
+          </m:e>
+          <m:sup>
+            <m:r>
+              <m:rPr>
+                <m:sty m:val="p"/>
+              </m:rPr>
+              <m:t>−</m:t>
+            </m:r>
+            <m:r>
+              <m:t>8</m:t>
+            </m:r>
+          </m:sup>
+        </m:sSup>
+      </m:oMath>
+      <w:r>
+        <w:t xml:space="preserve">), fidelity </w:t>
+      </w:r>
+      <m:oMath>
+        <m:r>
+          <m:t>F</m:t>
+        </m:r>
+      </m:oMath>
+      <w:r>
+        <w:t xml:space="preserve"> </w:t>
+      </w:r>
+      <w:r>
+        <w:t xml:space="preserve">(arithmetic mean,</w:t>
+      </w:r>
+      <w:r>
+        <w:t xml:space="preserve"> </w:t>
+      </w:r>
+      <w:r>
+        <w:t xml:space="preserve">blue squares) degrades linearly while</w:t>
+      </w:r>
+      <w:r>
+        <w:t xml:space="preserve"> </w:t>
+      </w:r>
+      <m:oMath>
+        <m:r>
+          <m:rPr>
+            <m:sty m:val="p"/>
+          </m:rPr>
+          <m:t>I</m:t>
+        </m:r>
+        <m:r>
+          <m:rPr>
+            <m:sty m:val="p"/>
+          </m:rPr>
+          <m:t>C</m:t>
+        </m:r>
+      </m:oMath>
+      <w:r>
+        <w:t xml:space="preserve"> </w:t>
+      </w:r>
+      <w:r>
+        <w:t xml:space="preserve">(geometric mean,</w:t>
+      </w:r>
+      <w:r>
+        <w:t xml:space="preserve"> </w:t>
+      </w:r>
+      <w:r>
+        <w:t xml:space="preserve">red circles) collapses super-exponentially. A single dead channel</w:t>
+      </w:r>
+      <w:r>
+        <w:t xml:space="preserve"> </w:t>
+      </w:r>
+      <w:r>
+        <w:t xml:space="preserve">in an 8-channel system reduces</w:t>
+      </w:r>
+      <w:r>
+        <w:t xml:space="preserve"> </w:t>
+      </w:r>
+      <m:oMath>
+        <m:r>
+          <m:rPr>
+            <m:sty m:val="p"/>
+          </m:rPr>
+          <m:t>I</m:t>
+        </m:r>
+        <m:r>
+          <m:rPr>
+            <m:sty m:val="p"/>
+          </m:rPr>
+          <m:t>C</m:t>
+        </m:r>
+        <m:r>
+          <m:rPr>
+            <m:sty m:val="p"/>
+          </m:rPr>
+          <m:t>/</m:t>
+        </m:r>
+        <m:r>
+          <m:t>F</m:t>
+        </m:r>
+      </m:oMath>
+      <w:r>
+        <w:t xml:space="preserve"> </w:t>
+      </w:r>
+      <w:r>
+        <w:t xml:space="preserve">from 1.0 to</w:t>
+      </w:r>
+      <w:r>
+        <w:t xml:space="preserve"> </w:t>
+      </w:r>
+      <w:r>
+        <w:t xml:space="preserve">0.114—an order-of-magnitude loss from one channel death. This</w:t>
+      </w:r>
+      <w:r>
+        <w:t xml:space="preserve"> </w:t>
+      </w:r>
+      <w:r>
+        <w:t xml:space="preserve">mechanism underlies confinement, helium inertness, and dark-energy</w:t>
+      </w:r>
+      <w:r>
+        <w:t xml:space="preserve"> </w:t>
+      </w:r>
+      <w:r>
+        <w:t xml:space="preserve">decoherence.</w:t>
+      </w:r>
+    </w:p>
+    <w:p>
+      <w:pPr>
+        <w:pStyle w:val="CaptionedFigure"/>
+      </w:pPr>
+      <w:bookmarkStart w:id="45" w:name="fig:periodic"/>
+      <w:r>
+        <w:drawing>
+          <wp:inline>
+            <wp:extent cx="5334000" cy="416880"/>
+            <wp:effectExtent b="0" l="0" r="0" t="0"/>
+            <wp:docPr descr="Periodic kernel. \mathrm{IC}/F for all 118 elements. Noble gases (red labels) appear as coherence minima owing to near-zero reactivity channels, reproducing the biological intuition of inertness as a structural property. The d-block peak (Ni at \mathrm{IC}/F = 0.957) reflects maximum channel balance. Period 1 (H, He) remains near hadron coherence levels." title="" id="43" name="Picture"/>
+            <a:graphic>
+              <a:graphicData uri="http://schemas.openxmlformats.org/drawingml/2006/picture">
+                <pic:pic>
+                  <pic:nvPicPr>
+                    <pic:cNvPr descr="figures/fig3_periodic_kernel.png" id="44" name="Picture"/>
+                    <pic:cNvPicPr>
+                      <a:picLocks noChangeArrowheads="1" noChangeAspect="1"/>
+                    </pic:cNvPicPr>
+                  </pic:nvPicPr>
+                  <pic:blipFill>
+                    <a:blip r:embed="rId42"/>
+                    <a:stretch>
+                      <a:fillRect/>
+                    </a:stretch>
+                  </pic:blipFill>
+                  <pic:spPr bwMode="auto">
+                    <a:xfrm>
+                      <a:off x="0" y="0"/>
+                      <a:ext cx="5334000" cy="416880"/>
+                    </a:xfrm>
+                    <a:prstGeom prst="rect">
+                      <a:avLst/>
+                    </a:prstGeom>
+                    <a:noFill/>
+                    <a:ln w="9525">
+                      <a:noFill/>
+                      <a:headEnd/>
+                      <a:tailEnd/>
+                    </a:ln>
+                  </pic:spPr>
+                </pic:pic>
+              </a:graphicData>
+            </a:graphic>
+          </wp:inline>
+        </w:drawing>
+      </w:r>
+      <w:bookmarkEnd w:id="45"/>
+    </w:p>
+    <w:p>
+      <w:pPr>
+        <w:pStyle w:val="ImageCaption"/>
+      </w:pPr>
+      <w:r>
+        <w:rPr>
+          <w:bCs/>
+          <w:b/>
+        </w:rPr>
+        <w:t xml:space="preserve">Periodic kernel.</w:t>
+      </w:r>
+      <w:r>
+        <w:t xml:space="preserve"> </w:t>
+      </w:r>
+      <m:oMath>
+        <m:r>
+          <m:rPr>
+            <m:sty m:val="p"/>
+          </m:rPr>
+          <m:t>I</m:t>
+        </m:r>
+        <m:r>
+          <m:rPr>
+            <m:sty m:val="p"/>
+          </m:rPr>
+          <m:t>C</m:t>
+        </m:r>
+        <m:r>
+          <m:rPr>
+            <m:sty m:val="p"/>
+          </m:rPr>
+          <m:t>/</m:t>
+        </m:r>
+        <m:r>
+          <m:t>F</m:t>
+        </m:r>
+      </m:oMath>
+      <w:r>
+        <w:t xml:space="preserve"> </w:t>
+      </w:r>
+      <w:r>
+        <w:t xml:space="preserve">for all 118 elements.</w:t>
+      </w:r>
+      <w:r>
+        <w:t xml:space="preserve"> </w:t>
+      </w:r>
+      <w:r>
+        <w:t xml:space="preserve">Noble gases (red labels) appear as coherence minima owing to</w:t>
+      </w:r>
+      <w:r>
+        <w:t xml:space="preserve"> </w:t>
+      </w:r>
+      <w:r>
+        <w:t xml:space="preserve">near-zero reactivity channels, reproducing the biological intuition</w:t>
+      </w:r>
+      <w:r>
+        <w:t xml:space="preserve"> </w:t>
+      </w:r>
+      <w:r>
+        <w:t xml:space="preserve">of inertness as a</w:t>
+      </w:r>
+      <w:r>
+        <w:t xml:space="preserve"> </w:t>
+      </w:r>
+      <w:r>
+        <w:rPr>
+          <w:iCs/>
+          <w:i/>
+        </w:rPr>
+        <w:t xml:space="preserve">structural</w:t>
+      </w:r>
+      <w:r>
+        <w:t xml:space="preserve"> </w:t>
+      </w:r>
+      <w:r>
+        <w:t xml:space="preserve">property. The d-block peak</w:t>
+      </w:r>
+      <w:r>
+        <w:t xml:space="preserve"> </w:t>
+      </w:r>
+      <w:r>
+        <w:t xml:space="preserve">(Ni at</w:t>
+      </w:r>
+      <w:r>
+        <w:t xml:space="preserve"> </w:t>
+      </w:r>
+      <m:oMath>
+        <m:r>
+          <m:rPr>
+            <m:sty m:val="p"/>
+          </m:rPr>
+          <m:t>I</m:t>
+        </m:r>
+        <m:r>
+          <m:rPr>
+            <m:sty m:val="p"/>
+          </m:rPr>
+          <m:t>C</m:t>
+        </m:r>
+        <m:r>
+          <m:rPr>
+            <m:sty m:val="p"/>
+          </m:rPr>
+          <m:t>/</m:t>
+        </m:r>
+        <m:r>
+          <m:t>F</m:t>
+        </m:r>
+        <m:r>
+          <m:rPr>
+            <m:sty m:val="p"/>
+          </m:rPr>
+          <m:t>=</m:t>
+        </m:r>
+        <m:r>
+          <m:t>0.957</m:t>
+        </m:r>
+      </m:oMath>
+      <w:r>
+        <w:t xml:space="preserve">) reflects maximum channel balance.</w:t>
+      </w:r>
+      <w:r>
+        <w:t xml:space="preserve"> </w:t>
+      </w:r>
+      <w:r>
+        <w:t xml:space="preserve">Period 1 (H, He) remains near hadron coherence levels.</w:t>
+      </w:r>
+    </w:p>
+    <w:p>
+      <w:pPr>
+        <w:pStyle w:val="CaptionedFigure"/>
+      </w:pPr>
+      <w:bookmarkStart w:id="49" w:name="fig:crossscale"/>
+      <w:r>
+        <w:drawing>
+          <wp:inline>
+            <wp:extent cx="5334000" cy="433739"/>
+            <wp:effectExtent b="0" l="0" r="0" t="0"/>
+            <wp:docPr descr="Cross-scale integrity profile. \mathrm{IC}/F across 61 orders of magnitude. The non-monotonic structure—with a sharp minimum at the hadron scale and recovery at the atomic scale—is the central cross-scale phenomenon. The same kernel with identical frozen parameters produces all data points. The dashed line is a guide to the eye." title="" id="47" name="Picture"/>
+            <a:graphic>
+              <a:graphicData uri="http://schemas.openxmlformats.org/drawingml/2006/picture">
+                <pic:pic>
+                  <pic:nvPicPr>
+                    <pic:cNvPr descr="figures/fig4_crossscale.png" id="48" name="Picture"/>
+                    <pic:cNvPicPr>
+                      <a:picLocks noChangeArrowheads="1" noChangeAspect="1"/>
+                    </pic:cNvPicPr>
+                  </pic:nvPicPr>
+                  <pic:blipFill>
+                    <a:blip r:embed="rId46"/>
+                    <a:stretch>
+                      <a:fillRect/>
+                    </a:stretch>
+                  </pic:blipFill>
+                  <pic:spPr bwMode="auto">
+                    <a:xfrm>
+                      <a:off x="0" y="0"/>
+                      <a:ext cx="5334000" cy="433739"/>
+                    </a:xfrm>
+                    <a:prstGeom prst="rect">
+                      <a:avLst/>
+                    </a:prstGeom>
+                    <a:noFill/>
+                    <a:ln w="9525">
+                      <a:noFill/>
+                      <a:headEnd/>
+                      <a:tailEnd/>
+                    </a:ln>
+                  </pic:spPr>
+                </pic:pic>
+              </a:graphicData>
+            </a:graphic>
+          </wp:inline>
+        </w:drawing>
+      </w:r>
+      <w:bookmarkEnd w:id="49"/>
+    </w:p>
+    <w:p>
+      <w:pPr>
+        <w:pStyle w:val="ImageCaption"/>
+      </w:pPr>
+      <w:r>
+        <w:rPr>
+          <w:bCs/>
+          <w:b/>
+        </w:rPr>
+        <w:t xml:space="preserve">Cross-scale integrity profile.</w:t>
+      </w:r>
+      <w:r>
+        <w:t xml:space="preserve"> </w:t>
+      </w:r>
+      <m:oMath>
+        <m:r>
+          <m:rPr>
+            <m:sty m:val="p"/>
+          </m:rPr>
+          <m:t>I</m:t>
+        </m:r>
+        <m:r>
+          <m:rPr>
+            <m:sty m:val="p"/>
+          </m:rPr>
+          <m:t>C</m:t>
+        </m:r>
+        <m:r>
+          <m:rPr>
+            <m:sty m:val="p"/>
+          </m:rPr>
+          <m:t>/</m:t>
+        </m:r>
+        <m:r>
+          <m:t>F</m:t>
+        </m:r>
+      </m:oMath>
+      <w:r>
+        <w:t xml:space="preserve"> </w:t>
+      </w:r>
+      <w:r>
+        <w:t xml:space="preserve">across</w:t>
+      </w:r>
+      <w:r>
+        <w:t xml:space="preserve"> </w:t>
+      </w:r>
+      <w:r>
+        <w:t xml:space="preserve">61 orders of magnitude. The non-monotonic structure—with a sharp</w:t>
+      </w:r>
+      <w:r>
+        <w:t xml:space="preserve"> </w:t>
+      </w:r>
+      <w:r>
+        <w:t xml:space="preserve">minimum at the hadron scale and recovery at the atomic scale—is the</w:t>
+      </w:r>
+      <w:r>
+        <w:t xml:space="preserve"> </w:t>
+      </w:r>
+      <w:r>
+        <w:t xml:space="preserve">central cross-scale phenomenon. The same kernel with identical frozen</w:t>
+      </w:r>
+      <w:r>
+        <w:t xml:space="preserve"> </w:t>
+      </w:r>
+      <w:r>
+        <w:t xml:space="preserve">parameters produces all data points. The dashed line is a guide to</w:t>
+      </w:r>
+      <w:r>
+        <w:t xml:space="preserve"> </w:t>
+      </w:r>
+      <w:r>
+        <w:t xml:space="preserve">the eye.</w:t>
+      </w:r>
+    </w:p>
+    <w:bookmarkEnd w:id="50"/>
+    <w:bookmarkEnd w:id="51"/>
+    <w:bookmarkStart w:id="59" w:name="discussion"/>
     <w:p>
       <w:pPr>
         <w:pStyle w:val="Heading1"/>
@@ -9749,7 +10431,7 @@
         <w:t xml:space="preserve">Discussion</w:t>
       </w:r>
     </w:p>
-    <w:bookmarkStart w:id="36" w:name="X33af143ec7173ae7d909346935ca46d3f00851d"/>
+    <w:bookmarkStart w:id="52" w:name="X33af143ec7173ae7d909346935ca46d3f00851d"/>
     <w:p>
       <w:pPr>
         <w:pStyle w:val="Heading2"/>
@@ -9874,7 +10556,7 @@
           <w:rPr>
             <w:rStyle w:val="Hyperlink"/>
           </w:rPr>
-          <w:t xml:space="preserve">[fig:slaughter]</w:t>
+          <w:t xml:space="preserve">2</w:t>
         </w:r>
       </w:hyperlink>
       <w:r>
@@ -10251,8 +10933,8 @@
         <w:t xml:space="preserve">instrument for quantitative cross-scale comparison.</w:t>
       </w:r>
     </w:p>
-    <w:bookmarkEnd w:id="36"/>
-    <w:bookmarkStart w:id="37" w:name="structural-rarity-of-stability"/>
+    <w:bookmarkEnd w:id="52"/>
+    <w:bookmarkStart w:id="53" w:name="structural-rarity-of-stability"/>
     <w:p>
       <w:pPr>
         <w:pStyle w:val="Heading2"/>
@@ -10556,8 +11238,8 @@
         <w:t xml:space="preserve">occupies a narrow region of the available phase space.</w:t>
       </w:r>
     </w:p>
-    <w:bookmarkEnd w:id="37"/>
-    <w:bookmarkStart w:id="38" w:name="testable-predictions"/>
+    <w:bookmarkEnd w:id="53"/>
+    <w:bookmarkStart w:id="54" w:name="testable-predictions"/>
     <w:p>
       <w:pPr>
         <w:pStyle w:val="Heading2"/>
@@ -10726,7 +11408,7 @@
           <w:rPr>
             <w:rStyle w:val="Hyperlink"/>
           </w:rPr>
-          <w:t xml:space="preserve">[fig:periodic]</w:t>
+          <w:t xml:space="preserve">3</w:t>
         </w:r>
       </w:hyperlink>
       <w:r>
@@ -10778,8 +11460,8 @@
         <w:t xml:space="preserve">earlier than the arithmetic mean.</w:t>
       </w:r>
     </w:p>
-    <w:bookmarkEnd w:id="38"/>
-    <w:bookmarkStart w:id="39" w:name="relationship-to-established-frameworks"/>
+    <w:bookmarkEnd w:id="54"/>
+    <w:bookmarkStart w:id="55" w:name="relationship-to-established-frameworks"/>
     <w:p>
       <w:pPr>
         <w:pStyle w:val="Heading2"/>
@@ -11790,8 +12472,8 @@
         <w:t xml:space="preserve">cosmological scales.</w:t>
       </w:r>
     </w:p>
-    <w:bookmarkEnd w:id="39"/>
-    <w:bookmarkStart w:id="40" w:name="cross-domain-translation-protocol"/>
+    <w:bookmarkEnd w:id="55"/>
+    <w:bookmarkStart w:id="56" w:name="cross-domain-translation-protocol"/>
     <w:p>
       <w:pPr>
         <w:pStyle w:val="Heading2"/>
@@ -12299,8 +12981,8 @@
         <w:t xml:space="preserve">to standard measurement theories.</w:t>
       </w:r>
     </w:p>
-    <w:bookmarkEnd w:id="40"/>
-    <w:bookmarkStart w:id="41" w:name="implications-for-measurement-theory"/>
+    <w:bookmarkEnd w:id="56"/>
+    <w:bookmarkStart w:id="57" w:name="implications-for-measurement-theory"/>
     <w:p>
       <w:pPr>
         <w:pStyle w:val="Heading2"/>
@@ -12719,8 +13401,8 @@
         <w:t xml:space="preserve">—a result with no adjustable parameters.</w:t>
       </w:r>
     </w:p>
-    <w:bookmarkEnd w:id="41"/>
-    <w:bookmarkStart w:id="42" w:name="X4c14539bcfdc5042915ac9327723019183d0048"/>
+    <w:bookmarkEnd w:id="57"/>
+    <w:bookmarkStart w:id="58" w:name="X4c14539bcfdc5042915ac9327723019183d0048"/>
     <w:p>
       <w:pPr>
         <w:pStyle w:val="Heading2"/>
@@ -13080,9 +13762,9 @@
         <w:t xml:space="preserve">.</w:t>
       </w:r>
     </w:p>
-    <w:bookmarkEnd w:id="42"/>
-    <w:bookmarkEnd w:id="43"/>
-    <w:bookmarkStart w:id="50" w:name="methods"/>
+    <w:bookmarkEnd w:id="58"/>
+    <w:bookmarkEnd w:id="59"/>
+    <w:bookmarkStart w:id="66" w:name="methods"/>
     <w:p>
       <w:pPr>
         <w:pStyle w:val="Heading1"/>
@@ -13091,7 +13773,7 @@
         <w:t xml:space="preserve">Methods</w:t>
       </w:r>
     </w:p>
-    <w:bookmarkStart w:id="44" w:name="trace-vector-construction"/>
+    <w:bookmarkStart w:id="60" w:name="trace-vector-construction"/>
     <w:p>
       <w:pPr>
         <w:pStyle w:val="Heading2"/>
@@ -13749,8 +14431,8 @@
         <w:t xml:space="preserve">adjustment is permitted.</w:t>
       </w:r>
     </w:p>
-    <w:bookmarkEnd w:id="44"/>
-    <w:bookmarkStart w:id="45" w:name="guard-band-and-frozen-parameters"/>
+    <w:bookmarkEnd w:id="60"/>
+    <w:bookmarkStart w:id="61" w:name="guard-band-and-frozen-parameters"/>
     <w:p>
       <w:pPr>
         <w:pStyle w:val="Heading2"/>
@@ -14179,8 +14861,8 @@
         <w:t xml:space="preserve">evaluations or domains.</w:t>
       </w:r>
     </w:p>
-    <w:bookmarkEnd w:id="45"/>
-    <w:bookmarkStart w:id="46" w:name="sensitivity-analysis"/>
+    <w:bookmarkEnd w:id="61"/>
+    <w:bookmarkStart w:id="62" w:name="sensitivity-analysis"/>
     <w:p>
       <w:pPr>
         <w:pStyle w:val="Heading2"/>
@@ -14502,8 +15184,8 @@
         <w:t xml:space="preserve">closures simultaneously.</w:t>
       </w:r>
     </w:p>
-    <w:bookmarkEnd w:id="46"/>
-    <w:bookmarkStart w:id="47" w:name="computational-verification-protocol"/>
+    <w:bookmarkEnd w:id="62"/>
+    <w:bookmarkStart w:id="63" w:name="computational-verification-protocol"/>
     <w:p>
       <w:pPr>
         <w:pStyle w:val="Heading2"/>
@@ -14644,8 +15326,8 @@
         <w:t xml:space="preserve">seeds and version-pinned dependencies.</w:t>
       </w:r>
     </w:p>
-    <w:bookmarkEnd w:id="47"/>
-    <w:bookmarkStart w:id="48" w:name="regime-classification"/>
+    <w:bookmarkEnd w:id="63"/>
+    <w:bookmarkStart w:id="64" w:name="regime-classification"/>
     <w:p>
       <w:pPr>
         <w:pStyle w:val="Heading2"/>
@@ -14833,8 +15515,8 @@
         <w:t xml:space="preserve">but their intersection is narrow.</w:t>
       </w:r>
     </w:p>
-    <w:bookmarkEnd w:id="48"/>
-    <w:bookmarkStart w:id="49" w:name="data-and-code-availability"/>
+    <w:bookmarkEnd w:id="64"/>
+    <w:bookmarkStart w:id="65" w:name="data-and-code-availability"/>
     <w:p>
       <w:pPr>
         <w:pStyle w:val="Heading2"/>
@@ -14917,9 +15599,9 @@
         <w:t xml:space="preserve">.</w:t>
       </w:r>
     </w:p>
-    <w:bookmarkEnd w:id="49"/>
-    <w:bookmarkEnd w:id="50"/>
-    <w:bookmarkStart w:id="51" w:name="acknowledgements"/>
+    <w:bookmarkEnd w:id="65"/>
+    <w:bookmarkEnd w:id="66"/>
+    <w:bookmarkStart w:id="67" w:name="acknowledgements"/>
     <w:p>
       <w:pPr>
         <w:pStyle w:val="Heading1"/>
@@ -14954,7 +15636,7 @@
         <w:t xml:space="preserve">research possible.</w:t>
       </w:r>
     </w:p>
-    <w:bookmarkEnd w:id="51"/>
+    <w:bookmarkEnd w:id="67"/>
     <w:sectPr/>
   </w:body>
 </w:document>

</xml_diff>